<commit_message>
ultima version de reporte pasado
</commit_message>
<xml_diff>
--- a/reports/acif104_s6_grupo3.docx
+++ b/reports/acif104_s6_grupo3.docx
@@ -3460,37 +3460,42 @@
         <w:rPr>
           <w:rFonts w:asciiTheme="minorHAnsi" w:hAnsiTheme="minorHAnsi" w:cstheme="minorHAnsi"/>
         </w:rPr>
-        <w:t>Explicabilidad e integración. Se incorporaron SHAP, un backend de inferencia, una interfaz en Streamlit y un registro de predicciones, completando la integración del prototipo.</w:t>
+        <w:t>Explicabilidad</w:t>
       </w:r>
       <w:proofErr w:type="spellEnd"/>
       <w:r>
         <w:rPr>
           <w:rFonts w:asciiTheme="minorHAnsi" w:hAnsiTheme="minorHAnsi" w:cstheme="minorHAnsi"/>
         </w:rPr>
+        <w:t xml:space="preserve"> e integración. Se incorporaron SHAP, un </w:t>
       </w:r>
       <w:proofErr w:type="spellStart"/>
       <w:r>
         <w:rPr>
           <w:rFonts w:asciiTheme="minorHAnsi" w:hAnsiTheme="minorHAnsi" w:cstheme="minorHAnsi"/>
         </w:rPr>
+        <w:t>backend</w:t>
       </w:r>
       <w:proofErr w:type="spellEnd"/>
       <w:r>
         <w:rPr>
           <w:rFonts w:asciiTheme="minorHAnsi" w:hAnsiTheme="minorHAnsi" w:cstheme="minorHAnsi"/>
         </w:rPr>
+        <w:t xml:space="preserve"> de inferencia, una interfaz en </w:t>
       </w:r>
       <w:proofErr w:type="spellStart"/>
       <w:r>
         <w:rPr>
           <w:rFonts w:asciiTheme="minorHAnsi" w:hAnsiTheme="minorHAnsi" w:cstheme="minorHAnsi"/>
         </w:rPr>
+        <w:t>Streamlit</w:t>
       </w:r>
       <w:proofErr w:type="spellEnd"/>
       <w:r>
         <w:rPr>
           <w:rFonts w:asciiTheme="minorHAnsi" w:hAnsiTheme="minorHAnsi" w:cstheme="minorHAnsi"/>
         </w:rPr>
+        <w:t xml:space="preserve"> y un registro de predicciones, completando la integración del prototipo.</w:t>
       </w:r>
     </w:p>
     <w:p>
@@ -3543,30 +3548,6 @@
           <w:rFonts w:asciiTheme="minorHAnsi" w:hAnsiTheme="minorHAnsi" w:cstheme="minorHAnsi"/>
         </w:rPr>
         <w:t>La Tabla 1 resume las tareas realizadas, sus responsables, plazos y relación con los objetivos del proyecto. Todas las actividades consideradas para esta fase se encuentran completadas.</w:t>
-      </w:r>
-      <w:proofErr w:type="spellStart"/>
-      <w:r>
-        <w:rPr>
-          <w:rFonts w:asciiTheme="minorHAnsi" w:hAnsiTheme="minorHAnsi" w:cstheme="minorHAnsi"/>
-        </w:rPr>
-      </w:r>
-      <w:proofErr w:type="spellEnd"/>
-      <w:r>
-        <w:rPr>
-          <w:rFonts w:asciiTheme="minorHAnsi" w:hAnsiTheme="minorHAnsi" w:cstheme="minorHAnsi"/>
-        </w:rPr>
-      </w:r>
-      <w:proofErr w:type="spellStart"/>
-      <w:r>
-        <w:rPr>
-          <w:rFonts w:asciiTheme="minorHAnsi" w:hAnsiTheme="minorHAnsi" w:cstheme="minorHAnsi"/>
-        </w:rPr>
-      </w:r>
-      <w:proofErr w:type="spellEnd"/>
-      <w:r>
-        <w:rPr>
-          <w:rFonts w:asciiTheme="minorHAnsi" w:hAnsiTheme="minorHAnsi" w:cstheme="minorHAnsi"/>
-        </w:rPr>
       </w:r>
     </w:p>
     <w:p>
@@ -9103,7 +9084,6 @@
                 <w:rFonts w:asciiTheme="minorHAnsi" w:hAnsiTheme="minorHAnsi" w:cstheme="minorHAnsi"/>
               </w:rPr>
             </w:pPr>
-            <w:proofErr w:type="gramStart"/>
             <w:r>
               <w:rPr>
                 <w:rFonts w:asciiTheme="minorHAnsi" w:eastAsia="Calibri" w:hAnsiTheme="minorHAnsi" w:cstheme="minorHAnsi"/>
@@ -9111,7 +9091,6 @@
               </w:rPr>
               <w:t>Binaria objetivo</w:t>
             </w:r>
-            <w:proofErr w:type="gramEnd"/>
           </w:p>
         </w:tc>
         <w:tc>
@@ -25680,28 +25659,14 @@
         <w:rPr>
           <w:rFonts w:asciiTheme="minorHAnsi" w:hAnsiTheme="minorHAnsi" w:cstheme="minorHAnsi"/>
         </w:rPr>
-        <w:t>predict_</w:t>
-      </w:r>
-      <w:proofErr w:type="gramStart"/>
-      <w:r>
-        <w:rPr>
-          <w:rFonts w:asciiTheme="minorHAnsi" w:hAnsiTheme="minorHAnsi" w:cstheme="minorHAnsi"/>
-        </w:rPr>
-        <w:t>proba</w:t>
+        <w:t>predict_proba</w:t>
       </w:r>
       <w:proofErr w:type="spellEnd"/>
       <w:r>
         <w:rPr>
           <w:rFonts w:asciiTheme="minorHAnsi" w:hAnsiTheme="minorHAnsi" w:cstheme="minorHAnsi"/>
         </w:rPr>
-        <w:t>(</w:t>
-      </w:r>
-      <w:proofErr w:type="gramEnd"/>
-      <w:r>
-        <w:rPr>
-          <w:rFonts w:asciiTheme="minorHAnsi" w:hAnsiTheme="minorHAnsi" w:cstheme="minorHAnsi"/>
-        </w:rPr>
-        <w:t>).</w:t>
+        <w:t>().</w:t>
       </w:r>
     </w:p>
     <w:p>
@@ -25910,18 +25875,6 @@
           <w:rFonts w:asciiTheme="minorHAnsi" w:hAnsiTheme="minorHAnsi" w:cstheme="minorHAnsi"/>
         </w:rPr>
         <w:t>En ambos casos, el resultado se presenta en una ventana modal que incluye la probabilidad de churn, la banda de riesgo, la comparación con el umbral, los principales factores explicativos y el gráfico SHAP correspondiente (Figura 17). Al cerrar la ventana, los datos ingresados se conservan.</w:t>
-      </w:r>
-      <w:proofErr w:type="spellStart"/>
-      <w:r>
-        <w:rPr>
-          <w:rFonts w:asciiTheme="minorHAnsi" w:hAnsiTheme="minorHAnsi" w:cstheme="minorHAnsi"/>
-        </w:rPr>
-      </w:r>
-      <w:proofErr w:type="spellEnd"/>
-      <w:r>
-        <w:rPr>
-          <w:rFonts w:asciiTheme="minorHAnsi" w:hAnsiTheme="minorHAnsi" w:cstheme="minorHAnsi"/>
-        </w:rPr>
       </w:r>
     </w:p>
     <w:p>
@@ -26283,28 +26236,6 @@
         </w:rPr>
         <w:t>La explicación también indica que los factores corresponden a asociaciones aprendidas por el modelo y no necesariamente a relaciones causales. La pestaña Explicabilidad global muestra la importancia general de las variables calculada previamente en el notebook de SHAP (Figura 18).</w:t>
       </w:r>
-      <w:proofErr w:type="spellStart"/>
-      <w:r>
-        <w:rPr>
-          <w:rFonts w:asciiTheme="minorHAnsi" w:hAnsiTheme="minorHAnsi" w:cstheme="minorHAnsi"/>
-        </w:rPr>
-      </w:r>
-      <w:proofErr w:type="spellEnd"/>
-      <w:r>
-        <w:rPr>
-          <w:rFonts w:asciiTheme="minorHAnsi" w:hAnsiTheme="minorHAnsi" w:cstheme="minorHAnsi"/>
-        </w:rPr>
-      </w:r>
-      <w:r>
-        <w:rPr>
-          <w:rFonts w:asciiTheme="minorHAnsi" w:hAnsiTheme="minorHAnsi" w:cstheme="minorHAnsi"/>
-        </w:rPr>
-      </w:r>
-      <w:r>
-        <w:rPr>
-          <w:rFonts w:asciiTheme="minorHAnsi" w:hAnsiTheme="minorHAnsi" w:cstheme="minorHAnsi"/>
-        </w:rPr>
-      </w:r>
     </w:p>
     <w:p>
       <w:pPr>
@@ -26326,21 +26257,6 @@
           <w:rFonts w:asciiTheme="minorHAnsi" w:hAnsiTheme="minorHAnsi" w:cstheme="minorHAnsi"/>
         </w:rPr>
         <w:t>Cada predicción registra fecha, origen, probabilidad, banda de riesgo, umbral y tiempo de respuesta, sin almacenar las variables originales del cliente. La pestaña Monitoreo muestra el volumen de predicciones, la latencia promedio, la proporción de clientes en riesgo Alto y la distribución de resultados (Figura 19).</w:t>
-      </w:r>
-      <w:r>
-        <w:rPr>
-          <w:rFonts w:asciiTheme="minorHAnsi" w:hAnsiTheme="minorHAnsi" w:cstheme="minorHAnsi"/>
-        </w:rPr>
-      </w:r>
-      <w:r>
-        <w:rPr>
-          <w:rFonts w:asciiTheme="minorHAnsi" w:hAnsiTheme="minorHAnsi" w:cstheme="minorHAnsi"/>
-        </w:rPr>
-      </w:r>
-      <w:r>
-        <w:rPr>
-          <w:rFonts w:asciiTheme="minorHAnsi" w:hAnsiTheme="minorHAnsi" w:cstheme="minorHAnsi"/>
-        </w:rPr>
       </w:r>
     </w:p>
     <w:p>
@@ -28937,7 +28853,13 @@
         <w:rPr>
           <w:rFonts w:asciiTheme="minorHAnsi" w:hAnsiTheme="minorHAnsi" w:cstheme="minorHAnsi"/>
         </w:rPr>
-        <w:t xml:space="preserve"> + ROS refinado, sección 4.5.3) mediante SHAP (</w:t>
+        <w:t xml:space="preserve"> + ROS refinado, sección 4.5.3) mediante SHAP </w:t>
+      </w:r>
+      <w:r>
+        <w:rPr>
+          <w:rFonts w:asciiTheme="minorHAnsi" w:hAnsiTheme="minorHAnsi" w:cstheme="minorHAnsi"/>
+        </w:rPr>
+        <w:t>(</w:t>
       </w:r>
       <w:proofErr w:type="spellStart"/>
       <w:r>
@@ -28979,7 +28901,13 @@
         <w:rPr>
           <w:rFonts w:asciiTheme="minorHAnsi" w:hAnsiTheme="minorHAnsi" w:cstheme="minorHAnsi"/>
         </w:rPr>
-        <w:t>), en dos niveles: qué variables influyen más en promedio sobre el modelo (importancia global) y cómo se explica la predicción de clientes concretos (explicaciones locales). El detalle completo del análisis está en notebook/07_explicabilidad_shap.ipynb.</w:t>
+        <w:t>; SHAP, s. f.)</w:t>
+      </w:r>
+      <w:r>
+        <w:rPr>
+          <w:rFonts w:asciiTheme="minorHAnsi" w:hAnsiTheme="minorHAnsi" w:cstheme="minorHAnsi"/>
+        </w:rPr>
+        <w:t>, en dos niveles: qué variables influyen más en promedio sobre el modelo (importancia global) y cómo se explica la predicción de clientes concretos (explicaciones locales). El detalle completo del análisis está en notebook/07_explicabilidad_shap.ipynb.</w:t>
       </w:r>
     </w:p>
     <w:p>
@@ -29890,18 +29818,6 @@
         </w:rPr>
         <w:t>Figura 25. Explicación local de un verdadero positivo (probabilidad = 0,94).</w:t>
       </w:r>
-      <w:r>
-        <w:rPr>
-          <w:rFonts w:asciiTheme="minorHAnsi" w:hAnsiTheme="minorHAnsi" w:cstheme="minorHAnsi"/>
-          <w:sz w:val="18"/>
-        </w:rPr>
-      </w:r>
-      <w:r>
-        <w:rPr>
-          <w:rFonts w:asciiTheme="minorHAnsi" w:hAnsiTheme="minorHAnsi" w:cstheme="minorHAnsi"/>
-          <w:sz w:val="18"/>
-        </w:rPr>
-      </w:r>
     </w:p>
     <w:p>
       <w:pPr>
@@ -30053,18 +29969,6 @@
         </w:rPr>
         <w:t>Figura 26. Explicación local de un falso positivo (probabilidad = 0,94).</w:t>
       </w:r>
-      <w:r>
-        <w:rPr>
-          <w:rFonts w:asciiTheme="minorHAnsi" w:hAnsiTheme="minorHAnsi" w:cstheme="minorHAnsi"/>
-          <w:sz w:val="18"/>
-        </w:rPr>
-      </w:r>
-      <w:r>
-        <w:rPr>
-          <w:rFonts w:asciiTheme="minorHAnsi" w:hAnsiTheme="minorHAnsi" w:cstheme="minorHAnsi"/>
-          <w:sz w:val="18"/>
-        </w:rPr>
-      </w:r>
     </w:p>
     <w:p>
       <w:pPr>
@@ -30116,21 +30020,7 @@
           <w:rFonts w:asciiTheme="minorHAnsi" w:hAnsiTheme="minorHAnsi" w:cstheme="minorHAnsi"/>
         </w:rPr>
         <w:lastRenderedPageBreak/>
-        <w:t xml:space="preserve">El modelo asignó a este cliente una probabilidad casi idéntica (0,938), pero permaneció: es exactamente el tipo de alerta falsa que explica la precision baja del modelo (0,234 en prueba, Tabla 14). Las señales de riesgo —poca antigüedad, fallos de pago y muchos días sin acceder— pesaron más que su satisfacción por encima del promedio, que empujó en sentido </w:t>
-      </w:r>
-      <w:proofErr w:type="gramStart"/>
-      <w:r>
-        <w:rPr>
-          <w:rFonts w:asciiTheme="minorHAnsi" w:hAnsiTheme="minorHAnsi" w:cstheme="minorHAnsi"/>
-        </w:rPr>
-        <w:t>contrario</w:t>
-      </w:r>
-      <w:proofErr w:type="gramEnd"/>
-      <w:r>
-        <w:rPr>
-          <w:rFonts w:asciiTheme="minorHAnsi" w:hAnsiTheme="minorHAnsi" w:cstheme="minorHAnsi"/>
-        </w:rPr>
-        <w:t xml:space="preserve"> pero con menos fuerza. En otras palabras: el modelo ponderó más la inactividad y los problemas de pago que la buena satisfacción declarada, y en este caso se equivocó.</w:t>
+        <w:t>El modelo asignó a este cliente una probabilidad casi idéntica (0,938), pero permaneció: es exactamente el tipo de alerta falsa que explica la precision baja del modelo (0,234 en prueba, Tabla 14). Las señales de riesgo —poca antigüedad, fallos de pago y muchos días sin acceder— pesaron más que su satisfacción por encima del promedio, que empujó en sentido contrario pero con menos fuerza. En otras palabras: el modelo ponderó más la inactividad y los problemas de pago que la buena satisfacción declarada, y en este caso se equivocó.</w:t>
       </w:r>
     </w:p>
     <w:p>
@@ -30208,18 +30098,6 @@
         </w:rPr>
         <w:t>Figura 27. Explicación local de un verdadero negativo confiado (probabilidad = 0,22).</w:t>
       </w:r>
-      <w:r>
-        <w:rPr>
-          <w:rFonts w:asciiTheme="minorHAnsi" w:hAnsiTheme="minorHAnsi" w:cstheme="minorHAnsi"/>
-          <w:sz w:val="18"/>
-        </w:rPr>
-      </w:r>
-      <w:r>
-        <w:rPr>
-          <w:rFonts w:asciiTheme="minorHAnsi" w:hAnsiTheme="minorHAnsi" w:cstheme="minorHAnsi"/>
-          <w:sz w:val="18"/>
-        </w:rPr>
-      </w:r>
     </w:p>
     <w:p>
       <w:pPr>
@@ -30562,7 +30440,7 @@
                 <w:sz w:val="18"/>
                 <w:szCs w:val="18"/>
               </w:rPr>
-              <w:t>Formulario de predicción individual y ficha de cliente (Figura 2</w:t>
+              <w:t xml:space="preserve">Formulario de predicción individual y ficha de cliente </w:t>
             </w:r>
             <w:r>
               <w:rPr>
@@ -30570,7 +30448,7 @@
                 <w:sz w:val="18"/>
                 <w:szCs w:val="18"/>
               </w:rPr>
-              <w:t>3</w:t>
+              <w:t>Figura 16 / sección 4.7.3</w:t>
             </w:r>
             <w:r>
               <w:rPr>
@@ -30578,7 +30456,7 @@
                 <w:sz w:val="18"/>
                 <w:szCs w:val="18"/>
               </w:rPr>
-              <w:t>).</w:t>
+              <w:t>.</w:t>
             </w:r>
           </w:p>
         </w:tc>
@@ -30652,7 +30530,7 @@
                 <w:sz w:val="18"/>
                 <w:szCs w:val="18"/>
               </w:rPr>
-              <w:t>Barra de probabilidad con banda de riesgo y umbral (Figura 2</w:t>
+              <w:t>Barra de probabilidad con banda de riesgo y umbral (</w:t>
             </w:r>
             <w:r>
               <w:rPr>
@@ -30660,7 +30538,7 @@
                 <w:sz w:val="18"/>
                 <w:szCs w:val="18"/>
               </w:rPr>
-              <w:t>4</w:t>
+              <w:t>Figura 17</w:t>
             </w:r>
             <w:r>
               <w:rPr>
@@ -30760,7 +30638,7 @@
                 <w:sz w:val="18"/>
                 <w:szCs w:val="18"/>
               </w:rPr>
-              <w:t>Factores reales por dirección + gráfico técnico (Figuras 2</w:t>
+              <w:t>Factores reales por dirección + gráfico técnico (</w:t>
             </w:r>
             <w:r>
               <w:rPr>
@@ -30768,7 +30646,7 @@
                 <w:sz w:val="18"/>
                 <w:szCs w:val="18"/>
               </w:rPr>
-              <w:t>4</w:t>
+              <w:t>Figuras 17 y 18</w:t>
             </w:r>
             <w:r>
               <w:rPr>
@@ -30776,29 +30654,39 @@
                 <w:sz w:val="18"/>
                 <w:szCs w:val="18"/>
               </w:rPr>
-              <w:t xml:space="preserve"> y 2</w:t>
-            </w:r>
-            <w:r>
+              <w:t>).</w:t>
+            </w:r>
+          </w:p>
+        </w:tc>
+        <w:tc>
+          <w:tcPr>
+            <w:tcW w:w="1870" w:type="dxa"/>
+          </w:tcPr>
+          <w:p>
+            <w:pPr>
+              <w:spacing w:line="276" w:lineRule="auto"/>
+              <w:jc w:val="both"/>
               <w:rPr>
                 <w:rFonts w:asciiTheme="minorHAnsi" w:hAnsiTheme="minorHAnsi" w:cstheme="minorHAnsi"/>
                 <w:sz w:val="18"/>
                 <w:szCs w:val="18"/>
               </w:rPr>
-              <w:t>5</w:t>
-            </w:r>
+            </w:pPr>
             <w:r>
               <w:rPr>
                 <w:rFonts w:asciiTheme="minorHAnsi" w:hAnsiTheme="minorHAnsi" w:cstheme="minorHAnsi"/>
                 <w:sz w:val="18"/>
                 <w:szCs w:val="18"/>
               </w:rPr>
-              <w:t>).</w:t>
-            </w:r>
-          </w:p>
-        </w:tc>
-        <w:tc>
-          <w:tcPr>
-            <w:tcW w:w="1870" w:type="dxa"/>
+              <w:t>Completado</w:t>
+            </w:r>
+          </w:p>
+        </w:tc>
+      </w:tr>
+      <w:tr>
+        <w:tc>
+          <w:tcPr>
+            <w:tcW w:w="4106" w:type="dxa"/>
           </w:tcPr>
           <w:p>
             <w:pPr>
@@ -30816,6 +30704,70 @@
                 <w:sz w:val="18"/>
                 <w:szCs w:val="18"/>
               </w:rPr>
+              <w:t>RF-11: pestaña de monitoreo.</w:t>
+            </w:r>
+          </w:p>
+        </w:tc>
+        <w:tc>
+          <w:tcPr>
+            <w:tcW w:w="4394" w:type="dxa"/>
+          </w:tcPr>
+          <w:p>
+            <w:pPr>
+              <w:spacing w:line="276" w:lineRule="auto"/>
+              <w:jc w:val="both"/>
+              <w:rPr>
+                <w:rFonts w:asciiTheme="minorHAnsi" w:hAnsiTheme="minorHAnsi" w:cstheme="minorHAnsi"/>
+                <w:sz w:val="18"/>
+                <w:szCs w:val="18"/>
+              </w:rPr>
+            </w:pPr>
+            <w:r>
+              <w:rPr>
+                <w:rFonts w:asciiTheme="minorHAnsi" w:hAnsiTheme="minorHAnsi" w:cstheme="minorHAnsi"/>
+                <w:sz w:val="18"/>
+                <w:szCs w:val="18"/>
+              </w:rPr>
+              <w:t>monitoring.py y pestaña Monitoreo (</w:t>
+            </w:r>
+            <w:r>
+              <w:rPr>
+                <w:rFonts w:asciiTheme="minorHAnsi" w:hAnsiTheme="minorHAnsi" w:cstheme="minorHAnsi"/>
+                <w:sz w:val="18"/>
+                <w:szCs w:val="18"/>
+              </w:rPr>
+              <w:t>Figura 19</w:t>
+            </w:r>
+            <w:r>
+              <w:rPr>
+                <w:rFonts w:asciiTheme="minorHAnsi" w:hAnsiTheme="minorHAnsi" w:cstheme="minorHAnsi"/>
+                <w:sz w:val="18"/>
+                <w:szCs w:val="18"/>
+              </w:rPr>
+              <w:t>).</w:t>
+            </w:r>
+          </w:p>
+        </w:tc>
+        <w:tc>
+          <w:tcPr>
+            <w:tcW w:w="1870" w:type="dxa"/>
+          </w:tcPr>
+          <w:p>
+            <w:pPr>
+              <w:spacing w:line="276" w:lineRule="auto"/>
+              <w:jc w:val="both"/>
+              <w:rPr>
+                <w:rFonts w:asciiTheme="minorHAnsi" w:hAnsiTheme="minorHAnsi" w:cstheme="minorHAnsi"/>
+                <w:sz w:val="18"/>
+                <w:szCs w:val="18"/>
+              </w:rPr>
+            </w:pPr>
+            <w:r>
+              <w:rPr>
+                <w:rFonts w:asciiTheme="minorHAnsi" w:hAnsiTheme="minorHAnsi" w:cstheme="minorHAnsi"/>
+                <w:sz w:val="18"/>
+                <w:szCs w:val="18"/>
+              </w:rPr>
               <w:t>Completado</w:t>
             </w:r>
           </w:p>
@@ -30842,7 +30794,7 @@
                 <w:sz w:val="18"/>
                 <w:szCs w:val="18"/>
               </w:rPr>
-              <w:t>RF-11: pestaña de monitoreo.</w:t>
+              <w:t>Usabilidad: interfaz clara para no técnicos.</w:t>
             </w:r>
           </w:p>
         </w:tc>
@@ -30866,29 +30818,39 @@
                 <w:sz w:val="18"/>
                 <w:szCs w:val="18"/>
               </w:rPr>
-              <w:t>monitoring.py y pestaña Monitoreo (Figura 2</w:t>
-            </w:r>
-            <w:r>
+              <w:t>Etiquetas y valores en español, agrupación lógica, límites por campo.</w:t>
+            </w:r>
+          </w:p>
+        </w:tc>
+        <w:tc>
+          <w:tcPr>
+            <w:tcW w:w="1870" w:type="dxa"/>
+          </w:tcPr>
+          <w:p>
+            <w:pPr>
+              <w:spacing w:line="276" w:lineRule="auto"/>
+              <w:jc w:val="both"/>
               <w:rPr>
                 <w:rFonts w:asciiTheme="minorHAnsi" w:hAnsiTheme="minorHAnsi" w:cstheme="minorHAnsi"/>
                 <w:sz w:val="18"/>
                 <w:szCs w:val="18"/>
               </w:rPr>
-              <w:t>6</w:t>
-            </w:r>
+            </w:pPr>
             <w:r>
               <w:rPr>
                 <w:rFonts w:asciiTheme="minorHAnsi" w:hAnsiTheme="minorHAnsi" w:cstheme="minorHAnsi"/>
                 <w:sz w:val="18"/>
                 <w:szCs w:val="18"/>
               </w:rPr>
-              <w:t>).</w:t>
-            </w:r>
-          </w:p>
-        </w:tc>
-        <w:tc>
-          <w:tcPr>
-            <w:tcW w:w="1870" w:type="dxa"/>
+              <w:t>Completado</w:t>
+            </w:r>
+          </w:p>
+        </w:tc>
+      </w:tr>
+      <w:tr>
+        <w:tc>
+          <w:tcPr>
+            <w:tcW w:w="4106" w:type="dxa"/>
           </w:tcPr>
           <w:p>
             <w:pPr>
@@ -30900,12 +30862,104 @@
                 <w:szCs w:val="18"/>
               </w:rPr>
             </w:pPr>
+            <w:proofErr w:type="spellStart"/>
             <w:r>
               <w:rPr>
                 <w:rFonts w:asciiTheme="minorHAnsi" w:hAnsiTheme="minorHAnsi" w:cstheme="minorHAnsi"/>
                 <w:sz w:val="18"/>
                 <w:szCs w:val="18"/>
               </w:rPr>
+              <w:t>Explicabilidad</w:t>
+            </w:r>
+            <w:proofErr w:type="spellEnd"/>
+            <w:r>
+              <w:rPr>
+                <w:rFonts w:asciiTheme="minorHAnsi" w:hAnsiTheme="minorHAnsi" w:cstheme="minorHAnsi"/>
+                <w:sz w:val="18"/>
+                <w:szCs w:val="18"/>
+              </w:rPr>
+              <w:t>: importancia global y local con SHAP.</w:t>
+            </w:r>
+          </w:p>
+        </w:tc>
+        <w:tc>
+          <w:tcPr>
+            <w:tcW w:w="4394" w:type="dxa"/>
+          </w:tcPr>
+          <w:p>
+            <w:pPr>
+              <w:spacing w:line="276" w:lineRule="auto"/>
+              <w:jc w:val="both"/>
+              <w:rPr>
+                <w:rFonts w:asciiTheme="minorHAnsi" w:hAnsiTheme="minorHAnsi" w:cstheme="minorHAnsi"/>
+                <w:sz w:val="18"/>
+                <w:szCs w:val="18"/>
+              </w:rPr>
+            </w:pPr>
+            <w:r>
+              <w:rPr>
+                <w:rFonts w:asciiTheme="minorHAnsi" w:hAnsiTheme="minorHAnsi" w:cstheme="minorHAnsi"/>
+                <w:sz w:val="18"/>
+                <w:szCs w:val="18"/>
+              </w:rPr>
+              <w:t xml:space="preserve">Pestaña </w:t>
+            </w:r>
+            <w:proofErr w:type="spellStart"/>
+            <w:r>
+              <w:rPr>
+                <w:rFonts w:asciiTheme="minorHAnsi" w:hAnsiTheme="minorHAnsi" w:cstheme="minorHAnsi"/>
+                <w:sz w:val="18"/>
+                <w:szCs w:val="18"/>
+              </w:rPr>
+              <w:t>Explicabilidad</w:t>
+            </w:r>
+            <w:proofErr w:type="spellEnd"/>
+            <w:r>
+              <w:rPr>
+                <w:rFonts w:asciiTheme="minorHAnsi" w:hAnsiTheme="minorHAnsi" w:cstheme="minorHAnsi"/>
+                <w:sz w:val="18"/>
+                <w:szCs w:val="18"/>
+              </w:rPr>
+              <w:t xml:space="preserve"> global (</w:t>
+            </w:r>
+            <w:r>
+              <w:rPr>
+                <w:rFonts w:asciiTheme="minorHAnsi" w:hAnsiTheme="minorHAnsi" w:cstheme="minorHAnsi"/>
+                <w:sz w:val="18"/>
+                <w:szCs w:val="18"/>
+              </w:rPr>
+              <w:t>Figuras 17 y 18</w:t>
+            </w:r>
+            <w:r>
+              <w:rPr>
+                <w:rFonts w:asciiTheme="minorHAnsi" w:hAnsiTheme="minorHAnsi" w:cstheme="minorHAnsi"/>
+                <w:sz w:val="18"/>
+                <w:szCs w:val="18"/>
+              </w:rPr>
+              <w:t>) + explicación local por predicción.</w:t>
+            </w:r>
+          </w:p>
+        </w:tc>
+        <w:tc>
+          <w:tcPr>
+            <w:tcW w:w="1870" w:type="dxa"/>
+          </w:tcPr>
+          <w:p>
+            <w:pPr>
+              <w:spacing w:line="276" w:lineRule="auto"/>
+              <w:jc w:val="both"/>
+              <w:rPr>
+                <w:rFonts w:asciiTheme="minorHAnsi" w:hAnsiTheme="minorHAnsi" w:cstheme="minorHAnsi"/>
+                <w:sz w:val="18"/>
+                <w:szCs w:val="18"/>
+              </w:rPr>
+            </w:pPr>
+            <w:r>
+              <w:rPr>
+                <w:rFonts w:asciiTheme="minorHAnsi" w:hAnsiTheme="minorHAnsi" w:cstheme="minorHAnsi"/>
+                <w:sz w:val="18"/>
+                <w:szCs w:val="18"/>
+              </w:rPr>
               <w:t>Completado</w:t>
             </w:r>
           </w:p>
@@ -30932,7 +30986,7 @@
                 <w:sz w:val="18"/>
                 <w:szCs w:val="18"/>
               </w:rPr>
-              <w:t>Usabilidad: interfaz clara para no técnicos.</w:t>
+              <w:t>Escalabilidad: separar preprocesamiento, inferencia e interfaz.</w:t>
             </w:r>
           </w:p>
         </w:tc>
@@ -30956,30 +31010,46 @@
                 <w:sz w:val="18"/>
                 <w:szCs w:val="18"/>
               </w:rPr>
-              <w:t>Etiquetas y valores en español, agrupación lógica, límites por campo.</w:t>
-            </w:r>
-          </w:p>
-        </w:tc>
-        <w:tc>
-          <w:tcPr>
-            <w:tcW w:w="1870" w:type="dxa"/>
-          </w:tcPr>
-          <w:p>
-            <w:pPr>
-              <w:spacing w:line="276" w:lineRule="auto"/>
-              <w:jc w:val="both"/>
+              <w:t>Backend y frontend como procesos HTTP independientes (</w:t>
+            </w:r>
+            <w:r>
               <w:rPr>
                 <w:rFonts w:asciiTheme="minorHAnsi" w:hAnsiTheme="minorHAnsi" w:cstheme="minorHAnsi"/>
                 <w:sz w:val="18"/>
                 <w:szCs w:val="18"/>
               </w:rPr>
-            </w:pPr>
+              <w:t>Figura 15</w:t>
+            </w:r>
             <w:r>
               <w:rPr>
                 <w:rFonts w:asciiTheme="minorHAnsi" w:hAnsiTheme="minorHAnsi" w:cstheme="minorHAnsi"/>
                 <w:sz w:val="18"/>
                 <w:szCs w:val="18"/>
               </w:rPr>
+              <w:t>).</w:t>
+            </w:r>
+          </w:p>
+        </w:tc>
+        <w:tc>
+          <w:tcPr>
+            <w:tcW w:w="1870" w:type="dxa"/>
+          </w:tcPr>
+          <w:p>
+            <w:pPr>
+              <w:spacing w:line="276" w:lineRule="auto"/>
+              <w:jc w:val="both"/>
+              <w:rPr>
+                <w:rFonts w:asciiTheme="minorHAnsi" w:hAnsiTheme="minorHAnsi" w:cstheme="minorHAnsi"/>
+                <w:sz w:val="18"/>
+                <w:szCs w:val="18"/>
+              </w:rPr>
+            </w:pPr>
+            <w:r>
+              <w:rPr>
+                <w:rFonts w:asciiTheme="minorHAnsi" w:hAnsiTheme="minorHAnsi" w:cstheme="minorHAnsi"/>
+                <w:sz w:val="18"/>
+                <w:szCs w:val="18"/>
+              </w:rPr>
               <w:t>Completado</w:t>
             </w:r>
           </w:p>
@@ -31007,7 +31077,7 @@
                 <w:sz w:val="18"/>
                 <w:szCs w:val="18"/>
               </w:rPr>
-              <w:t>Explicabilidad</w:t>
+              <w:t>Monitoreabilidad</w:t>
             </w:r>
             <w:proofErr w:type="spellEnd"/>
             <w:r>
@@ -31016,7 +31086,7 @@
                 <w:sz w:val="18"/>
                 <w:szCs w:val="18"/>
               </w:rPr>
-              <w:t>: importancia global y local con SHAP.</w:t>
+              <w:t>: registrar volumen, riesgo y distribución.</w:t>
             </w:r>
           </w:p>
         </w:tc>
@@ -31040,47 +31110,63 @@
                 <w:sz w:val="18"/>
                 <w:szCs w:val="18"/>
               </w:rPr>
-              <w:t xml:space="preserve">Pestaña </w:t>
-            </w:r>
-            <w:proofErr w:type="spellStart"/>
-            <w:r>
+              <w:t>Pestaña Monitoreo: conteo, distribución por banda, tiempo de respuesta.</w:t>
+            </w:r>
+          </w:p>
+        </w:tc>
+        <w:tc>
+          <w:tcPr>
+            <w:tcW w:w="1870" w:type="dxa"/>
+          </w:tcPr>
+          <w:p>
+            <w:pPr>
+              <w:spacing w:line="276" w:lineRule="auto"/>
+              <w:jc w:val="both"/>
               <w:rPr>
                 <w:rFonts w:asciiTheme="minorHAnsi" w:hAnsiTheme="minorHAnsi" w:cstheme="minorHAnsi"/>
                 <w:sz w:val="18"/>
                 <w:szCs w:val="18"/>
               </w:rPr>
-              <w:t>Explicabilidad</w:t>
-            </w:r>
-            <w:proofErr w:type="spellEnd"/>
+            </w:pPr>
             <w:r>
               <w:rPr>
                 <w:rFonts w:asciiTheme="minorHAnsi" w:hAnsiTheme="minorHAnsi" w:cstheme="minorHAnsi"/>
                 <w:sz w:val="18"/>
                 <w:szCs w:val="18"/>
               </w:rPr>
-              <w:t xml:space="preserve"> global (Figura 2</w:t>
-            </w:r>
-            <w:r>
+              <w:t>Completado</w:t>
+            </w:r>
+          </w:p>
+        </w:tc>
+      </w:tr>
+      <w:tr>
+        <w:tc>
+          <w:tcPr>
+            <w:tcW w:w="4106" w:type="dxa"/>
+          </w:tcPr>
+          <w:p>
+            <w:pPr>
+              <w:spacing w:line="276" w:lineRule="auto"/>
+              <w:jc w:val="both"/>
               <w:rPr>
                 <w:rFonts w:asciiTheme="minorHAnsi" w:hAnsiTheme="minorHAnsi" w:cstheme="minorHAnsi"/>
                 <w:sz w:val="18"/>
                 <w:szCs w:val="18"/>
               </w:rPr>
-              <w:t>5</w:t>
-            </w:r>
+            </w:pPr>
             <w:r>
               <w:rPr>
                 <w:rFonts w:asciiTheme="minorHAnsi" w:hAnsiTheme="minorHAnsi" w:cstheme="minorHAnsi"/>
                 <w:sz w:val="18"/>
                 <w:szCs w:val="18"/>
               </w:rPr>
-              <w:t>) + explicación local por predicción.</w:t>
-            </w:r>
-          </w:p>
-        </w:tc>
-        <w:tc>
-          <w:tcPr>
-            <w:tcW w:w="1870" w:type="dxa"/>
+              <w:t>Rendimiento: responder en pocos segundos en CPU.</w:t>
+            </w:r>
+          </w:p>
+        </w:tc>
+        <w:tc>
+          <w:tcPr>
+            <w:tcW w:w="4394" w:type="dxa"/>
           </w:tcPr>
           <w:p>
             <w:pPr>
@@ -31098,6 +31184,30 @@
                 <w:sz w:val="18"/>
                 <w:szCs w:val="18"/>
               </w:rPr>
+              <w:t>9,5 ms promedio sobre 100 predicciones reales.</w:t>
+            </w:r>
+          </w:p>
+        </w:tc>
+        <w:tc>
+          <w:tcPr>
+            <w:tcW w:w="1870" w:type="dxa"/>
+          </w:tcPr>
+          <w:p>
+            <w:pPr>
+              <w:spacing w:line="276" w:lineRule="auto"/>
+              <w:jc w:val="both"/>
+              <w:rPr>
+                <w:rFonts w:asciiTheme="minorHAnsi" w:hAnsiTheme="minorHAnsi" w:cstheme="minorHAnsi"/>
+                <w:sz w:val="18"/>
+                <w:szCs w:val="18"/>
+              </w:rPr>
+            </w:pPr>
+            <w:r>
+              <w:rPr>
+                <w:rFonts w:asciiTheme="minorHAnsi" w:hAnsiTheme="minorHAnsi" w:cstheme="minorHAnsi"/>
+                <w:sz w:val="18"/>
+                <w:szCs w:val="18"/>
+              </w:rPr>
               <w:t>Completado</w:t>
             </w:r>
           </w:p>
@@ -31124,7 +31234,7 @@
                 <w:sz w:val="18"/>
                 <w:szCs w:val="18"/>
               </w:rPr>
-              <w:t>Escalabilidad: separar preprocesamiento, inferencia e interfaz.</w:t>
+              <w:t>Seguridad: no guardar información sensible.</w:t>
             </w:r>
           </w:p>
         </w:tc>
@@ -31148,29 +31258,39 @@
                 <w:sz w:val="18"/>
                 <w:szCs w:val="18"/>
               </w:rPr>
-              <w:t>Backend y frontend como procesos HTTP independientes (Figura 2</w:t>
-            </w:r>
-            <w:r>
+              <w:t>Prueba automatizada que verifica que no se filtran variables crudas.</w:t>
+            </w:r>
+          </w:p>
+        </w:tc>
+        <w:tc>
+          <w:tcPr>
+            <w:tcW w:w="1870" w:type="dxa"/>
+          </w:tcPr>
+          <w:p>
+            <w:pPr>
+              <w:spacing w:line="276" w:lineRule="auto"/>
+              <w:jc w:val="both"/>
               <w:rPr>
                 <w:rFonts w:asciiTheme="minorHAnsi" w:hAnsiTheme="minorHAnsi" w:cstheme="minorHAnsi"/>
                 <w:sz w:val="18"/>
                 <w:szCs w:val="18"/>
               </w:rPr>
-              <w:t>2</w:t>
-            </w:r>
+            </w:pPr>
             <w:r>
               <w:rPr>
                 <w:rFonts w:asciiTheme="minorHAnsi" w:hAnsiTheme="minorHAnsi" w:cstheme="minorHAnsi"/>
                 <w:sz w:val="18"/>
                 <w:szCs w:val="18"/>
               </w:rPr>
-              <w:t>).</w:t>
-            </w:r>
-          </w:p>
-        </w:tc>
-        <w:tc>
-          <w:tcPr>
-            <w:tcW w:w="1870" w:type="dxa"/>
+              <w:t>Completado</w:t>
+            </w:r>
+          </w:p>
+        </w:tc>
+      </w:tr>
+      <w:tr>
+        <w:tc>
+          <w:tcPr>
+            <w:tcW w:w="4106" w:type="dxa"/>
           </w:tcPr>
           <w:p>
             <w:pPr>
@@ -31188,15 +31308,13 @@
                 <w:sz w:val="18"/>
                 <w:szCs w:val="18"/>
               </w:rPr>
-              <w:t>Completado</w:t>
-            </w:r>
-          </w:p>
-        </w:tc>
-      </w:tr>
-      <w:tr>
-        <w:tc>
-          <w:tcPr>
-            <w:tcW w:w="4106" w:type="dxa"/>
+              <w:t>Ética: apoyar, no automatizar, decisiones sobre clientes.</w:t>
+            </w:r>
+          </w:p>
+        </w:tc>
+        <w:tc>
+          <w:tcPr>
+            <w:tcW w:w="4394" w:type="dxa"/>
           </w:tcPr>
           <w:p>
             <w:pPr>
@@ -31208,292 +31326,36 @@
                 <w:szCs w:val="18"/>
               </w:rPr>
             </w:pPr>
-            <w:proofErr w:type="spellStart"/>
             <w:r>
               <w:rPr>
                 <w:rFonts w:asciiTheme="minorHAnsi" w:hAnsiTheme="minorHAnsi" w:cstheme="minorHAnsi"/>
                 <w:sz w:val="18"/>
                 <w:szCs w:val="18"/>
               </w:rPr>
-              <w:t>Monitoreabilidad</w:t>
-            </w:r>
-            <w:proofErr w:type="spellEnd"/>
-            <w:r>
+              <w:t>La app entrega probabilidad y explicación; no ejecuta ninguna acción sobre el cliente.</w:t>
+            </w:r>
+          </w:p>
+        </w:tc>
+        <w:tc>
+          <w:tcPr>
+            <w:tcW w:w="1870" w:type="dxa"/>
+          </w:tcPr>
+          <w:p>
+            <w:pPr>
+              <w:spacing w:line="276" w:lineRule="auto"/>
+              <w:jc w:val="both"/>
               <w:rPr>
                 <w:rFonts w:asciiTheme="minorHAnsi" w:hAnsiTheme="minorHAnsi" w:cstheme="minorHAnsi"/>
                 <w:sz w:val="18"/>
                 <w:szCs w:val="18"/>
               </w:rPr>
-              <w:t>: registrar volumen, riesgo y distribución.</w:t>
-            </w:r>
-          </w:p>
-        </w:tc>
-        <w:tc>
-          <w:tcPr>
-            <w:tcW w:w="4394" w:type="dxa"/>
-          </w:tcPr>
-          <w:p>
-            <w:pPr>
-              <w:spacing w:line="276" w:lineRule="auto"/>
-              <w:jc w:val="both"/>
+            </w:pPr>
+            <w:r>
               <w:rPr>
                 <w:rFonts w:asciiTheme="minorHAnsi" w:hAnsiTheme="minorHAnsi" w:cstheme="minorHAnsi"/>
                 <w:sz w:val="18"/>
                 <w:szCs w:val="18"/>
               </w:rPr>
-            </w:pPr>
-            <w:r>
-              <w:rPr>
-                <w:rFonts w:asciiTheme="minorHAnsi" w:hAnsiTheme="minorHAnsi" w:cstheme="minorHAnsi"/>
-                <w:sz w:val="18"/>
-                <w:szCs w:val="18"/>
-              </w:rPr>
-              <w:t>Pestaña Monitoreo: conteo, distribución por banda, tiempo de respuesta.</w:t>
-            </w:r>
-          </w:p>
-        </w:tc>
-        <w:tc>
-          <w:tcPr>
-            <w:tcW w:w="1870" w:type="dxa"/>
-          </w:tcPr>
-          <w:p>
-            <w:pPr>
-              <w:spacing w:line="276" w:lineRule="auto"/>
-              <w:jc w:val="both"/>
-              <w:rPr>
-                <w:rFonts w:asciiTheme="minorHAnsi" w:hAnsiTheme="minorHAnsi" w:cstheme="minorHAnsi"/>
-                <w:sz w:val="18"/>
-                <w:szCs w:val="18"/>
-              </w:rPr>
-            </w:pPr>
-            <w:r>
-              <w:rPr>
-                <w:rFonts w:asciiTheme="minorHAnsi" w:hAnsiTheme="minorHAnsi" w:cstheme="minorHAnsi"/>
-                <w:sz w:val="18"/>
-                <w:szCs w:val="18"/>
-              </w:rPr>
-              <w:t>Completado</w:t>
-            </w:r>
-          </w:p>
-        </w:tc>
-      </w:tr>
-      <w:tr>
-        <w:tc>
-          <w:tcPr>
-            <w:tcW w:w="4106" w:type="dxa"/>
-          </w:tcPr>
-          <w:p>
-            <w:pPr>
-              <w:spacing w:line="276" w:lineRule="auto"/>
-              <w:jc w:val="both"/>
-              <w:rPr>
-                <w:rFonts w:asciiTheme="minorHAnsi" w:hAnsiTheme="minorHAnsi" w:cstheme="minorHAnsi"/>
-                <w:sz w:val="18"/>
-                <w:szCs w:val="18"/>
-              </w:rPr>
-            </w:pPr>
-            <w:r>
-              <w:rPr>
-                <w:rFonts w:asciiTheme="minorHAnsi" w:hAnsiTheme="minorHAnsi" w:cstheme="minorHAnsi"/>
-                <w:sz w:val="18"/>
-                <w:szCs w:val="18"/>
-              </w:rPr>
-              <w:t>Rendimiento: responder en pocos segundos en CPU.</w:t>
-            </w:r>
-          </w:p>
-        </w:tc>
-        <w:tc>
-          <w:tcPr>
-            <w:tcW w:w="4394" w:type="dxa"/>
-          </w:tcPr>
-          <w:p>
-            <w:pPr>
-              <w:spacing w:line="276" w:lineRule="auto"/>
-              <w:jc w:val="both"/>
-              <w:rPr>
-                <w:rFonts w:asciiTheme="minorHAnsi" w:hAnsiTheme="minorHAnsi" w:cstheme="minorHAnsi"/>
-                <w:sz w:val="18"/>
-                <w:szCs w:val="18"/>
-              </w:rPr>
-            </w:pPr>
-            <w:r>
-              <w:rPr>
-                <w:rFonts w:asciiTheme="minorHAnsi" w:hAnsiTheme="minorHAnsi" w:cstheme="minorHAnsi"/>
-                <w:sz w:val="18"/>
-                <w:szCs w:val="18"/>
-              </w:rPr>
-              <w:t>9,5 ms promedio sobre 100 predicciones reales.</w:t>
-            </w:r>
-          </w:p>
-        </w:tc>
-        <w:tc>
-          <w:tcPr>
-            <w:tcW w:w="1870" w:type="dxa"/>
-          </w:tcPr>
-          <w:p>
-            <w:pPr>
-              <w:spacing w:line="276" w:lineRule="auto"/>
-              <w:jc w:val="both"/>
-              <w:rPr>
-                <w:rFonts w:asciiTheme="minorHAnsi" w:hAnsiTheme="minorHAnsi" w:cstheme="minorHAnsi"/>
-                <w:sz w:val="18"/>
-                <w:szCs w:val="18"/>
-              </w:rPr>
-            </w:pPr>
-            <w:r>
-              <w:rPr>
-                <w:rFonts w:asciiTheme="minorHAnsi" w:hAnsiTheme="minorHAnsi" w:cstheme="minorHAnsi"/>
-                <w:sz w:val="18"/>
-                <w:szCs w:val="18"/>
-              </w:rPr>
-              <w:t>Completado</w:t>
-            </w:r>
-          </w:p>
-        </w:tc>
-      </w:tr>
-      <w:tr>
-        <w:tc>
-          <w:tcPr>
-            <w:tcW w:w="4106" w:type="dxa"/>
-          </w:tcPr>
-          <w:p>
-            <w:pPr>
-              <w:spacing w:line="276" w:lineRule="auto"/>
-              <w:jc w:val="both"/>
-              <w:rPr>
-                <w:rFonts w:asciiTheme="minorHAnsi" w:hAnsiTheme="minorHAnsi" w:cstheme="minorHAnsi"/>
-                <w:sz w:val="18"/>
-                <w:szCs w:val="18"/>
-              </w:rPr>
-            </w:pPr>
-            <w:r>
-              <w:rPr>
-                <w:rFonts w:asciiTheme="minorHAnsi" w:hAnsiTheme="minorHAnsi" w:cstheme="minorHAnsi"/>
-                <w:sz w:val="18"/>
-                <w:szCs w:val="18"/>
-              </w:rPr>
-              <w:t>Seguridad: no guardar información sensible.</w:t>
-            </w:r>
-          </w:p>
-        </w:tc>
-        <w:tc>
-          <w:tcPr>
-            <w:tcW w:w="4394" w:type="dxa"/>
-          </w:tcPr>
-          <w:p>
-            <w:pPr>
-              <w:spacing w:line="276" w:lineRule="auto"/>
-              <w:jc w:val="both"/>
-              <w:rPr>
-                <w:rFonts w:asciiTheme="minorHAnsi" w:hAnsiTheme="minorHAnsi" w:cstheme="minorHAnsi"/>
-                <w:sz w:val="18"/>
-                <w:szCs w:val="18"/>
-              </w:rPr>
-            </w:pPr>
-            <w:r>
-              <w:rPr>
-                <w:rFonts w:asciiTheme="minorHAnsi" w:hAnsiTheme="minorHAnsi" w:cstheme="minorHAnsi"/>
-                <w:sz w:val="18"/>
-                <w:szCs w:val="18"/>
-              </w:rPr>
-              <w:t>Prueba automatizada que verifica que no se filtran variables crudas.</w:t>
-            </w:r>
-          </w:p>
-        </w:tc>
-        <w:tc>
-          <w:tcPr>
-            <w:tcW w:w="1870" w:type="dxa"/>
-          </w:tcPr>
-          <w:p>
-            <w:pPr>
-              <w:spacing w:line="276" w:lineRule="auto"/>
-              <w:jc w:val="both"/>
-              <w:rPr>
-                <w:rFonts w:asciiTheme="minorHAnsi" w:hAnsiTheme="minorHAnsi" w:cstheme="minorHAnsi"/>
-                <w:sz w:val="18"/>
-                <w:szCs w:val="18"/>
-              </w:rPr>
-            </w:pPr>
-            <w:r>
-              <w:rPr>
-                <w:rFonts w:asciiTheme="minorHAnsi" w:hAnsiTheme="minorHAnsi" w:cstheme="minorHAnsi"/>
-                <w:sz w:val="18"/>
-                <w:szCs w:val="18"/>
-              </w:rPr>
-              <w:t>Completado</w:t>
-            </w:r>
-          </w:p>
-        </w:tc>
-      </w:tr>
-      <w:tr>
-        <w:tc>
-          <w:tcPr>
-            <w:tcW w:w="4106" w:type="dxa"/>
-          </w:tcPr>
-          <w:p>
-            <w:pPr>
-              <w:spacing w:line="276" w:lineRule="auto"/>
-              <w:jc w:val="both"/>
-              <w:rPr>
-                <w:rFonts w:asciiTheme="minorHAnsi" w:hAnsiTheme="minorHAnsi" w:cstheme="minorHAnsi"/>
-                <w:sz w:val="18"/>
-                <w:szCs w:val="18"/>
-              </w:rPr>
-            </w:pPr>
-            <w:r>
-              <w:rPr>
-                <w:rFonts w:asciiTheme="minorHAnsi" w:hAnsiTheme="minorHAnsi" w:cstheme="minorHAnsi"/>
-                <w:sz w:val="18"/>
-                <w:szCs w:val="18"/>
-              </w:rPr>
-              <w:t>Ética: apoyar, no automatizar, decisiones sobre clientes.</w:t>
-            </w:r>
-          </w:p>
-        </w:tc>
-        <w:tc>
-          <w:tcPr>
-            <w:tcW w:w="4394" w:type="dxa"/>
-          </w:tcPr>
-          <w:p>
-            <w:pPr>
-              <w:spacing w:line="276" w:lineRule="auto"/>
-              <w:jc w:val="both"/>
-              <w:rPr>
-                <w:rFonts w:asciiTheme="minorHAnsi" w:hAnsiTheme="minorHAnsi" w:cstheme="minorHAnsi"/>
-                <w:sz w:val="18"/>
-                <w:szCs w:val="18"/>
-              </w:rPr>
-            </w:pPr>
-            <w:r>
-              <w:rPr>
-                <w:rFonts w:asciiTheme="minorHAnsi" w:hAnsiTheme="minorHAnsi" w:cstheme="minorHAnsi"/>
-                <w:sz w:val="18"/>
-                <w:szCs w:val="18"/>
-              </w:rPr>
-              <w:t>La app entrega probabilidad y explicación; no ejecuta ninguna acción sobre el cliente.</w:t>
-            </w:r>
-          </w:p>
-        </w:tc>
-        <w:tc>
-          <w:tcPr>
-            <w:tcW w:w="1870" w:type="dxa"/>
-          </w:tcPr>
-          <w:p>
-            <w:pPr>
-              <w:spacing w:line="276" w:lineRule="auto"/>
-              <w:jc w:val="both"/>
-              <w:rPr>
-                <w:rFonts w:asciiTheme="minorHAnsi" w:hAnsiTheme="minorHAnsi" w:cstheme="minorHAnsi"/>
-                <w:sz w:val="18"/>
-                <w:szCs w:val="18"/>
-              </w:rPr>
-            </w:pPr>
-            <w:r>
-              <w:rPr>
-                <w:rFonts w:asciiTheme="minorHAnsi" w:hAnsiTheme="minorHAnsi" w:cstheme="minorHAnsi"/>
-                <w:sz w:val="18"/>
-                <w:szCs w:val="18"/>
-              </w:rPr>
               <w:t>Completado</w:t>
             </w:r>
           </w:p>
@@ -31506,6 +31368,41 @@
         <w:jc w:val="both"/>
         <w:rPr>
           <w:rFonts w:asciiTheme="minorHAnsi" w:hAnsiTheme="minorHAnsi" w:cstheme="minorHAnsi"/>
+        </w:rPr>
+      </w:pPr>
+    </w:p>
+    <w:p>
+      <w:pPr>
+        <w:rPr>
+          <w:lang w:val="es-419" w:eastAsia="es-419"/>
+        </w:rPr>
+      </w:pPr>
+    </w:p>
+    <w:p>
+      <w:pPr>
+        <w:rPr>
+          <w:lang w:val="es-419" w:eastAsia="es-419"/>
+        </w:rPr>
+      </w:pPr>
+    </w:p>
+    <w:p>
+      <w:pPr>
+        <w:rPr>
+          <w:lang w:val="es-419" w:eastAsia="es-419"/>
+        </w:rPr>
+      </w:pPr>
+    </w:p>
+    <w:p>
+      <w:pPr>
+        <w:rPr>
+          <w:lang w:val="es-419" w:eastAsia="es-419"/>
+        </w:rPr>
+      </w:pPr>
+    </w:p>
+    <w:p>
+      <w:pPr>
+        <w:rPr>
+          <w:lang w:val="es-419" w:eastAsia="es-419"/>
         </w:rPr>
       </w:pPr>
     </w:p>
@@ -31526,6 +31423,153 @@
           <w:lang w:val="es-419" w:eastAsia="es-419"/>
         </w:rPr>
       </w:pPr>
+      <w:r>
+        <w:rPr>
+          <w:rFonts w:asciiTheme="minorHAnsi" w:eastAsia="Times New Roman" w:hAnsiTheme="minorHAnsi" w:cstheme="minorHAnsi"/>
+          <w:b/>
+          <w:bCs/>
+          <w:sz w:val="28"/>
+          <w:szCs w:val="44"/>
+          <w:lang w:val="es-419" w:eastAsia="es-419"/>
+        </w:rPr>
+        <w:lastRenderedPageBreak/>
+        <w:t>VI. Propuesta de mejoras</w:t>
+      </w:r>
+    </w:p>
+    <w:p>
+      <w:pPr>
+        <w:spacing w:after="120" w:line="276" w:lineRule="auto"/>
+        <w:jc w:val="both"/>
+        <w:rPr>
+          <w:rFonts w:asciiTheme="minorHAnsi" w:hAnsiTheme="minorHAnsi" w:cstheme="minorHAnsi"/>
+        </w:rPr>
+      </w:pPr>
+      <w:r>
+        <w:rPr>
+          <w:rFonts w:asciiTheme="minorHAnsi" w:hAnsiTheme="minorHAnsi" w:cstheme="minorHAnsi"/>
+        </w:rPr>
+        <w:t>1. V</w:t>
+      </w:r>
+      <w:r>
+        <w:rPr>
+          <w:rFonts w:asciiTheme="minorHAnsi" w:hAnsiTheme="minorHAnsi" w:cstheme="minorHAnsi"/>
+        </w:rPr>
+        <w:t xml:space="preserve">alidar con datos reales y monitorear </w:t>
+      </w:r>
+      <w:proofErr w:type="spellStart"/>
+      <w:r>
+        <w:rPr>
+          <w:rFonts w:asciiTheme="minorHAnsi" w:hAnsiTheme="minorHAnsi" w:cstheme="minorHAnsi"/>
+        </w:rPr>
+        <w:t>drift</w:t>
+      </w:r>
+      <w:proofErr w:type="spellEnd"/>
+      <w:r>
+        <w:rPr>
+          <w:rFonts w:asciiTheme="minorHAnsi" w:hAnsiTheme="minorHAnsi" w:cstheme="minorHAnsi"/>
+        </w:rPr>
+        <w:t xml:space="preserve">. El </w:t>
+      </w:r>
+      <w:proofErr w:type="spellStart"/>
+      <w:r>
+        <w:rPr>
+          <w:rFonts w:asciiTheme="minorHAnsi" w:hAnsiTheme="minorHAnsi" w:cstheme="minorHAnsi"/>
+        </w:rPr>
+        <w:t>dataset</w:t>
+      </w:r>
+      <w:proofErr w:type="spellEnd"/>
+      <w:r>
+        <w:rPr>
+          <w:rFonts w:asciiTheme="minorHAnsi" w:hAnsiTheme="minorHAnsi" w:cstheme="minorHAnsi"/>
+        </w:rPr>
+        <w:t xml:space="preserve"> es sintético y puede no representar completamente una organización. Se propone validar con datos reales anonimizados y monitorear la distribución de variables, probabilidades y métricas a lo largo del tiempo.</w:t>
+      </w:r>
+    </w:p>
+    <w:p>
+      <w:pPr>
+        <w:spacing w:after="120" w:line="276" w:lineRule="auto"/>
+        <w:rPr>
+          <w:rFonts w:asciiTheme="minorHAnsi" w:hAnsiTheme="minorHAnsi" w:cstheme="minorHAnsi"/>
+        </w:rPr>
+      </w:pPr>
+      <w:r>
+        <w:rPr>
+          <w:rStyle w:val="Textoennegrita"/>
+          <w:rFonts w:asciiTheme="minorHAnsi" w:hAnsiTheme="minorHAnsi" w:cstheme="minorHAnsi"/>
+          <w:b w:val="0"/>
+          <w:bCs w:val="0"/>
+        </w:rPr>
+        <w:t xml:space="preserve">2. </w:t>
+      </w:r>
+      <w:r>
+        <w:rPr>
+          <w:rStyle w:val="Textoennegrita"/>
+          <w:rFonts w:asciiTheme="minorHAnsi" w:hAnsiTheme="minorHAnsi" w:cstheme="minorHAnsi"/>
+          <w:b w:val="0"/>
+          <w:bCs w:val="0"/>
+        </w:rPr>
+        <w:t>Calibrar probabilidades y definir umbrales mediante costos reales.</w:t>
+      </w:r>
+      <w:r>
+        <w:rPr>
+          <w:rFonts w:asciiTheme="minorHAnsi" w:hAnsiTheme="minorHAnsi" w:cstheme="minorHAnsi"/>
+        </w:rPr>
+        <w:t xml:space="preserve"> La precisión de 0,234 evidencia una cantidad importante de falsos positivos. Como mejora futura, se propone calibrar las probabilidades con un conjunto independiente y seleccionar el umbral considerando el costo de intervenir innecesariamente frente al costo de no detectar un abandono.</w:t>
+      </w:r>
+    </w:p>
+    <w:p>
+      <w:pPr>
+        <w:spacing w:after="120" w:line="276" w:lineRule="auto"/>
+        <w:jc w:val="both"/>
+        <w:rPr>
+          <w:rFonts w:asciiTheme="minorHAnsi" w:hAnsiTheme="minorHAnsi" w:cstheme="minorHAnsi"/>
+        </w:rPr>
+      </w:pPr>
+      <w:r>
+        <w:rPr>
+          <w:rFonts w:asciiTheme="minorHAnsi" w:hAnsiTheme="minorHAnsi" w:cstheme="minorHAnsi"/>
+        </w:rPr>
+        <w:t>3. Esquema de entrada configurable para otros negocios. El esquema de las 30 variables de entrada (backend/schema.py) está codificado específicamente para este dataset; adaptar el sistema a otra empresa u otro plan de suscripción hoy requeriría modificar el código. Como mejora futura, se propone externalizar el esquema (variables, rangos, categorías válidas) a un archivo de configuración por cliente, para que la aplicación pueda reutilizarse en otro rubro sin reescribir el backend.</w:t>
+      </w:r>
+    </w:p>
+    <w:p>
+      <w:pPr>
+        <w:spacing w:after="120" w:line="276" w:lineRule="auto"/>
+        <w:jc w:val="both"/>
+        <w:rPr>
+          <w:rFonts w:asciiTheme="minorHAnsi" w:hAnsiTheme="minorHAnsi" w:cstheme="minorHAnsi"/>
+        </w:rPr>
+      </w:pPr>
+      <w:r>
+        <w:rPr>
+          <w:rFonts w:asciiTheme="minorHAnsi" w:hAnsiTheme="minorHAnsi" w:cstheme="minorHAnsi"/>
+        </w:rPr>
+        <w:t>4. Predicción por lotes y vista de cartera priorizada. El prototipo actual predice un cliente a la vez (formulario o ficha individual). Como mejora futura, se propone permitir cargar un archivo CSV con varios clientes y mostrar una vista de cartera que los ordene por nivel de riesgo, para apoyar la priorización cuando el equipo de retención necesita revisar muchos casos a la vez, no solo uno.</w:t>
+      </w:r>
+    </w:p>
+    <w:p>
+      <w:pPr>
+        <w:spacing w:after="120" w:line="276" w:lineRule="auto"/>
+        <w:jc w:val="both"/>
+        <w:rPr>
+          <w:rFonts w:asciiTheme="minorHAnsi" w:hAnsiTheme="minorHAnsi" w:cstheme="minorHAnsi"/>
+        </w:rPr>
+      </w:pPr>
+      <w:r>
+        <w:rPr>
+          <w:rFonts w:asciiTheme="minorHAnsi" w:hAnsiTheme="minorHAnsi" w:cstheme="minorHAnsi"/>
+        </w:rPr>
+        <w:t>5. Medir el impacto real de las acciones de retención. El sistema entrega una probabilidad y una explicación, pero no sabe si las acciones que el equipo de retención decide tomar a partir de esa información efectivamente reducen el abandono. Como mejora futura, y conectando con datos históricos reales de un CRM, se propone registrar qué clientes recibieron una intervención de retención y comparar su tasa de abandono real contra la de clientes similares que no la recibieron, para evaluar si la intervención marca una diferencia y reentrenar el modelo incorporando ese resultado.</w:t>
+      </w:r>
+    </w:p>
+    <w:p>
+      <w:pPr>
+        <w:spacing w:after="120" w:line="276" w:lineRule="auto"/>
+        <w:jc w:val="both"/>
+        <w:rPr>
+          <w:rFonts w:asciiTheme="minorHAnsi" w:hAnsiTheme="minorHAnsi" w:cstheme="minorHAnsi"/>
+        </w:rPr>
+      </w:pPr>
     </w:p>
     <w:p>
       <w:pPr>
@@ -31544,6 +31588,105 @@
           <w:lang w:val="es-419" w:eastAsia="es-419"/>
         </w:rPr>
       </w:pPr>
+      <w:r>
+        <w:rPr>
+          <w:rFonts w:asciiTheme="minorHAnsi" w:eastAsia="Times New Roman" w:hAnsiTheme="minorHAnsi" w:cstheme="minorHAnsi"/>
+          <w:b/>
+          <w:bCs/>
+          <w:sz w:val="28"/>
+          <w:szCs w:val="44"/>
+          <w:lang w:val="es-419" w:eastAsia="es-419"/>
+        </w:rPr>
+        <w:t>VII. Código fuente en GitHub</w:t>
+      </w:r>
+    </w:p>
+    <w:p>
+      <w:pPr>
+        <w:spacing w:after="120" w:line="276" w:lineRule="auto"/>
+        <w:jc w:val="both"/>
+        <w:rPr>
+          <w:rFonts w:asciiTheme="minorHAnsi" w:hAnsiTheme="minorHAnsi" w:cstheme="minorHAnsi"/>
+        </w:rPr>
+      </w:pPr>
+      <w:r>
+        <w:rPr>
+          <w:rFonts w:asciiTheme="minorHAnsi" w:hAnsiTheme="minorHAnsi" w:cstheme="minorHAnsi"/>
+        </w:rPr>
+        <w:t xml:space="preserve">El código, los notebooks, los artefactos y la aplicación se encuentran disponibles en el </w:t>
+      </w:r>
+      <w:hyperlink r:id="rId52" w:history="1">
+        <w:r>
+          <w:rPr>
+            <w:rStyle w:val="Hipervnculo"/>
+            <w:rFonts w:asciiTheme="minorHAnsi" w:hAnsiTheme="minorHAnsi" w:cstheme="minorHAnsi"/>
+          </w:rPr>
+          <w:t>repositorio del proyecto</w:t>
+        </w:r>
+      </w:hyperlink>
+      <w:r>
+        <w:rPr>
+          <w:rFonts w:asciiTheme="minorHAnsi" w:hAnsiTheme="minorHAnsi" w:cstheme="minorHAnsi"/>
+        </w:rPr>
+        <w:t xml:space="preserve"> (Vera et al., 2026)</w:t>
+      </w:r>
+      <w:r>
+        <w:rPr>
+          <w:rFonts w:asciiTheme="minorHAnsi" w:hAnsiTheme="minorHAnsi" w:cstheme="minorHAnsi"/>
+        </w:rPr>
+        <w:t>.</w:t>
+      </w:r>
+    </w:p>
+    <w:p>
+      <w:pPr>
+        <w:spacing w:after="120" w:line="276" w:lineRule="auto"/>
+        <w:jc w:val="both"/>
+        <w:rPr>
+          <w:rFonts w:asciiTheme="minorHAnsi" w:hAnsiTheme="minorHAnsi" w:cstheme="minorHAnsi"/>
+        </w:rPr>
+      </w:pPr>
+      <w:r>
+        <w:rPr>
+          <w:rFonts w:asciiTheme="minorHAnsi" w:hAnsiTheme="minorHAnsi" w:cstheme="minorHAnsi"/>
+        </w:rPr>
+        <w:t xml:space="preserve">La rama </w:t>
+      </w:r>
+      <w:proofErr w:type="spellStart"/>
+      <w:r>
+        <w:rPr>
+          <w:rFonts w:asciiTheme="minorHAnsi" w:hAnsiTheme="minorHAnsi" w:cstheme="minorHAnsi"/>
+        </w:rPr>
+        <w:t>main</w:t>
+      </w:r>
+      <w:proofErr w:type="spellEnd"/>
+      <w:r>
+        <w:rPr>
+          <w:rFonts w:asciiTheme="minorHAnsi" w:hAnsiTheme="minorHAnsi" w:cstheme="minorHAnsi"/>
+        </w:rPr>
+        <w:t xml:space="preserve"> contiene los notebooks 01 a 07 (calidad y EDA, preprocesamiento, modelamiento ML, balanceo y modelamiento DL, refinamiento de XGBoost y de la MLP profunda, y explicabilidad SHAP), además de los módulos backend/ (API de inferencia FastAPI) y frontend/ (aplicación Streamlit) del prototipo, y las pruebas automatizadas en </w:t>
+      </w:r>
+      <w:proofErr w:type="spellStart"/>
+      <w:r>
+        <w:rPr>
+          <w:rFonts w:asciiTheme="minorHAnsi" w:hAnsiTheme="minorHAnsi" w:cstheme="minorHAnsi"/>
+        </w:rPr>
+        <w:t>tests</w:t>
+      </w:r>
+      <w:proofErr w:type="spellEnd"/>
+      <w:r>
+        <w:rPr>
+          <w:rFonts w:asciiTheme="minorHAnsi" w:hAnsiTheme="minorHAnsi" w:cstheme="minorHAnsi"/>
+        </w:rPr>
+        <w:t>/.</w:t>
+      </w:r>
+    </w:p>
+    <w:p>
+      <w:pPr>
+        <w:spacing w:after="120" w:line="276" w:lineRule="auto"/>
+        <w:jc w:val="both"/>
+        <w:rPr>
+          <w:rFonts w:asciiTheme="minorHAnsi" w:hAnsiTheme="minorHAnsi" w:cstheme="minorHAnsi"/>
+        </w:rPr>
+      </w:pPr>
     </w:p>
     <w:p>
       <w:pPr>
@@ -31571,1709 +31714,1336 @@
           <w:szCs w:val="44"/>
           <w:lang w:val="es-419" w:eastAsia="es-419"/>
         </w:rPr>
+        <w:t>VIII. Bibliografía</w:t>
+      </w:r>
+    </w:p>
+    <w:p>
+      <w:pPr>
+        <w:spacing w:after="80" w:line="276" w:lineRule="auto"/>
+        <w:ind w:left="720" w:hanging="720"/>
+        <w:jc w:val="both"/>
+        <w:rPr>
+          <w:rFonts w:asciiTheme="minorHAnsi" w:hAnsiTheme="minorHAnsi" w:cstheme="minorHAnsi"/>
+        </w:rPr>
+      </w:pPr>
+      <w:r>
+        <w:t xml:space="preserve">Ahmad, A. K., Jafar, A., &amp; Aljoumaa, K. (2019). Customer churn prediction in telecom using machine learning in big data platform. </w:t>
+      </w:r>
+      <w:r>
+        <w:rPr>
+          <w:i/>
+        </w:rPr>
+        <w:t>Journal of Big Data, 6</w:t>
+      </w:r>
+      <w:r>
+        <w:t>, Article 28. https://doi.org/10.1186/s40537-019-0191-6</w:t>
+      </w:r>
+    </w:p>
+    <w:p>
+      <w:pPr>
+        <w:spacing w:after="80" w:line="276" w:lineRule="auto"/>
+        <w:ind w:left="720" w:hanging="720"/>
+        <w:jc w:val="both"/>
+        <w:rPr>
+          <w:rFonts w:asciiTheme="minorHAnsi" w:hAnsiTheme="minorHAnsi" w:cstheme="minorHAnsi"/>
+        </w:rPr>
+      </w:pPr>
+      <w:r>
         <w:lastRenderedPageBreak/>
-        <w:t>VI. Propuesta de mejoras</w:t>
-      </w:r>
-    </w:p>
-    <w:p>
-      <w:pPr>
-        <w:spacing w:after="120" w:line="276" w:lineRule="auto"/>
+        <w:t xml:space="preserve">Alotaibi, M. Z., &amp; Haq, M. A. (2024). Customer churn prediction for telecommunication companies using machine learning and ensemble methods. </w:t>
+      </w:r>
+      <w:r>
+        <w:rPr>
+          <w:i/>
+        </w:rPr>
+        <w:t>Engineering, Technology &amp; Applied Science Research, 14</w:t>
+      </w:r>
+      <w:r>
+        <w:t>(3), 14572-14578. https://doi.org/10.48084/etasr.7480</w:t>
+      </w:r>
+    </w:p>
+    <w:p>
+      <w:pPr>
+        <w:spacing w:after="80" w:line="276" w:lineRule="auto"/>
+        <w:ind w:left="720" w:hanging="720"/>
         <w:jc w:val="both"/>
         <w:rPr>
           <w:rFonts w:asciiTheme="minorHAnsi" w:hAnsiTheme="minorHAnsi" w:cstheme="minorHAnsi"/>
         </w:rPr>
       </w:pPr>
       <w:r>
-        <w:rPr>
-          <w:rFonts w:asciiTheme="minorHAnsi" w:hAnsiTheme="minorHAnsi" w:cstheme="minorHAnsi"/>
-        </w:rPr>
-        <w:t>1. V</w:t>
-      </w:r>
-      <w:r>
-        <w:rPr>
-          <w:rFonts w:asciiTheme="minorHAnsi" w:hAnsiTheme="minorHAnsi" w:cstheme="minorHAnsi"/>
-        </w:rPr>
-        <w:t xml:space="preserve">alidar con datos reales y monitorear </w:t>
-      </w:r>
+        <w:t xml:space="preserve">Arik, S. Ö., &amp; Pfister, T. (2021). TabNet: Attentive interpretable tabular learning. </w:t>
+      </w:r>
+      <w:r>
+        <w:rPr>
+          <w:i/>
+        </w:rPr>
+        <w:t>Proceedings of the AAAI Conference on Artificial Intelligence, 35</w:t>
+      </w:r>
+      <w:r>
+        <w:t>(8), 6679-6687. https://doi.org/10.1609/aaai.v35i8.16826</w:t>
+      </w:r>
+    </w:p>
+    <w:p>
+      <w:pPr>
+        <w:spacing w:after="80" w:line="276" w:lineRule="auto"/>
+        <w:ind w:left="720" w:hanging="720"/>
+        <w:jc w:val="both"/>
+        <w:rPr>
+          <w:rFonts w:asciiTheme="minorHAnsi" w:hAnsiTheme="minorHAnsi" w:cstheme="minorHAnsi"/>
+        </w:rPr>
+      </w:pPr>
       <w:proofErr w:type="spellStart"/>
       <w:r>
         <w:rPr>
           <w:rFonts w:asciiTheme="minorHAnsi" w:hAnsiTheme="minorHAnsi" w:cstheme="minorHAnsi"/>
         </w:rPr>
-        <w:t>drift</w:t>
+        <w:t>Bhattacharjee</w:t>
       </w:r>
       <w:proofErr w:type="spellEnd"/>
       <w:r>
         <w:rPr>
           <w:rFonts w:asciiTheme="minorHAnsi" w:hAnsiTheme="minorHAnsi" w:cstheme="minorHAnsi"/>
         </w:rPr>
-        <w:t xml:space="preserve">. El </w:t>
+        <w:t xml:space="preserve">, S., </w:t>
       </w:r>
       <w:proofErr w:type="spellStart"/>
       <w:r>
         <w:rPr>
           <w:rFonts w:asciiTheme="minorHAnsi" w:hAnsiTheme="minorHAnsi" w:cstheme="minorHAnsi"/>
         </w:rPr>
-        <w:t>dataset</w:t>
+        <w:t>Thukral</w:t>
       </w:r>
       <w:proofErr w:type="spellEnd"/>
       <w:r>
         <w:rPr>
           <w:rFonts w:asciiTheme="minorHAnsi" w:hAnsiTheme="minorHAnsi" w:cstheme="minorHAnsi"/>
         </w:rPr>
-        <w:t xml:space="preserve"> es sintético y puede no representar completamente una organización. Se propone validar con datos reales anonimizados y monitorear la distribución de variables, probabilidades y métricas a lo largo del tiempo.</w:t>
-      </w:r>
-    </w:p>
-    <w:p>
-      <w:pPr>
-        <w:spacing w:after="120" w:line="276" w:lineRule="auto"/>
-        <w:rPr>
-          <w:rFonts w:asciiTheme="minorHAnsi" w:hAnsiTheme="minorHAnsi" w:cstheme="minorHAnsi"/>
-        </w:rPr>
-      </w:pPr>
-      <w:r>
-        <w:rPr>
-          <w:rStyle w:val="Textoennegrita"/>
-          <w:rFonts w:asciiTheme="minorHAnsi" w:hAnsiTheme="minorHAnsi" w:cstheme="minorHAnsi"/>
-          <w:b w:val="0"/>
-          <w:bCs w:val="0"/>
-        </w:rPr>
-        <w:t xml:space="preserve">2. </w:t>
-      </w:r>
-      <w:r>
-        <w:rPr>
-          <w:rStyle w:val="Textoennegrita"/>
-          <w:rFonts w:asciiTheme="minorHAnsi" w:hAnsiTheme="minorHAnsi" w:cstheme="minorHAnsi"/>
-          <w:b w:val="0"/>
-          <w:bCs w:val="0"/>
-        </w:rPr>
-        <w:t>Calibrar probabilidades y definir umbrales mediante costos reales.</w:t>
-      </w:r>
-      <w:r>
-        <w:rPr>
-          <w:rFonts w:asciiTheme="minorHAnsi" w:hAnsiTheme="minorHAnsi" w:cstheme="minorHAnsi"/>
-        </w:rPr>
-        <w:t xml:space="preserve"> La precisión de 0,234 evidencia una cantidad importante de falsos positivos. Como mejora futura, se propone calibrar las probabilidades con un conjunto independiente y seleccionar el umbral considerando el costo de intervenir innecesariamente frente al costo de no detectar un abandono.</w:t>
-      </w:r>
-    </w:p>
-    <w:p>
-      <w:pPr>
-        <w:spacing w:after="120" w:line="276" w:lineRule="auto"/>
+        <w:t xml:space="preserve">, U., &amp; </w:t>
+      </w:r>
+      <w:proofErr w:type="spellStart"/>
+      <w:r>
+        <w:rPr>
+          <w:rFonts w:asciiTheme="minorHAnsi" w:hAnsiTheme="minorHAnsi" w:cstheme="minorHAnsi"/>
+        </w:rPr>
+        <w:t>Patil</w:t>
+      </w:r>
+      <w:proofErr w:type="spellEnd"/>
+      <w:r>
+        <w:rPr>
+          <w:rFonts w:asciiTheme="minorHAnsi" w:hAnsiTheme="minorHAnsi" w:cstheme="minorHAnsi"/>
+        </w:rPr>
+        <w:t xml:space="preserve">, N. (2023). </w:t>
+      </w:r>
+      <w:proofErr w:type="spellStart"/>
+      <w:r>
+        <w:rPr>
+          <w:rFonts w:asciiTheme="minorHAnsi" w:hAnsiTheme="minorHAnsi" w:cstheme="minorHAnsi"/>
+        </w:rPr>
+        <w:t>Early</w:t>
+      </w:r>
+      <w:proofErr w:type="spellEnd"/>
+      <w:r>
+        <w:rPr>
+          <w:rFonts w:asciiTheme="minorHAnsi" w:hAnsiTheme="minorHAnsi" w:cstheme="minorHAnsi"/>
+        </w:rPr>
+        <w:t xml:space="preserve"> </w:t>
+      </w:r>
+      <w:proofErr w:type="spellStart"/>
+      <w:r>
+        <w:rPr>
+          <w:rFonts w:asciiTheme="minorHAnsi" w:hAnsiTheme="minorHAnsi" w:cstheme="minorHAnsi"/>
+        </w:rPr>
+        <w:t>churn</w:t>
+      </w:r>
+      <w:proofErr w:type="spellEnd"/>
+      <w:r>
+        <w:rPr>
+          <w:rFonts w:asciiTheme="minorHAnsi" w:hAnsiTheme="minorHAnsi" w:cstheme="minorHAnsi"/>
+        </w:rPr>
+        <w:t xml:space="preserve"> </w:t>
+      </w:r>
+      <w:proofErr w:type="spellStart"/>
+      <w:r>
+        <w:rPr>
+          <w:rFonts w:asciiTheme="minorHAnsi" w:hAnsiTheme="minorHAnsi" w:cstheme="minorHAnsi"/>
+        </w:rPr>
+        <w:t>prediction</w:t>
+      </w:r>
+      <w:proofErr w:type="spellEnd"/>
+      <w:r>
+        <w:rPr>
+          <w:rFonts w:asciiTheme="minorHAnsi" w:hAnsiTheme="minorHAnsi" w:cstheme="minorHAnsi"/>
+        </w:rPr>
+        <w:t xml:space="preserve"> </w:t>
+      </w:r>
+      <w:proofErr w:type="spellStart"/>
+      <w:r>
+        <w:rPr>
+          <w:rFonts w:asciiTheme="minorHAnsi" w:hAnsiTheme="minorHAnsi" w:cstheme="minorHAnsi"/>
+        </w:rPr>
+        <w:t>from</w:t>
+      </w:r>
+      <w:proofErr w:type="spellEnd"/>
+      <w:r>
+        <w:rPr>
+          <w:rFonts w:asciiTheme="minorHAnsi" w:hAnsiTheme="minorHAnsi" w:cstheme="minorHAnsi"/>
+        </w:rPr>
+        <w:t xml:space="preserve"> </w:t>
+      </w:r>
+      <w:proofErr w:type="spellStart"/>
+      <w:r>
+        <w:rPr>
+          <w:rFonts w:asciiTheme="minorHAnsi" w:hAnsiTheme="minorHAnsi" w:cstheme="minorHAnsi"/>
+        </w:rPr>
+        <w:t>large</w:t>
+      </w:r>
+      <w:proofErr w:type="spellEnd"/>
+      <w:r>
+        <w:rPr>
+          <w:rFonts w:asciiTheme="minorHAnsi" w:hAnsiTheme="minorHAnsi" w:cstheme="minorHAnsi"/>
+        </w:rPr>
+        <w:t xml:space="preserve"> </w:t>
+      </w:r>
+      <w:proofErr w:type="spellStart"/>
+      <w:r>
+        <w:rPr>
+          <w:rFonts w:asciiTheme="minorHAnsi" w:hAnsiTheme="minorHAnsi" w:cstheme="minorHAnsi"/>
+        </w:rPr>
+        <w:t>scale</w:t>
+      </w:r>
+      <w:proofErr w:type="spellEnd"/>
+      <w:r>
+        <w:rPr>
+          <w:rFonts w:asciiTheme="minorHAnsi" w:hAnsiTheme="minorHAnsi" w:cstheme="minorHAnsi"/>
+        </w:rPr>
+        <w:t xml:space="preserve"> </w:t>
+      </w:r>
+      <w:proofErr w:type="spellStart"/>
+      <w:r>
+        <w:rPr>
+          <w:rFonts w:asciiTheme="minorHAnsi" w:hAnsiTheme="minorHAnsi" w:cstheme="minorHAnsi"/>
+        </w:rPr>
+        <w:t>user-product</w:t>
+      </w:r>
+      <w:proofErr w:type="spellEnd"/>
+      <w:r>
+        <w:rPr>
+          <w:rFonts w:asciiTheme="minorHAnsi" w:hAnsiTheme="minorHAnsi" w:cstheme="minorHAnsi"/>
+        </w:rPr>
+        <w:t xml:space="preserve"> </w:t>
+      </w:r>
+      <w:proofErr w:type="spellStart"/>
+      <w:r>
+        <w:rPr>
+          <w:rFonts w:asciiTheme="minorHAnsi" w:hAnsiTheme="minorHAnsi" w:cstheme="minorHAnsi"/>
+        </w:rPr>
+        <w:t>interaction</w:t>
+      </w:r>
+      <w:proofErr w:type="spellEnd"/>
+      <w:r>
+        <w:rPr>
+          <w:rFonts w:asciiTheme="minorHAnsi" w:hAnsiTheme="minorHAnsi" w:cstheme="minorHAnsi"/>
+        </w:rPr>
+        <w:t xml:space="preserve"> time series. </w:t>
+      </w:r>
+      <w:proofErr w:type="spellStart"/>
+      <w:r>
+        <w:rPr>
+          <w:rFonts w:asciiTheme="minorHAnsi" w:hAnsiTheme="minorHAnsi" w:cstheme="minorHAnsi"/>
+        </w:rPr>
+        <w:t>arXiv</w:t>
+      </w:r>
+      <w:proofErr w:type="spellEnd"/>
+      <w:r>
+        <w:rPr>
+          <w:rFonts w:asciiTheme="minorHAnsi" w:hAnsiTheme="minorHAnsi" w:cstheme="minorHAnsi"/>
+        </w:rPr>
+        <w:t>. https://arxiv.org/abs/2309.14390</w:t>
+      </w:r>
+    </w:p>
+    <w:p>
+      <w:pPr>
+        <w:spacing w:after="80" w:line="276" w:lineRule="auto"/>
+        <w:ind w:left="720" w:hanging="720"/>
         <w:jc w:val="both"/>
         <w:rPr>
           <w:rFonts w:asciiTheme="minorHAnsi" w:hAnsiTheme="minorHAnsi" w:cstheme="minorHAnsi"/>
         </w:rPr>
       </w:pPr>
       <w:r>
-        <w:rPr>
-          <w:rFonts w:asciiTheme="minorHAnsi" w:hAnsiTheme="minorHAnsi" w:cstheme="minorHAnsi"/>
-        </w:rPr>
-        <w:t>3. Esquema de entrada configurable para otros negocios. El esquema de las 30 variables de entrada (backend/schema.py) está codificado específicamente para este dataset; adaptar el sistema a otra empresa u otro plan de suscripción hoy requeriría modificar el código. Como mejora futura, se propone externalizar el esquema (variables, rangos, categorías válidas) a un archivo de configuración por cliente, para que la aplicación pueda reutilizarse en otro rubro sin reescribir el backend.</w:t>
-      </w:r>
-    </w:p>
-    <w:p>
-      <w:pPr>
-        <w:spacing w:after="120" w:line="276" w:lineRule="auto"/>
+        <w:t xml:space="preserve">Borisov, V., Leemann, T., Seßler, K., Haug, J., Pawelczyk, M., &amp; Kasneci, G. (2024). Deep neural networks and tabular data: A survey. </w:t>
+      </w:r>
+      <w:r>
+        <w:rPr>
+          <w:i/>
+        </w:rPr>
+        <w:t>IEEE Transactions on Neural Networks and Learning Systems, 35</w:t>
+      </w:r>
+      <w:r>
+        <w:t>(6), 7499-7519. https://doi.org/10.1109/TNNLS.2022.3229161</w:t>
+      </w:r>
+    </w:p>
+    <w:p>
+      <w:pPr>
+        <w:spacing w:after="80" w:line="276" w:lineRule="auto"/>
+        <w:ind w:left="720" w:hanging="720"/>
         <w:jc w:val="both"/>
         <w:rPr>
           <w:rFonts w:asciiTheme="minorHAnsi" w:hAnsiTheme="minorHAnsi" w:cstheme="minorHAnsi"/>
         </w:rPr>
       </w:pPr>
       <w:r>
-        <w:rPr>
-          <w:rFonts w:asciiTheme="minorHAnsi" w:hAnsiTheme="minorHAnsi" w:cstheme="minorHAnsi"/>
-        </w:rPr>
-        <w:t>4. Predicción por lotes y vista de cartera priorizada. El prototipo actual predice un cliente a la vez (formulario o ficha individual). Como mejora futura, se propone permitir cargar un archivo CSV con varios clientes y mostrar una vista de cartera que los ordene por nivel de riesgo, para apoyar la priorización cuando el equipo de retención necesita revisar muchos casos a la vez, no solo uno.</w:t>
-      </w:r>
-    </w:p>
-    <w:p>
-      <w:pPr>
-        <w:spacing w:after="120" w:line="276" w:lineRule="auto"/>
+        <w:t xml:space="preserve">Breiman, L. (2001). Random forests. </w:t>
+      </w:r>
+      <w:r>
+        <w:rPr>
+          <w:i/>
+        </w:rPr>
+        <w:t>Machine Learning, 45</w:t>
+      </w:r>
+      <w:r>
+        <w:t>(1), 5-32. https://doi.org/10.1023/A:1010933404324</w:t>
+      </w:r>
+    </w:p>
+    <w:p>
+      <w:pPr>
+        <w:spacing w:after="80" w:line="276" w:lineRule="auto"/>
+        <w:ind w:left="720" w:hanging="720"/>
         <w:jc w:val="both"/>
         <w:rPr>
           <w:rFonts w:asciiTheme="minorHAnsi" w:hAnsiTheme="minorHAnsi" w:cstheme="minorHAnsi"/>
         </w:rPr>
       </w:pPr>
       <w:r>
-        <w:rPr>
-          <w:rFonts w:asciiTheme="minorHAnsi" w:hAnsiTheme="minorHAnsi" w:cstheme="minorHAnsi"/>
-        </w:rPr>
-        <w:t>5. Medir el impacto real de las acciones de retención. El sistema entrega una probabilidad y una explicación, pero no sabe si las acciones que el equipo de retención decide tomar a partir de esa información efectivamente reducen el abandono. Como mejora futura, y conectando con datos históricos reales de un CRM, se propone registrar qué clientes recibieron una intervención de retención y comparar su tasa de abandono real contra la de clientes similares que no la recibieron, para evaluar si la intervención marca una diferencia y reentrenar el modelo incorporando ese resultado.</w:t>
-      </w:r>
-    </w:p>
-    <w:p>
-      <w:pPr>
-        <w:spacing w:after="120" w:line="276" w:lineRule="auto"/>
+        <w:t xml:space="preserve">Burez, J., &amp; Van den Poel, D. (2009). Handling class imbalance in customer churn prediction. </w:t>
+      </w:r>
+      <w:r>
+        <w:rPr>
+          <w:i/>
+        </w:rPr>
+        <w:t>Expert Systems with Applications, 36</w:t>
+      </w:r>
+      <w:r>
+        <w:t>(3), 4626-4636. https://doi.org/10.1016/j.eswa.2008.05.027</w:t>
+      </w:r>
+    </w:p>
+    <w:p>
+      <w:pPr>
+        <w:spacing w:after="80" w:line="276" w:lineRule="auto"/>
+        <w:ind w:left="720" w:hanging="720"/>
         <w:jc w:val="both"/>
         <w:rPr>
           <w:rFonts w:asciiTheme="minorHAnsi" w:hAnsiTheme="minorHAnsi" w:cstheme="minorHAnsi"/>
         </w:rPr>
       </w:pPr>
-    </w:p>
-    <w:p>
-      <w:pPr>
-        <w:widowControl/>
-        <w:autoSpaceDE/>
-        <w:autoSpaceDN/>
-        <w:spacing w:before="100" w:beforeAutospacing="1" w:after="100" w:afterAutospacing="1" w:line="276" w:lineRule="auto"/>
+      <w:r>
+        <w:t xml:space="preserve">Chawla, N. V., Bowyer, K. W., Hall, L. O., &amp; Kegelmeyer, W. P. (2002). SMOTE: Synthetic minority over-sampling technique. </w:t>
+      </w:r>
+      <w:r>
+        <w:rPr>
+          <w:i/>
+        </w:rPr>
+        <w:t>Journal of Artificial Intelligence Research, 16</w:t>
+      </w:r>
+      <w:r>
+        <w:t>, 321-357. https://doi.org/10.1613/jair.953</w:t>
+      </w:r>
+    </w:p>
+    <w:p>
+      <w:pPr>
+        <w:spacing w:after="80" w:line="276" w:lineRule="auto"/>
+        <w:ind w:left="720" w:hanging="720"/>
         <w:jc w:val="both"/>
-        <w:outlineLvl w:val="1"/>
-        <w:rPr>
-          <w:rFonts w:asciiTheme="minorHAnsi" w:eastAsia="Times New Roman" w:hAnsiTheme="minorHAnsi" w:cstheme="minorHAnsi"/>
-          <w:b/>
-          <w:bCs/>
-          <w:sz w:val="28"/>
-          <w:szCs w:val="44"/>
-          <w:lang w:val="es-419" w:eastAsia="es-419"/>
-        </w:rPr>
-      </w:pPr>
-      <w:r>
-        <w:rPr>
-          <w:rFonts w:asciiTheme="minorHAnsi" w:eastAsia="Times New Roman" w:hAnsiTheme="minorHAnsi" w:cstheme="minorHAnsi"/>
-          <w:b/>
-          <w:bCs/>
-          <w:sz w:val="28"/>
-          <w:szCs w:val="44"/>
-          <w:lang w:val="es-419" w:eastAsia="es-419"/>
-        </w:rPr>
-        <w:t>VII. Código fuente en GitHub</w:t>
-      </w:r>
-    </w:p>
-    <w:p>
-      <w:pPr>
-        <w:spacing w:after="120" w:line="276" w:lineRule="auto"/>
+        <w:rPr>
+          <w:rFonts w:asciiTheme="minorHAnsi" w:hAnsiTheme="minorHAnsi" w:cstheme="minorHAnsi"/>
+        </w:rPr>
+      </w:pPr>
+      <w:r>
+        <w:t xml:space="preserve">Chen, T., &amp; Guestrin, C. (2016). XGBoost: A scalable tree boosting system. In </w:t>
+      </w:r>
+      <w:r>
+        <w:rPr>
+          <w:i/>
+        </w:rPr>
+        <w:t>Proceedings of the 22nd ACM SIGKDD International Conference on Knowledge Discovery and Data Mining</w:t>
+      </w:r>
+      <w:r>
+        <w:t xml:space="preserve"> (pp. 785-794). Association for Computing Machinery. https://doi.org/10.1145/2939672.2939785</w:t>
+      </w:r>
+    </w:p>
+    <w:p>
+      <w:pPr>
+        <w:spacing w:after="80" w:line="276" w:lineRule="auto"/>
+        <w:ind w:left="720" w:hanging="720"/>
         <w:jc w:val="both"/>
-        <w:rPr>
-          <w:rFonts w:asciiTheme="minorHAnsi" w:hAnsiTheme="minorHAnsi" w:cstheme="minorHAnsi"/>
-        </w:rPr>
-      </w:pPr>
-      <w:r>
-        <w:rPr>
-          <w:rFonts w:asciiTheme="minorHAnsi" w:hAnsiTheme="minorHAnsi" w:cstheme="minorHAnsi"/>
-        </w:rPr>
-        <w:t>El código, los notebooks, los artefactos, los modelos, las figuras y los informes se mantienen en el siguiente repositorio público:</w:t>
-      </w:r>
-    </w:p>
-    <w:p>
-      <w:pPr>
-        <w:spacing w:after="120" w:line="276" w:lineRule="auto"/>
-        <w:jc w:val="both"/>
-        <w:rPr>
-          <w:rFonts w:asciiTheme="minorHAnsi" w:hAnsiTheme="minorHAnsi" w:cstheme="minorHAnsi"/>
-        </w:rPr>
-      </w:pPr>
-      <w:hyperlink r:id="rId52">
+      </w:pPr>
+      <w:proofErr w:type="spellStart"/>
+      <w:r>
+        <w:t>Gorishniy</w:t>
+      </w:r>
+      <w:proofErr w:type="spellEnd"/>
+      <w:r>
+        <w:t xml:space="preserve">, Y., </w:t>
+      </w:r>
+      <w:proofErr w:type="spellStart"/>
+      <w:r>
+        <w:t>Rubachev</w:t>
+      </w:r>
+      <w:proofErr w:type="spellEnd"/>
+      <w:r>
+        <w:t xml:space="preserve">, I., </w:t>
+      </w:r>
+      <w:proofErr w:type="spellStart"/>
+      <w:r>
+        <w:t>Khrulkov</w:t>
+      </w:r>
+      <w:proofErr w:type="spellEnd"/>
+      <w:r>
+        <w:t xml:space="preserve">, V., &amp; </w:t>
+      </w:r>
+      <w:proofErr w:type="spellStart"/>
+      <w:r>
+        <w:t>Babenko</w:t>
+      </w:r>
+      <w:proofErr w:type="spellEnd"/>
+      <w:r>
+        <w:t xml:space="preserve">, A. (2021). </w:t>
+      </w:r>
+      <w:proofErr w:type="spellStart"/>
+      <w:r>
+        <w:t>Revisiting</w:t>
+      </w:r>
+      <w:proofErr w:type="spellEnd"/>
+      <w:r>
+        <w:t xml:space="preserve"> </w:t>
+      </w:r>
+      <w:proofErr w:type="spellStart"/>
+      <w:r>
+        <w:t>deep</w:t>
+      </w:r>
+      <w:proofErr w:type="spellEnd"/>
+      <w:r>
+        <w:t xml:space="preserve"> </w:t>
+      </w:r>
+      <w:proofErr w:type="spellStart"/>
+      <w:r>
+        <w:t>learning</w:t>
+      </w:r>
+      <w:proofErr w:type="spellEnd"/>
+      <w:r>
+        <w:t xml:space="preserve"> </w:t>
+      </w:r>
+      <w:proofErr w:type="spellStart"/>
+      <w:r>
+        <w:t>models</w:t>
+      </w:r>
+      <w:proofErr w:type="spellEnd"/>
+      <w:r>
+        <w:t xml:space="preserve"> </w:t>
+      </w:r>
+      <w:proofErr w:type="spellStart"/>
+      <w:r>
+        <w:t>for</w:t>
+      </w:r>
+      <w:proofErr w:type="spellEnd"/>
+      <w:r>
+        <w:t xml:space="preserve"> tabular data. </w:t>
+      </w:r>
+      <w:proofErr w:type="spellStart"/>
+      <w:r>
+        <w:t>Advances</w:t>
+      </w:r>
+      <w:proofErr w:type="spellEnd"/>
+      <w:r>
+        <w:t xml:space="preserve"> in Neural </w:t>
+      </w:r>
+      <w:proofErr w:type="spellStart"/>
+      <w:r>
+        <w:t>Information</w:t>
+      </w:r>
+      <w:proofErr w:type="spellEnd"/>
+      <w:r>
+        <w:t xml:space="preserve"> Processing </w:t>
+      </w:r>
+      <w:proofErr w:type="spellStart"/>
+      <w:r>
+        <w:t>Systems</w:t>
+      </w:r>
+      <w:proofErr w:type="spellEnd"/>
+      <w:r>
+        <w:t xml:space="preserve">, 34, 18932–18943. </w:t>
+      </w:r>
+      <w:hyperlink r:id="rId53" w:history="1">
         <w:r>
           <w:rPr>
+            <w:rStyle w:val="Hipervnculo"/>
+            <w:color w:val="auto"/>
+            <w:u w:val="none"/>
+          </w:rPr>
+          <w:t>https://proceedings.neurips.cc/paper/2021/hash/9d86d83f925f2149e9edb0ac3b49229c-Abstract.html</w:t>
+        </w:r>
+      </w:hyperlink>
+    </w:p>
+    <w:p>
+      <w:pPr>
+        <w:spacing w:after="80" w:line="276" w:lineRule="auto"/>
+        <w:ind w:left="720" w:hanging="720"/>
+        <w:jc w:val="both"/>
+        <w:rPr>
+          <w:rFonts w:asciiTheme="minorHAnsi" w:hAnsiTheme="minorHAnsi" w:cstheme="minorHAnsi"/>
+        </w:rPr>
+      </w:pPr>
+      <w:r>
+        <w:t xml:space="preserve">He, H., &amp; Garcia, E. A. (2009). Learning from imbalanced data. </w:t>
+      </w:r>
+      <w:r>
+        <w:rPr>
+          <w:i/>
+        </w:rPr>
+        <w:t>IEEE Transactions on Knowledge and Data Engineering, 21</w:t>
+      </w:r>
+      <w:r>
+        <w:t>(9), 1263-1284. https://doi.org/10.1109/TKDE.2008.239</w:t>
+      </w:r>
+    </w:p>
+    <w:p>
+      <w:pPr>
+        <w:spacing w:after="80" w:line="276" w:lineRule="auto"/>
+        <w:ind w:left="720" w:hanging="720"/>
+        <w:jc w:val="both"/>
+        <w:rPr>
+          <w:rFonts w:asciiTheme="minorHAnsi" w:hAnsiTheme="minorHAnsi" w:cstheme="minorHAnsi"/>
+        </w:rPr>
+      </w:pPr>
+      <w:r>
+        <w:t xml:space="preserve">Imani, M., Abdolrazzagh-Nezhad, M., &amp; Boushehri, A. (2025). Customer churn prediction: A systematic review of machine learning and deep learning approaches. </w:t>
+      </w:r>
+      <w:r>
+        <w:rPr>
+          <w:i/>
+        </w:rPr>
+        <w:t>Machine Learning and Knowledge Extraction, 7</w:t>
+      </w:r>
+      <w:r>
+        <w:t>(3), 105. https://doi.org/10.3390/make7030105</w:t>
+      </w:r>
+    </w:p>
+    <w:p>
+      <w:pPr>
+        <w:spacing w:after="80" w:line="276" w:lineRule="auto"/>
+        <w:ind w:left="720" w:hanging="720"/>
+        <w:jc w:val="both"/>
+        <w:rPr>
+          <w:rFonts w:asciiTheme="minorHAnsi" w:hAnsiTheme="minorHAnsi" w:cstheme="minorHAnsi"/>
+        </w:rPr>
+      </w:pPr>
+      <w:proofErr w:type="spellStart"/>
+      <w:r>
+        <w:rPr>
+          <w:rFonts w:asciiTheme="minorHAnsi" w:hAnsiTheme="minorHAnsi" w:cstheme="minorHAnsi"/>
+        </w:rPr>
+        <w:t>Maan</w:t>
+      </w:r>
+      <w:proofErr w:type="spellEnd"/>
+      <w:r>
+        <w:rPr>
+          <w:rFonts w:asciiTheme="minorHAnsi" w:hAnsiTheme="minorHAnsi" w:cstheme="minorHAnsi"/>
+        </w:rPr>
+        <w:t xml:space="preserve">, J., &amp; </w:t>
+      </w:r>
+      <w:proofErr w:type="spellStart"/>
+      <w:r>
+        <w:rPr>
+          <w:rFonts w:asciiTheme="minorHAnsi" w:hAnsiTheme="minorHAnsi" w:cstheme="minorHAnsi"/>
+        </w:rPr>
+        <w:t>Maan</w:t>
+      </w:r>
+      <w:proofErr w:type="spellEnd"/>
+      <w:r>
+        <w:rPr>
+          <w:rFonts w:asciiTheme="minorHAnsi" w:hAnsiTheme="minorHAnsi" w:cstheme="minorHAnsi"/>
+        </w:rPr>
+        <w:t xml:space="preserve">, H. (2023). </w:t>
+      </w:r>
+      <w:proofErr w:type="spellStart"/>
+      <w:r>
+        <w:rPr>
+          <w:rFonts w:asciiTheme="minorHAnsi" w:hAnsiTheme="minorHAnsi" w:cstheme="minorHAnsi"/>
+        </w:rPr>
+        <w:t>Customer</w:t>
+      </w:r>
+      <w:proofErr w:type="spellEnd"/>
+      <w:r>
+        <w:rPr>
+          <w:rFonts w:asciiTheme="minorHAnsi" w:hAnsiTheme="minorHAnsi" w:cstheme="minorHAnsi"/>
+        </w:rPr>
+        <w:t xml:space="preserve"> </w:t>
+      </w:r>
+      <w:proofErr w:type="spellStart"/>
+      <w:r>
+        <w:rPr>
+          <w:rFonts w:asciiTheme="minorHAnsi" w:hAnsiTheme="minorHAnsi" w:cstheme="minorHAnsi"/>
+        </w:rPr>
+        <w:t>churn</w:t>
+      </w:r>
+      <w:proofErr w:type="spellEnd"/>
+      <w:r>
+        <w:rPr>
+          <w:rFonts w:asciiTheme="minorHAnsi" w:hAnsiTheme="minorHAnsi" w:cstheme="minorHAnsi"/>
+        </w:rPr>
+        <w:t xml:space="preserve"> </w:t>
+      </w:r>
+      <w:proofErr w:type="spellStart"/>
+      <w:r>
+        <w:rPr>
+          <w:rFonts w:asciiTheme="minorHAnsi" w:hAnsiTheme="minorHAnsi" w:cstheme="minorHAnsi"/>
+        </w:rPr>
+        <w:t>prediction</w:t>
+      </w:r>
+      <w:proofErr w:type="spellEnd"/>
+      <w:r>
+        <w:rPr>
+          <w:rFonts w:asciiTheme="minorHAnsi" w:hAnsiTheme="minorHAnsi" w:cstheme="minorHAnsi"/>
+        </w:rPr>
+        <w:t xml:space="preserve"> </w:t>
+      </w:r>
+      <w:proofErr w:type="spellStart"/>
+      <w:r>
+        <w:rPr>
+          <w:rFonts w:asciiTheme="minorHAnsi" w:hAnsiTheme="minorHAnsi" w:cstheme="minorHAnsi"/>
+        </w:rPr>
+        <w:t>model</w:t>
+      </w:r>
+      <w:proofErr w:type="spellEnd"/>
+      <w:r>
+        <w:rPr>
+          <w:rFonts w:asciiTheme="minorHAnsi" w:hAnsiTheme="minorHAnsi" w:cstheme="minorHAnsi"/>
+        </w:rPr>
+        <w:t xml:space="preserve"> </w:t>
+      </w:r>
+      <w:proofErr w:type="spellStart"/>
+      <w:r>
+        <w:rPr>
+          <w:rFonts w:asciiTheme="minorHAnsi" w:hAnsiTheme="minorHAnsi" w:cstheme="minorHAnsi"/>
+        </w:rPr>
+        <w:t>using</w:t>
+      </w:r>
+      <w:proofErr w:type="spellEnd"/>
+      <w:r>
+        <w:rPr>
+          <w:rFonts w:asciiTheme="minorHAnsi" w:hAnsiTheme="minorHAnsi" w:cstheme="minorHAnsi"/>
+        </w:rPr>
+        <w:t xml:space="preserve"> </w:t>
+      </w:r>
+      <w:proofErr w:type="spellStart"/>
+      <w:r>
+        <w:rPr>
+          <w:rFonts w:asciiTheme="minorHAnsi" w:hAnsiTheme="minorHAnsi" w:cstheme="minorHAnsi"/>
+        </w:rPr>
+        <w:t>explainable</w:t>
+      </w:r>
+      <w:proofErr w:type="spellEnd"/>
+      <w:r>
+        <w:rPr>
+          <w:rFonts w:asciiTheme="minorHAnsi" w:hAnsiTheme="minorHAnsi" w:cstheme="minorHAnsi"/>
+        </w:rPr>
+        <w:t xml:space="preserve"> machine </w:t>
+      </w:r>
+      <w:proofErr w:type="spellStart"/>
+      <w:r>
+        <w:rPr>
+          <w:rFonts w:asciiTheme="minorHAnsi" w:hAnsiTheme="minorHAnsi" w:cstheme="minorHAnsi"/>
+        </w:rPr>
+        <w:t>learning</w:t>
+      </w:r>
+      <w:proofErr w:type="spellEnd"/>
+      <w:r>
+        <w:rPr>
+          <w:rFonts w:asciiTheme="minorHAnsi" w:hAnsiTheme="minorHAnsi" w:cstheme="minorHAnsi"/>
+        </w:rPr>
+        <w:t xml:space="preserve">. </w:t>
+      </w:r>
+      <w:proofErr w:type="spellStart"/>
+      <w:r>
+        <w:rPr>
+          <w:rFonts w:asciiTheme="minorHAnsi" w:hAnsiTheme="minorHAnsi" w:cstheme="minorHAnsi"/>
+        </w:rPr>
+        <w:t>arXiv</w:t>
+      </w:r>
+      <w:proofErr w:type="spellEnd"/>
+      <w:r>
+        <w:rPr>
+          <w:rFonts w:asciiTheme="minorHAnsi" w:hAnsiTheme="minorHAnsi" w:cstheme="minorHAnsi"/>
+        </w:rPr>
+        <w:t>. https://arxiv.org/abs/2303.00960</w:t>
+      </w:r>
+    </w:p>
+    <w:p>
+      <w:pPr>
+        <w:spacing w:after="80" w:line="276" w:lineRule="auto"/>
+        <w:ind w:left="720" w:hanging="720"/>
+        <w:jc w:val="both"/>
+        <w:rPr>
+          <w:rFonts w:asciiTheme="minorHAnsi" w:hAnsiTheme="minorHAnsi" w:cstheme="minorHAnsi"/>
+        </w:rPr>
+      </w:pPr>
+      <w:proofErr w:type="spellStart"/>
+      <w:r>
+        <w:rPr>
+          <w:rFonts w:asciiTheme="minorHAnsi" w:hAnsiTheme="minorHAnsi" w:cstheme="minorHAnsi"/>
+        </w:rPr>
+        <w:t>Miah</w:t>
+      </w:r>
+      <w:proofErr w:type="spellEnd"/>
+      <w:r>
+        <w:rPr>
+          <w:rFonts w:asciiTheme="minorHAnsi" w:hAnsiTheme="minorHAnsi" w:cstheme="minorHAnsi"/>
+        </w:rPr>
+        <w:t xml:space="preserve">, A. (2025). </w:t>
+      </w:r>
+      <w:proofErr w:type="spellStart"/>
+      <w:r>
+        <w:rPr>
+          <w:rFonts w:asciiTheme="minorHAnsi" w:hAnsiTheme="minorHAnsi" w:cstheme="minorHAnsi"/>
+        </w:rPr>
+        <w:t>Customer</w:t>
+      </w:r>
+      <w:proofErr w:type="spellEnd"/>
+      <w:r>
+        <w:rPr>
+          <w:rFonts w:asciiTheme="minorHAnsi" w:hAnsiTheme="minorHAnsi" w:cstheme="minorHAnsi"/>
+        </w:rPr>
+        <w:t xml:space="preserve"> </w:t>
+      </w:r>
+      <w:proofErr w:type="spellStart"/>
+      <w:r>
+        <w:rPr>
+          <w:rFonts w:asciiTheme="minorHAnsi" w:hAnsiTheme="minorHAnsi" w:cstheme="minorHAnsi"/>
+        </w:rPr>
+        <w:t>churn</w:t>
+      </w:r>
+      <w:proofErr w:type="spellEnd"/>
+      <w:r>
+        <w:rPr>
+          <w:rFonts w:asciiTheme="minorHAnsi" w:hAnsiTheme="minorHAnsi" w:cstheme="minorHAnsi"/>
+        </w:rPr>
+        <w:t xml:space="preserve"> </w:t>
+      </w:r>
+      <w:proofErr w:type="spellStart"/>
+      <w:r>
+        <w:rPr>
+          <w:rFonts w:asciiTheme="minorHAnsi" w:hAnsiTheme="minorHAnsi" w:cstheme="minorHAnsi"/>
+        </w:rPr>
+        <w:t>prediction</w:t>
+      </w:r>
+      <w:proofErr w:type="spellEnd"/>
+      <w:r>
+        <w:rPr>
+          <w:rFonts w:asciiTheme="minorHAnsi" w:hAnsiTheme="minorHAnsi" w:cstheme="minorHAnsi"/>
+        </w:rPr>
+        <w:t xml:space="preserve"> </w:t>
+      </w:r>
+      <w:proofErr w:type="spellStart"/>
+      <w:r>
+        <w:rPr>
+          <w:rFonts w:asciiTheme="minorHAnsi" w:hAnsiTheme="minorHAnsi" w:cstheme="minorHAnsi"/>
+        </w:rPr>
+        <w:t>business</w:t>
+      </w:r>
+      <w:proofErr w:type="spellEnd"/>
+      <w:r>
+        <w:rPr>
+          <w:rFonts w:asciiTheme="minorHAnsi" w:hAnsiTheme="minorHAnsi" w:cstheme="minorHAnsi"/>
+        </w:rPr>
+        <w:t xml:space="preserve"> </w:t>
+      </w:r>
+      <w:proofErr w:type="spellStart"/>
+      <w:r>
+        <w:rPr>
+          <w:rFonts w:asciiTheme="minorHAnsi" w:hAnsiTheme="minorHAnsi" w:cstheme="minorHAnsi"/>
+        </w:rPr>
+        <w:t>dataset</w:t>
+      </w:r>
+      <w:proofErr w:type="spellEnd"/>
+      <w:r>
+        <w:rPr>
+          <w:rFonts w:asciiTheme="minorHAnsi" w:hAnsiTheme="minorHAnsi" w:cstheme="minorHAnsi"/>
+        </w:rPr>
+        <w:t xml:space="preserve"> [Data set]. </w:t>
+      </w:r>
+      <w:proofErr w:type="spellStart"/>
+      <w:r>
+        <w:rPr>
+          <w:rFonts w:asciiTheme="minorHAnsi" w:hAnsiTheme="minorHAnsi" w:cstheme="minorHAnsi"/>
+        </w:rPr>
+        <w:t>Kaggle</w:t>
+      </w:r>
+      <w:proofErr w:type="spellEnd"/>
+      <w:r>
+        <w:rPr>
+          <w:rFonts w:asciiTheme="minorHAnsi" w:hAnsiTheme="minorHAnsi" w:cstheme="minorHAnsi"/>
+        </w:rPr>
+        <w:t>. https://www.kaggle.com/datasets/miadul/customer-churn-prediction-business-dataset</w:t>
+      </w:r>
+    </w:p>
+    <w:p>
+      <w:pPr>
+        <w:spacing w:after="80" w:line="276" w:lineRule="auto"/>
+        <w:ind w:left="720" w:hanging="720"/>
+        <w:jc w:val="both"/>
+        <w:rPr>
+          <w:rFonts w:asciiTheme="minorHAnsi" w:hAnsiTheme="minorHAnsi" w:cstheme="minorHAnsi"/>
+        </w:rPr>
+      </w:pPr>
+      <w:proofErr w:type="spellStart"/>
+      <w:r>
+        <w:rPr>
+          <w:rFonts w:asciiTheme="minorHAnsi" w:hAnsiTheme="minorHAnsi" w:cstheme="minorHAnsi"/>
+        </w:rPr>
+        <w:t>Nogare</w:t>
+      </w:r>
+      <w:proofErr w:type="spellEnd"/>
+      <w:r>
+        <w:rPr>
+          <w:rFonts w:asciiTheme="minorHAnsi" w:hAnsiTheme="minorHAnsi" w:cstheme="minorHAnsi"/>
+        </w:rPr>
+        <w:t xml:space="preserve">, D., &amp; Silveira, I. F. (2024). </w:t>
+      </w:r>
+      <w:proofErr w:type="spellStart"/>
+      <w:r>
+        <w:rPr>
+          <w:rFonts w:asciiTheme="minorHAnsi" w:hAnsiTheme="minorHAnsi" w:cstheme="minorHAnsi"/>
+        </w:rPr>
+        <w:t>Experimentation</w:t>
+      </w:r>
+      <w:proofErr w:type="spellEnd"/>
+      <w:r>
+        <w:rPr>
+          <w:rFonts w:asciiTheme="minorHAnsi" w:hAnsiTheme="minorHAnsi" w:cstheme="minorHAnsi"/>
+        </w:rPr>
+        <w:t xml:space="preserve">, </w:t>
+      </w:r>
+      <w:proofErr w:type="spellStart"/>
+      <w:r>
+        <w:rPr>
+          <w:rFonts w:asciiTheme="minorHAnsi" w:hAnsiTheme="minorHAnsi" w:cstheme="minorHAnsi"/>
+        </w:rPr>
+        <w:t>deployment</w:t>
+      </w:r>
+      <w:proofErr w:type="spellEnd"/>
+      <w:r>
+        <w:rPr>
+          <w:rFonts w:asciiTheme="minorHAnsi" w:hAnsiTheme="minorHAnsi" w:cstheme="minorHAnsi"/>
+        </w:rPr>
+        <w:t xml:space="preserve"> and </w:t>
+      </w:r>
+      <w:proofErr w:type="spellStart"/>
+      <w:r>
+        <w:rPr>
+          <w:rFonts w:asciiTheme="minorHAnsi" w:hAnsiTheme="minorHAnsi" w:cstheme="minorHAnsi"/>
+        </w:rPr>
+        <w:t>monitoring</w:t>
+      </w:r>
+      <w:proofErr w:type="spellEnd"/>
+      <w:r>
+        <w:rPr>
+          <w:rFonts w:asciiTheme="minorHAnsi" w:hAnsiTheme="minorHAnsi" w:cstheme="minorHAnsi"/>
+        </w:rPr>
+        <w:t xml:space="preserve"> machine </w:t>
+      </w:r>
+      <w:proofErr w:type="spellStart"/>
+      <w:r>
+        <w:rPr>
+          <w:rFonts w:asciiTheme="minorHAnsi" w:hAnsiTheme="minorHAnsi" w:cstheme="minorHAnsi"/>
+        </w:rPr>
+        <w:t>learning</w:t>
+      </w:r>
+      <w:proofErr w:type="spellEnd"/>
+      <w:r>
+        <w:rPr>
+          <w:rFonts w:asciiTheme="minorHAnsi" w:hAnsiTheme="minorHAnsi" w:cstheme="minorHAnsi"/>
+        </w:rPr>
+        <w:t xml:space="preserve"> </w:t>
+      </w:r>
+      <w:proofErr w:type="spellStart"/>
+      <w:r>
+        <w:rPr>
+          <w:rFonts w:asciiTheme="minorHAnsi" w:hAnsiTheme="minorHAnsi" w:cstheme="minorHAnsi"/>
+        </w:rPr>
+        <w:t>models</w:t>
+      </w:r>
+      <w:proofErr w:type="spellEnd"/>
+      <w:r>
+        <w:rPr>
+          <w:rFonts w:asciiTheme="minorHAnsi" w:hAnsiTheme="minorHAnsi" w:cstheme="minorHAnsi"/>
+        </w:rPr>
+        <w:t xml:space="preserve">: </w:t>
+      </w:r>
+      <w:proofErr w:type="spellStart"/>
+      <w:r>
+        <w:rPr>
+          <w:rFonts w:asciiTheme="minorHAnsi" w:hAnsiTheme="minorHAnsi" w:cstheme="minorHAnsi"/>
+        </w:rPr>
+        <w:t>Approaches</w:t>
+      </w:r>
+      <w:proofErr w:type="spellEnd"/>
+      <w:r>
+        <w:rPr>
+          <w:rFonts w:asciiTheme="minorHAnsi" w:hAnsiTheme="minorHAnsi" w:cstheme="minorHAnsi"/>
+        </w:rPr>
+        <w:t xml:space="preserve"> </w:t>
+      </w:r>
+      <w:proofErr w:type="spellStart"/>
+      <w:r>
+        <w:rPr>
+          <w:rFonts w:asciiTheme="minorHAnsi" w:hAnsiTheme="minorHAnsi" w:cstheme="minorHAnsi"/>
+        </w:rPr>
+        <w:t>for</w:t>
+      </w:r>
+      <w:proofErr w:type="spellEnd"/>
+      <w:r>
+        <w:rPr>
+          <w:rFonts w:asciiTheme="minorHAnsi" w:hAnsiTheme="minorHAnsi" w:cstheme="minorHAnsi"/>
+        </w:rPr>
+        <w:t xml:space="preserve"> </w:t>
+      </w:r>
+      <w:proofErr w:type="spellStart"/>
+      <w:r>
+        <w:rPr>
+          <w:rFonts w:asciiTheme="minorHAnsi" w:hAnsiTheme="minorHAnsi" w:cstheme="minorHAnsi"/>
+        </w:rPr>
+        <w:t>applying</w:t>
+      </w:r>
+      <w:proofErr w:type="spellEnd"/>
+      <w:r>
+        <w:rPr>
+          <w:rFonts w:asciiTheme="minorHAnsi" w:hAnsiTheme="minorHAnsi" w:cstheme="minorHAnsi"/>
+        </w:rPr>
+        <w:t xml:space="preserve"> </w:t>
+      </w:r>
+      <w:proofErr w:type="spellStart"/>
+      <w:r>
+        <w:rPr>
+          <w:rFonts w:asciiTheme="minorHAnsi" w:hAnsiTheme="minorHAnsi" w:cstheme="minorHAnsi"/>
+        </w:rPr>
+        <w:t>MLOps</w:t>
+      </w:r>
+      <w:proofErr w:type="spellEnd"/>
+      <w:r>
+        <w:rPr>
+          <w:rFonts w:asciiTheme="minorHAnsi" w:hAnsiTheme="minorHAnsi" w:cstheme="minorHAnsi"/>
+        </w:rPr>
+        <w:t xml:space="preserve">. </w:t>
+      </w:r>
+      <w:proofErr w:type="spellStart"/>
+      <w:r>
+        <w:rPr>
+          <w:rFonts w:asciiTheme="minorHAnsi" w:hAnsiTheme="minorHAnsi" w:cstheme="minorHAnsi"/>
+        </w:rPr>
+        <w:t>arXiv</w:t>
+      </w:r>
+      <w:proofErr w:type="spellEnd"/>
+      <w:r>
+        <w:rPr>
+          <w:rFonts w:asciiTheme="minorHAnsi" w:hAnsiTheme="minorHAnsi" w:cstheme="minorHAnsi"/>
+        </w:rPr>
+        <w:t>. https://arxiv.org/abs/2408.11112</w:t>
+      </w:r>
+    </w:p>
+    <w:p>
+      <w:pPr>
+        <w:spacing w:after="80" w:line="276" w:lineRule="auto"/>
+        <w:ind w:left="720" w:hanging="720"/>
+        <w:jc w:val="both"/>
+        <w:rPr>
+          <w:rFonts w:asciiTheme="minorHAnsi" w:hAnsiTheme="minorHAnsi" w:cstheme="minorHAnsi"/>
+        </w:rPr>
+      </w:pPr>
+      <w:r>
+        <w:rPr>
+          <w:rFonts w:asciiTheme="minorHAnsi" w:hAnsiTheme="minorHAnsi" w:cstheme="minorHAnsi"/>
+        </w:rPr>
+        <w:t xml:space="preserve">Rumelhart, D. E., Hinton, G. E., &amp; Williams, R. J. (1986). Learning representations by back-propagating errors. </w:t>
+      </w:r>
+      <w:r>
+        <w:rPr>
+          <w:rFonts w:asciiTheme="minorHAnsi" w:hAnsiTheme="minorHAnsi" w:cstheme="minorHAnsi"/>
+          <w:i/>
+        </w:rPr>
+        <w:t>Nature, 323</w:t>
+      </w:r>
+      <w:r>
+        <w:rPr>
+          <w:rFonts w:asciiTheme="minorHAnsi" w:hAnsiTheme="minorHAnsi" w:cstheme="minorHAnsi"/>
+        </w:rPr>
+        <w:t>(6088), 533-536. https://doi.org/10.1038/323533a0</w:t>
+      </w:r>
+    </w:p>
+    <w:p>
+      <w:pPr>
+        <w:spacing w:after="80" w:line="276" w:lineRule="auto"/>
+        <w:ind w:left="720" w:hanging="720"/>
+        <w:jc w:val="both"/>
+        <w:rPr>
+          <w:rFonts w:asciiTheme="minorHAnsi" w:hAnsiTheme="minorHAnsi" w:cstheme="minorHAnsi"/>
+        </w:rPr>
+      </w:pPr>
+      <w:proofErr w:type="spellStart"/>
+      <w:r>
+        <w:rPr>
+          <w:rFonts w:asciiTheme="minorHAnsi" w:hAnsiTheme="minorHAnsi" w:cstheme="minorHAnsi"/>
+        </w:rPr>
+        <w:t>Shaikhsurab</w:t>
+      </w:r>
+      <w:proofErr w:type="spellEnd"/>
+      <w:r>
+        <w:rPr>
+          <w:rFonts w:asciiTheme="minorHAnsi" w:hAnsiTheme="minorHAnsi" w:cstheme="minorHAnsi"/>
+        </w:rPr>
+        <w:t xml:space="preserve">, M. A., &amp; </w:t>
+      </w:r>
+      <w:proofErr w:type="spellStart"/>
+      <w:r>
+        <w:rPr>
+          <w:rFonts w:asciiTheme="minorHAnsi" w:hAnsiTheme="minorHAnsi" w:cstheme="minorHAnsi"/>
+        </w:rPr>
+        <w:t>Magadum</w:t>
+      </w:r>
+      <w:proofErr w:type="spellEnd"/>
+      <w:r>
+        <w:rPr>
+          <w:rFonts w:asciiTheme="minorHAnsi" w:hAnsiTheme="minorHAnsi" w:cstheme="minorHAnsi"/>
+        </w:rPr>
+        <w:t xml:space="preserve">, P. (2024). </w:t>
+      </w:r>
+      <w:proofErr w:type="spellStart"/>
+      <w:r>
+        <w:rPr>
+          <w:rFonts w:asciiTheme="minorHAnsi" w:hAnsiTheme="minorHAnsi" w:cstheme="minorHAnsi"/>
+        </w:rPr>
+        <w:t>Enhancing</w:t>
+      </w:r>
+      <w:proofErr w:type="spellEnd"/>
+      <w:r>
+        <w:rPr>
+          <w:rFonts w:asciiTheme="minorHAnsi" w:hAnsiTheme="minorHAnsi" w:cstheme="minorHAnsi"/>
+        </w:rPr>
+        <w:t xml:space="preserve"> </w:t>
+      </w:r>
+      <w:proofErr w:type="spellStart"/>
+      <w:r>
+        <w:rPr>
+          <w:rFonts w:asciiTheme="minorHAnsi" w:hAnsiTheme="minorHAnsi" w:cstheme="minorHAnsi"/>
+        </w:rPr>
+        <w:t>customer</w:t>
+      </w:r>
+      <w:proofErr w:type="spellEnd"/>
+      <w:r>
+        <w:rPr>
+          <w:rFonts w:asciiTheme="minorHAnsi" w:hAnsiTheme="minorHAnsi" w:cstheme="minorHAnsi"/>
+        </w:rPr>
+        <w:t xml:space="preserve"> </w:t>
+      </w:r>
+      <w:proofErr w:type="spellStart"/>
+      <w:r>
+        <w:rPr>
+          <w:rFonts w:asciiTheme="minorHAnsi" w:hAnsiTheme="minorHAnsi" w:cstheme="minorHAnsi"/>
+        </w:rPr>
+        <w:t>churn</w:t>
+      </w:r>
+      <w:proofErr w:type="spellEnd"/>
+      <w:r>
+        <w:rPr>
+          <w:rFonts w:asciiTheme="minorHAnsi" w:hAnsiTheme="minorHAnsi" w:cstheme="minorHAnsi"/>
+        </w:rPr>
+        <w:t xml:space="preserve"> </w:t>
+      </w:r>
+      <w:proofErr w:type="spellStart"/>
+      <w:r>
+        <w:rPr>
+          <w:rFonts w:asciiTheme="minorHAnsi" w:hAnsiTheme="minorHAnsi" w:cstheme="minorHAnsi"/>
+        </w:rPr>
+        <w:t>prediction</w:t>
+      </w:r>
+      <w:proofErr w:type="spellEnd"/>
+      <w:r>
+        <w:rPr>
+          <w:rFonts w:asciiTheme="minorHAnsi" w:hAnsiTheme="minorHAnsi" w:cstheme="minorHAnsi"/>
+        </w:rPr>
+        <w:t xml:space="preserve"> in </w:t>
+      </w:r>
+      <w:proofErr w:type="spellStart"/>
+      <w:r>
+        <w:rPr>
+          <w:rFonts w:asciiTheme="minorHAnsi" w:hAnsiTheme="minorHAnsi" w:cstheme="minorHAnsi"/>
+        </w:rPr>
+        <w:t>telecommunications</w:t>
+      </w:r>
+      <w:proofErr w:type="spellEnd"/>
+      <w:r>
+        <w:rPr>
+          <w:rFonts w:asciiTheme="minorHAnsi" w:hAnsiTheme="minorHAnsi" w:cstheme="minorHAnsi"/>
+        </w:rPr>
+        <w:t xml:space="preserve">: </w:t>
+      </w:r>
+      <w:proofErr w:type="spellStart"/>
+      <w:r>
+        <w:rPr>
+          <w:rFonts w:asciiTheme="minorHAnsi" w:hAnsiTheme="minorHAnsi" w:cstheme="minorHAnsi"/>
+        </w:rPr>
+        <w:t>An</w:t>
+      </w:r>
+      <w:proofErr w:type="spellEnd"/>
+      <w:r>
+        <w:rPr>
+          <w:rFonts w:asciiTheme="minorHAnsi" w:hAnsiTheme="minorHAnsi" w:cstheme="minorHAnsi"/>
+        </w:rPr>
+        <w:t xml:space="preserve"> adaptive ensemble </w:t>
+      </w:r>
+      <w:proofErr w:type="spellStart"/>
+      <w:r>
+        <w:rPr>
+          <w:rFonts w:asciiTheme="minorHAnsi" w:hAnsiTheme="minorHAnsi" w:cstheme="minorHAnsi"/>
+        </w:rPr>
+        <w:t>learning</w:t>
+      </w:r>
+      <w:proofErr w:type="spellEnd"/>
+      <w:r>
+        <w:rPr>
+          <w:rFonts w:asciiTheme="minorHAnsi" w:hAnsiTheme="minorHAnsi" w:cstheme="minorHAnsi"/>
+        </w:rPr>
+        <w:t xml:space="preserve"> </w:t>
+      </w:r>
+      <w:proofErr w:type="spellStart"/>
+      <w:r>
+        <w:rPr>
+          <w:rFonts w:asciiTheme="minorHAnsi" w:hAnsiTheme="minorHAnsi" w:cstheme="minorHAnsi"/>
+        </w:rPr>
+        <w:t>approach</w:t>
+      </w:r>
+      <w:proofErr w:type="spellEnd"/>
+      <w:r>
+        <w:rPr>
+          <w:rFonts w:asciiTheme="minorHAnsi" w:hAnsiTheme="minorHAnsi" w:cstheme="minorHAnsi"/>
+        </w:rPr>
+        <w:t xml:space="preserve">. </w:t>
+      </w:r>
+      <w:proofErr w:type="spellStart"/>
+      <w:r>
+        <w:rPr>
+          <w:rFonts w:asciiTheme="minorHAnsi" w:hAnsiTheme="minorHAnsi" w:cstheme="minorHAnsi"/>
+        </w:rPr>
+        <w:t>arXiv</w:t>
+      </w:r>
+      <w:proofErr w:type="spellEnd"/>
+      <w:r>
+        <w:rPr>
+          <w:rFonts w:asciiTheme="minorHAnsi" w:hAnsiTheme="minorHAnsi" w:cstheme="minorHAnsi"/>
+        </w:rPr>
+        <w:t>. https://arxiv.org/abs/2408.16284</w:t>
+      </w:r>
+    </w:p>
+    <w:p>
+      <w:pPr>
+        <w:spacing w:after="80" w:line="276" w:lineRule="auto"/>
+        <w:ind w:left="720" w:hanging="720"/>
+        <w:jc w:val="both"/>
+        <w:rPr>
+          <w:rFonts w:asciiTheme="minorHAnsi" w:hAnsiTheme="minorHAnsi" w:cstheme="minorHAnsi"/>
+          <w:i/>
+          <w:iCs/>
+        </w:rPr>
+      </w:pPr>
+      <w:r>
+        <w:rPr>
+          <w:rFonts w:asciiTheme="minorHAnsi" w:hAnsiTheme="minorHAnsi" w:cstheme="minorHAnsi"/>
+        </w:rPr>
+        <w:t>SHAP. (</w:t>
+      </w:r>
+      <w:proofErr w:type="spellStart"/>
+      <w:r>
+        <w:rPr>
+          <w:rFonts w:asciiTheme="minorHAnsi" w:hAnsiTheme="minorHAnsi" w:cstheme="minorHAnsi"/>
+        </w:rPr>
+        <w:t>n.d</w:t>
+      </w:r>
+      <w:proofErr w:type="spellEnd"/>
+      <w:r>
+        <w:rPr>
+          <w:rFonts w:asciiTheme="minorHAnsi" w:hAnsiTheme="minorHAnsi" w:cstheme="minorHAnsi"/>
+        </w:rPr>
+        <w:t xml:space="preserve">.). </w:t>
+      </w:r>
+      <w:proofErr w:type="spellStart"/>
+      <w:r>
+        <w:rPr>
+          <w:rFonts w:asciiTheme="minorHAnsi" w:hAnsiTheme="minorHAnsi" w:cstheme="minorHAnsi"/>
+          <w:i/>
+          <w:iCs/>
+        </w:rPr>
+        <w:t>Welcome</w:t>
+      </w:r>
+      <w:proofErr w:type="spellEnd"/>
+      <w:r>
+        <w:rPr>
+          <w:rFonts w:asciiTheme="minorHAnsi" w:hAnsiTheme="minorHAnsi" w:cstheme="minorHAnsi"/>
+          <w:i/>
+          <w:iCs/>
+        </w:rPr>
+        <w:t xml:space="preserve"> </w:t>
+      </w:r>
+      <w:proofErr w:type="spellStart"/>
+      <w:r>
+        <w:rPr>
+          <w:rFonts w:asciiTheme="minorHAnsi" w:hAnsiTheme="minorHAnsi" w:cstheme="minorHAnsi"/>
+          <w:i/>
+          <w:iCs/>
+        </w:rPr>
+        <w:t>to</w:t>
+      </w:r>
+      <w:proofErr w:type="spellEnd"/>
+      <w:r>
+        <w:rPr>
+          <w:rFonts w:asciiTheme="minorHAnsi" w:hAnsiTheme="minorHAnsi" w:cstheme="minorHAnsi"/>
+          <w:i/>
+          <w:iCs/>
+        </w:rPr>
+        <w:t xml:space="preserve"> </w:t>
+      </w:r>
+      <w:proofErr w:type="spellStart"/>
+      <w:r>
+        <w:rPr>
+          <w:rFonts w:asciiTheme="minorHAnsi" w:hAnsiTheme="minorHAnsi" w:cstheme="minorHAnsi"/>
+          <w:i/>
+          <w:iCs/>
+        </w:rPr>
+        <w:t>the</w:t>
+      </w:r>
+      <w:proofErr w:type="spellEnd"/>
+      <w:r>
+        <w:rPr>
+          <w:rFonts w:asciiTheme="minorHAnsi" w:hAnsiTheme="minorHAnsi" w:cstheme="minorHAnsi"/>
+          <w:i/>
+          <w:iCs/>
+        </w:rPr>
+        <w:t xml:space="preserve"> SHAP </w:t>
+      </w:r>
+      <w:proofErr w:type="spellStart"/>
+      <w:r>
+        <w:rPr>
+          <w:rFonts w:asciiTheme="minorHAnsi" w:hAnsiTheme="minorHAnsi" w:cstheme="minorHAnsi"/>
+          <w:i/>
+          <w:iCs/>
+        </w:rPr>
+        <w:t>documentation</w:t>
+      </w:r>
+      <w:proofErr w:type="spellEnd"/>
+      <w:r>
+        <w:rPr>
+          <w:rFonts w:asciiTheme="minorHAnsi" w:hAnsiTheme="minorHAnsi" w:cstheme="minorHAnsi"/>
+          <w:i/>
+          <w:iCs/>
+        </w:rPr>
+        <w:t>. https://shap.readthedocs.io/en/latest/</w:t>
+      </w:r>
+    </w:p>
+    <w:p>
+      <w:pPr>
+        <w:spacing w:after="80" w:line="276" w:lineRule="auto"/>
+        <w:ind w:left="720" w:hanging="720"/>
+        <w:jc w:val="both"/>
+        <w:rPr>
+          <w:rFonts w:asciiTheme="minorHAnsi" w:hAnsiTheme="minorHAnsi" w:cstheme="minorHAnsi"/>
+        </w:rPr>
+      </w:pPr>
+      <w:r>
+        <w:rPr>
+          <w:rFonts w:asciiTheme="minorHAnsi" w:hAnsiTheme="minorHAnsi" w:cstheme="minorHAnsi"/>
+        </w:rPr>
+        <w:lastRenderedPageBreak/>
+        <w:t xml:space="preserve">Vafeiadis, T., Diamantaras, K. I., Sarigiannidis, G., &amp; Chatzisavvas, K. C. (2015). A comparison of machine learning techniques for customer churn prediction. </w:t>
+      </w:r>
+      <w:r>
+        <w:rPr>
+          <w:rFonts w:asciiTheme="minorHAnsi" w:hAnsiTheme="minorHAnsi" w:cstheme="minorHAnsi"/>
+          <w:i/>
+        </w:rPr>
+        <w:t>Simulation Modelling Practice and Theory, 55</w:t>
+      </w:r>
+      <w:r>
+        <w:rPr>
+          <w:rFonts w:asciiTheme="minorHAnsi" w:hAnsiTheme="minorHAnsi" w:cstheme="minorHAnsi"/>
+        </w:rPr>
+        <w:t xml:space="preserve">, 1-9. </w:t>
+      </w:r>
+      <w:hyperlink r:id="rId54" w:history="1">
+        <w:r>
+          <w:rPr>
+            <w:rStyle w:val="Hipervnculo"/>
             <w:rFonts w:asciiTheme="minorHAnsi" w:hAnsiTheme="minorHAnsi" w:cstheme="minorHAnsi"/>
-            <w:u w:val="single"/>
+          </w:rPr>
+          <w:t>https://doi.org/10.1016/j.simpat.2015.03.003</w:t>
+        </w:r>
+      </w:hyperlink>
+    </w:p>
+    <w:p>
+      <w:pPr>
+        <w:spacing w:after="80" w:line="276" w:lineRule="auto"/>
+        <w:ind w:left="720" w:hanging="720"/>
+        <w:jc w:val="both"/>
+        <w:rPr>
+          <w:rFonts w:asciiTheme="minorHAnsi" w:hAnsiTheme="minorHAnsi" w:cstheme="minorHAnsi"/>
+        </w:rPr>
+      </w:pPr>
+      <w:r>
+        <w:rPr>
+          <w:rFonts w:asciiTheme="minorHAnsi" w:hAnsiTheme="minorHAnsi" w:cstheme="minorHAnsi"/>
+        </w:rPr>
+        <w:t xml:space="preserve">Vera, I., Vera, G., &amp; Mallea, D. (2026). </w:t>
+      </w:r>
+      <w:r>
+        <w:rPr>
+          <w:rStyle w:val="nfasis"/>
+          <w:rFonts w:asciiTheme="minorHAnsi" w:hAnsiTheme="minorHAnsi" w:cstheme="minorHAnsi"/>
+        </w:rPr>
+        <w:t>Predicción de abandono de clientes (</w:t>
+      </w:r>
+      <w:proofErr w:type="spellStart"/>
+      <w:r>
+        <w:rPr>
+          <w:rStyle w:val="nfasis"/>
+          <w:rFonts w:asciiTheme="minorHAnsi" w:hAnsiTheme="minorHAnsi" w:cstheme="minorHAnsi"/>
+        </w:rPr>
+        <w:t>churn</w:t>
+      </w:r>
+      <w:proofErr w:type="spellEnd"/>
+      <w:r>
+        <w:rPr>
+          <w:rStyle w:val="nfasis"/>
+          <w:rFonts w:asciiTheme="minorHAnsi" w:hAnsiTheme="minorHAnsi" w:cstheme="minorHAnsi"/>
+        </w:rPr>
+        <w:t>): ACIF104, Grupo 3</w:t>
+      </w:r>
+      <w:r>
+        <w:rPr>
+          <w:rFonts w:asciiTheme="minorHAnsi" w:hAnsiTheme="minorHAnsi" w:cstheme="minorHAnsi"/>
+        </w:rPr>
+        <w:t xml:space="preserve"> [Código fuente]. GitHub. </w:t>
+      </w:r>
+      <w:hyperlink r:id="rId55" w:history="1">
+        <w:r>
+          <w:rPr>
+            <w:rStyle w:val="Hipervnculo"/>
+            <w:rFonts w:asciiTheme="minorHAnsi" w:hAnsiTheme="minorHAnsi" w:cstheme="minorHAnsi"/>
           </w:rPr>
           <w:t>https://github.com/gveraprado-wited/acif104-churn-grupo3</w:t>
         </w:r>
       </w:hyperlink>
     </w:p>
-    <w:p>
-      <w:pPr>
-        <w:spacing w:after="120" w:line="276" w:lineRule="auto"/>
-        <w:jc w:val="both"/>
-        <w:rPr>
-          <w:rFonts w:asciiTheme="minorHAnsi" w:hAnsiTheme="minorHAnsi" w:cstheme="minorHAnsi"/>
-        </w:rPr>
-      </w:pPr>
-      <w:r>
-        <w:rPr>
-          <w:rFonts w:asciiTheme="minorHAnsi" w:hAnsiTheme="minorHAnsi" w:cstheme="minorHAnsi"/>
-        </w:rPr>
-        <w:t xml:space="preserve">La rama main contiene los notebooks 01 a 07 (calidad y EDA, preprocesamiento, modelamiento ML, balanceo y modelamiento DL, refinamiento de XGBoost y de la MLP profunda, y explicabilidad SHAP), además de los módulos backend/ (API de inferencia FastAPI) y frontend/ (aplicación Streamlit) del prototipo, y las pruebas automatizadas en </w:t>
-      </w:r>
-      <w:proofErr w:type="spellStart"/>
-      <w:r>
-        <w:rPr>
-          <w:rFonts w:asciiTheme="minorHAnsi" w:hAnsiTheme="minorHAnsi" w:cstheme="minorHAnsi"/>
-        </w:rPr>
-        <w:t>tests</w:t>
-      </w:r>
-      <w:proofErr w:type="spellEnd"/>
-      <w:r>
-        <w:rPr>
-          <w:rFonts w:asciiTheme="minorHAnsi" w:hAnsiTheme="minorHAnsi" w:cstheme="minorHAnsi"/>
-        </w:rPr>
-        <w:t>/.</w:t>
-      </w:r>
-    </w:p>
-    <w:p>
-      <w:pPr>
-        <w:spacing w:after="120" w:line="276" w:lineRule="auto"/>
-        <w:jc w:val="both"/>
-        <w:rPr>
-          <w:rFonts w:asciiTheme="minorHAnsi" w:hAnsiTheme="minorHAnsi" w:cstheme="minorHAnsi"/>
-        </w:rPr>
-      </w:pPr>
-    </w:p>
-    <w:p>
-      <w:pPr>
-        <w:widowControl/>
-        <w:autoSpaceDE/>
-        <w:autoSpaceDN/>
-        <w:spacing w:before="100" w:beforeAutospacing="1" w:after="100" w:afterAutospacing="1" w:line="276" w:lineRule="auto"/>
-        <w:jc w:val="both"/>
-        <w:outlineLvl w:val="1"/>
-        <w:rPr>
-          <w:rFonts w:asciiTheme="minorHAnsi" w:eastAsia="Times New Roman" w:hAnsiTheme="minorHAnsi" w:cstheme="minorHAnsi"/>
-          <w:b/>
-          <w:bCs/>
-          <w:sz w:val="28"/>
-          <w:szCs w:val="44"/>
-          <w:lang w:val="es-419" w:eastAsia="es-419"/>
-        </w:rPr>
-      </w:pPr>
-      <w:r>
-        <w:rPr>
-          <w:rFonts w:asciiTheme="minorHAnsi" w:eastAsia="Times New Roman" w:hAnsiTheme="minorHAnsi" w:cstheme="minorHAnsi"/>
-          <w:b/>
-          <w:bCs/>
-          <w:sz w:val="28"/>
-          <w:szCs w:val="44"/>
-          <w:lang w:val="es-419" w:eastAsia="es-419"/>
-        </w:rPr>
-        <w:t>VIII. Bibliografía</w:t>
-      </w:r>
-    </w:p>
-    <w:p>
-      <w:pPr>
-        <w:spacing w:after="80" w:line="276" w:lineRule="auto"/>
-        <w:ind w:left="720" w:hanging="720"/>
-        <w:jc w:val="both"/>
-        <w:rPr>
-          <w:rFonts w:asciiTheme="minorHAnsi" w:hAnsiTheme="minorHAnsi" w:cstheme="minorHAnsi"/>
-        </w:rPr>
-      </w:pPr>
-      <w:proofErr w:type="spellStart"/>
-      <w:proofErr w:type="spellEnd"/>
-      <w:proofErr w:type="spellStart"/>
-      <w:proofErr w:type="spellEnd"/>
-      <w:proofErr w:type="spellStart"/>
-      <w:proofErr w:type="spellEnd"/>
-      <w:proofErr w:type="spellStart"/>
-      <w:proofErr w:type="spellEnd"/>
-      <w:proofErr w:type="spellStart"/>
-      <w:proofErr w:type="spellEnd"/>
-      <w:proofErr w:type="spellStart"/>
-      <w:proofErr w:type="spellEnd"/>
-      <w:proofErr w:type="spellStart"/>
-      <w:proofErr w:type="spellEnd"/>
-      <w:proofErr w:type="spellStart"/>
-      <w:proofErr w:type="spellEnd"/>
-      <w:proofErr w:type="spellStart"/>
-      <w:proofErr w:type="spellEnd"/>
-      <w:proofErr w:type="spellStart"/>
-      <w:proofErr w:type="spellEnd"/>
-      <w:proofErr w:type="spellStart"/>
-      <w:proofErr w:type="spellEnd"/>
-      <w:r>
-        <w:t xml:space="preserve">Ahmad, A. K., Jafar, A., &amp; Aljoumaa, K. (2019). Customer churn prediction in telecom using machine learning in big data platform. </w:t>
-      </w:r>
-      <w:r>
-        <w:rPr>
-          <w:i/>
-        </w:rPr>
-        <w:t>Journal of Big Data, 6</w:t>
-      </w:r>
-      <w:r>
-        <w:t>, Article 28. https://doi.org/10.1186/s40537-019-0191-6</w:t>
-      </w:r>
-    </w:p>
-    <w:p>
-      <w:pPr>
-        <w:spacing w:after="80" w:line="276" w:lineRule="auto"/>
-        <w:ind w:left="720" w:hanging="720"/>
-        <w:jc w:val="both"/>
-        <w:rPr>
-          <w:rFonts w:asciiTheme="minorHAnsi" w:hAnsiTheme="minorHAnsi" w:cstheme="minorHAnsi"/>
-        </w:rPr>
-      </w:pPr>
-      <w:proofErr w:type="spellStart"/>
-      <w:proofErr w:type="spellEnd"/>
-      <w:proofErr w:type="spellStart"/>
-      <w:proofErr w:type="spellEnd"/>
-      <w:proofErr w:type="spellStart"/>
-      <w:proofErr w:type="spellEnd"/>
-      <w:proofErr w:type="spellStart"/>
-      <w:proofErr w:type="spellEnd"/>
-      <w:proofErr w:type="spellStart"/>
-      <w:proofErr w:type="spellEnd"/>
-      <w:proofErr w:type="spellStart"/>
-      <w:proofErr w:type="spellEnd"/>
-      <w:proofErr w:type="spellStart"/>
-      <w:proofErr w:type="spellEnd"/>
-      <w:proofErr w:type="spellStart"/>
-      <w:proofErr w:type="spellEnd"/>
-      <w:proofErr w:type="spellStart"/>
-      <w:proofErr w:type="spellEnd"/>
-      <w:proofErr w:type="spellStart"/>
-      <w:proofErr w:type="spellEnd"/>
-      <w:proofErr w:type="spellStart"/>
-      <w:proofErr w:type="spellEnd"/>
-      <w:proofErr w:type="spellStart"/>
-      <w:proofErr w:type="spellEnd"/>
-      <w:proofErr w:type="spellStart"/>
-      <w:proofErr w:type="spellEnd"/>
-      <w:proofErr w:type="spellStart"/>
-      <w:proofErr w:type="spellEnd"/>
-      <w:proofErr w:type="spellStart"/>
-      <w:proofErr w:type="spellEnd"/>
-      <w:proofErr w:type="spellStart"/>
-      <w:proofErr w:type="spellEnd"/>
-      <w:r>
-        <w:t xml:space="preserve">Alotaibi, M. Z., &amp; Haq, M. A. (2024). Customer churn prediction for telecommunication companies using machine learning and ensemble methods. </w:t>
-      </w:r>
-      <w:r>
-        <w:rPr>
-          <w:i/>
-        </w:rPr>
-        <w:t>Engineering, Technology &amp; Applied Science Research, 14</w:t>
-      </w:r>
-      <w:r>
-        <w:t>(3), 14572-14578. https://doi.org/10.48084/etasr.7480</w:t>
-      </w:r>
-    </w:p>
-    <w:p>
-      <w:pPr>
-        <w:spacing w:after="80" w:line="276" w:lineRule="auto"/>
-        <w:ind w:left="720" w:hanging="720"/>
-        <w:jc w:val="both"/>
-        <w:rPr>
-          <w:rFonts w:asciiTheme="minorHAnsi" w:hAnsiTheme="minorHAnsi" w:cstheme="minorHAnsi"/>
-        </w:rPr>
-      </w:pPr>
-      <w:proofErr w:type="spellStart"/>
-      <w:proofErr w:type="spellEnd"/>
-      <w:proofErr w:type="spellStart"/>
-      <w:proofErr w:type="spellEnd"/>
-      <w:proofErr w:type="spellStart"/>
-      <w:proofErr w:type="spellEnd"/>
-      <w:proofErr w:type="spellStart"/>
-      <w:proofErr w:type="spellEnd"/>
-      <w:proofErr w:type="spellStart"/>
-      <w:proofErr w:type="spellEnd"/>
-      <w:proofErr w:type="spellStart"/>
-      <w:proofErr w:type="spellEnd"/>
-      <w:proofErr w:type="spellStart"/>
-      <w:proofErr w:type="spellEnd"/>
-      <w:proofErr w:type="spellStart"/>
-      <w:proofErr w:type="spellEnd"/>
-      <w:proofErr w:type="spellStart"/>
-      <w:proofErr w:type="spellEnd"/>
-      <w:r>
-        <w:t xml:space="preserve">Arik, S. Ö., &amp; Pfister, T. (2021). TabNet: Attentive interpretable tabular learning. </w:t>
-      </w:r>
-      <w:r>
-        <w:rPr>
-          <w:i/>
-        </w:rPr>
-        <w:t>Proceedings of the AAAI Conference on Artificial Intelligence, 35</w:t>
-      </w:r>
-      <w:r>
-        <w:t>(8), 6679-6687. https://doi.org/10.1609/aaai.v35i8.16826</w:t>
-      </w:r>
-    </w:p>
-    <w:p>
-      <w:pPr>
-        <w:spacing w:after="80" w:line="276" w:lineRule="auto"/>
-        <w:ind w:left="720" w:hanging="720"/>
-        <w:jc w:val="both"/>
-        <w:rPr>
-          <w:rFonts w:asciiTheme="minorHAnsi" w:hAnsiTheme="minorHAnsi" w:cstheme="minorHAnsi"/>
-        </w:rPr>
-      </w:pPr>
-      <w:proofErr w:type="spellStart"/>
-      <w:r>
-        <w:rPr>
-          <w:rFonts w:asciiTheme="minorHAnsi" w:hAnsiTheme="minorHAnsi" w:cstheme="minorHAnsi"/>
-        </w:rPr>
-        <w:t>Bhattacharjee</w:t>
-      </w:r>
-      <w:proofErr w:type="spellEnd"/>
-      <w:r>
-        <w:rPr>
-          <w:rFonts w:asciiTheme="minorHAnsi" w:hAnsiTheme="minorHAnsi" w:cstheme="minorHAnsi"/>
-        </w:rPr>
-        <w:t xml:space="preserve">, S., </w:t>
-      </w:r>
-      <w:proofErr w:type="spellStart"/>
-      <w:r>
-        <w:rPr>
-          <w:rFonts w:asciiTheme="minorHAnsi" w:hAnsiTheme="minorHAnsi" w:cstheme="minorHAnsi"/>
-        </w:rPr>
-        <w:t>Thukral</w:t>
-      </w:r>
-      <w:proofErr w:type="spellEnd"/>
-      <w:r>
-        <w:rPr>
-          <w:rFonts w:asciiTheme="minorHAnsi" w:hAnsiTheme="minorHAnsi" w:cstheme="minorHAnsi"/>
-        </w:rPr>
-        <w:t xml:space="preserve">, U., &amp; </w:t>
-      </w:r>
-      <w:proofErr w:type="spellStart"/>
-      <w:r>
-        <w:rPr>
-          <w:rFonts w:asciiTheme="minorHAnsi" w:hAnsiTheme="minorHAnsi" w:cstheme="minorHAnsi"/>
-        </w:rPr>
-        <w:t>Patil</w:t>
-      </w:r>
-      <w:proofErr w:type="spellEnd"/>
-      <w:r>
-        <w:rPr>
-          <w:rFonts w:asciiTheme="minorHAnsi" w:hAnsiTheme="minorHAnsi" w:cstheme="minorHAnsi"/>
-        </w:rPr>
-        <w:t xml:space="preserve">, N. (2023). </w:t>
-      </w:r>
-      <w:proofErr w:type="spellStart"/>
-      <w:r>
-        <w:rPr>
-          <w:rFonts w:asciiTheme="minorHAnsi" w:hAnsiTheme="minorHAnsi" w:cstheme="minorHAnsi"/>
-        </w:rPr>
-        <w:t>Early</w:t>
-      </w:r>
-      <w:proofErr w:type="spellEnd"/>
-      <w:r>
-        <w:rPr>
-          <w:rFonts w:asciiTheme="minorHAnsi" w:hAnsiTheme="minorHAnsi" w:cstheme="minorHAnsi"/>
-        </w:rPr>
-        <w:t xml:space="preserve"> </w:t>
-      </w:r>
-      <w:proofErr w:type="spellStart"/>
-      <w:r>
-        <w:rPr>
-          <w:rFonts w:asciiTheme="minorHAnsi" w:hAnsiTheme="minorHAnsi" w:cstheme="minorHAnsi"/>
-        </w:rPr>
-        <w:t>churn</w:t>
-      </w:r>
-      <w:proofErr w:type="spellEnd"/>
-      <w:r>
-        <w:rPr>
-          <w:rFonts w:asciiTheme="minorHAnsi" w:hAnsiTheme="minorHAnsi" w:cstheme="minorHAnsi"/>
-        </w:rPr>
-        <w:t xml:space="preserve"> </w:t>
-      </w:r>
-      <w:proofErr w:type="spellStart"/>
-      <w:r>
-        <w:rPr>
-          <w:rFonts w:asciiTheme="minorHAnsi" w:hAnsiTheme="minorHAnsi" w:cstheme="minorHAnsi"/>
-        </w:rPr>
-        <w:t>prediction</w:t>
-      </w:r>
-      <w:proofErr w:type="spellEnd"/>
-      <w:r>
-        <w:rPr>
-          <w:rFonts w:asciiTheme="minorHAnsi" w:hAnsiTheme="minorHAnsi" w:cstheme="minorHAnsi"/>
-        </w:rPr>
-        <w:t xml:space="preserve"> </w:t>
-      </w:r>
-      <w:proofErr w:type="spellStart"/>
-      <w:r>
-        <w:rPr>
-          <w:rFonts w:asciiTheme="minorHAnsi" w:hAnsiTheme="minorHAnsi" w:cstheme="minorHAnsi"/>
-        </w:rPr>
-        <w:t>from</w:t>
-      </w:r>
-      <w:proofErr w:type="spellEnd"/>
-      <w:r>
-        <w:rPr>
-          <w:rFonts w:asciiTheme="minorHAnsi" w:hAnsiTheme="minorHAnsi" w:cstheme="minorHAnsi"/>
-        </w:rPr>
-        <w:t xml:space="preserve"> </w:t>
-      </w:r>
-      <w:proofErr w:type="spellStart"/>
-      <w:r>
-        <w:rPr>
-          <w:rFonts w:asciiTheme="minorHAnsi" w:hAnsiTheme="minorHAnsi" w:cstheme="minorHAnsi"/>
-        </w:rPr>
-        <w:t>large</w:t>
-      </w:r>
-      <w:proofErr w:type="spellEnd"/>
-      <w:r>
-        <w:rPr>
-          <w:rFonts w:asciiTheme="minorHAnsi" w:hAnsiTheme="minorHAnsi" w:cstheme="minorHAnsi"/>
-        </w:rPr>
-        <w:t xml:space="preserve"> </w:t>
-      </w:r>
-      <w:proofErr w:type="spellStart"/>
-      <w:r>
-        <w:rPr>
-          <w:rFonts w:asciiTheme="minorHAnsi" w:hAnsiTheme="minorHAnsi" w:cstheme="minorHAnsi"/>
-        </w:rPr>
-        <w:t>scale</w:t>
-      </w:r>
-      <w:proofErr w:type="spellEnd"/>
-      <w:r>
-        <w:rPr>
-          <w:rFonts w:asciiTheme="minorHAnsi" w:hAnsiTheme="minorHAnsi" w:cstheme="minorHAnsi"/>
-        </w:rPr>
-        <w:t xml:space="preserve"> </w:t>
-      </w:r>
-      <w:proofErr w:type="spellStart"/>
-      <w:r>
-        <w:rPr>
-          <w:rFonts w:asciiTheme="minorHAnsi" w:hAnsiTheme="minorHAnsi" w:cstheme="minorHAnsi"/>
-        </w:rPr>
-        <w:t>user-product</w:t>
-      </w:r>
-      <w:proofErr w:type="spellEnd"/>
-      <w:r>
-        <w:rPr>
-          <w:rFonts w:asciiTheme="minorHAnsi" w:hAnsiTheme="minorHAnsi" w:cstheme="minorHAnsi"/>
-        </w:rPr>
-        <w:t xml:space="preserve"> </w:t>
-      </w:r>
-      <w:proofErr w:type="spellStart"/>
-      <w:r>
-        <w:rPr>
-          <w:rFonts w:asciiTheme="minorHAnsi" w:hAnsiTheme="minorHAnsi" w:cstheme="minorHAnsi"/>
-        </w:rPr>
-        <w:t>interaction</w:t>
-      </w:r>
-      <w:proofErr w:type="spellEnd"/>
-      <w:r>
-        <w:rPr>
-          <w:rFonts w:asciiTheme="minorHAnsi" w:hAnsiTheme="minorHAnsi" w:cstheme="minorHAnsi"/>
-        </w:rPr>
-        <w:t xml:space="preserve"> time series. </w:t>
-      </w:r>
-      <w:proofErr w:type="spellStart"/>
-      <w:r>
-        <w:rPr>
-          <w:rFonts w:asciiTheme="minorHAnsi" w:hAnsiTheme="minorHAnsi" w:cstheme="minorHAnsi"/>
-        </w:rPr>
-        <w:t>arXiv</w:t>
-      </w:r>
-      <w:proofErr w:type="spellEnd"/>
-      <w:r>
-        <w:rPr>
-          <w:rFonts w:asciiTheme="minorHAnsi" w:hAnsiTheme="minorHAnsi" w:cstheme="minorHAnsi"/>
-        </w:rPr>
-        <w:t>. https://arxiv.org/abs/2309.14390</w:t>
-      </w:r>
-    </w:p>
-    <w:p>
-      <w:pPr>
-        <w:spacing w:after="80" w:line="276" w:lineRule="auto"/>
-        <w:ind w:left="720" w:hanging="720"/>
-        <w:jc w:val="both"/>
-        <w:rPr>
-          <w:rFonts w:asciiTheme="minorHAnsi" w:hAnsiTheme="minorHAnsi" w:cstheme="minorHAnsi"/>
-        </w:rPr>
-      </w:pPr>
-      <w:proofErr w:type="spellStart"/>
-      <w:proofErr w:type="spellEnd"/>
-      <w:proofErr w:type="spellStart"/>
-      <w:proofErr w:type="spellEnd"/>
-      <w:proofErr w:type="spellStart"/>
-      <w:proofErr w:type="spellEnd"/>
-      <w:proofErr w:type="spellStart"/>
-      <w:proofErr w:type="spellEnd"/>
-      <w:proofErr w:type="spellStart"/>
-      <w:proofErr w:type="spellEnd"/>
-      <w:proofErr w:type="spellStart"/>
-      <w:proofErr w:type="spellEnd"/>
-      <w:proofErr w:type="spellStart"/>
-      <w:proofErr w:type="spellEnd"/>
-      <w:proofErr w:type="spellStart"/>
-      <w:proofErr w:type="spellEnd"/>
-      <w:proofErr w:type="spellStart"/>
-      <w:proofErr w:type="spellEnd"/>
-      <w:proofErr w:type="spellStart"/>
-      <w:proofErr w:type="spellEnd"/>
-      <w:proofErr w:type="spellStart"/>
-      <w:proofErr w:type="spellEnd"/>
-      <w:proofErr w:type="spellStart"/>
-      <w:proofErr w:type="spellEnd"/>
-      <w:r>
-        <w:t xml:space="preserve">Borisov, V., Leemann, T., Seßler, K., Haug, J., Pawelczyk, M., &amp; Kasneci, G. (2024). Deep neural networks and tabular data: A survey. </w:t>
-      </w:r>
-      <w:r>
-        <w:rPr>
-          <w:i/>
-        </w:rPr>
-        <w:t>IEEE Transactions on Neural Networks and Learning Systems, 35</w:t>
-      </w:r>
-      <w:r>
-        <w:t>(6), 7499-7519. https://doi.org/10.1109/TNNLS.2022.3229161</w:t>
-      </w:r>
-    </w:p>
-    <w:p>
-      <w:pPr>
-        <w:spacing w:after="80" w:line="276" w:lineRule="auto"/>
-        <w:ind w:left="720" w:hanging="720"/>
-        <w:jc w:val="both"/>
-        <w:rPr>
-          <w:rFonts w:asciiTheme="minorHAnsi" w:hAnsiTheme="minorHAnsi" w:cstheme="minorHAnsi"/>
-        </w:rPr>
-      </w:pPr>
-      <w:proofErr w:type="spellStart"/>
-      <w:proofErr w:type="spellEnd"/>
-      <w:proofErr w:type="spellStart"/>
-      <w:proofErr w:type="spellEnd"/>
-      <w:proofErr w:type="spellStart"/>
-      <w:proofErr w:type="spellEnd"/>
-      <w:proofErr w:type="spellStart"/>
-      <w:proofErr w:type="spellEnd"/>
-      <w:r>
-        <w:t xml:space="preserve">Breiman, L. (2001). Random forests. </w:t>
-      </w:r>
-      <w:r>
-        <w:rPr>
-          <w:i/>
-        </w:rPr>
-        <w:t>Machine Learning, 45</w:t>
-      </w:r>
-      <w:r>
-        <w:t>(1), 5-32. https://doi.org/10.1023/A:1010933404324</w:t>
-      </w:r>
-    </w:p>
-    <w:p>
-      <w:pPr>
-        <w:spacing w:after="80" w:line="276" w:lineRule="auto"/>
-        <w:ind w:left="720" w:hanging="720"/>
-        <w:jc w:val="both"/>
-        <w:rPr>
-          <w:rFonts w:asciiTheme="minorHAnsi" w:hAnsiTheme="minorHAnsi" w:cstheme="minorHAnsi"/>
-        </w:rPr>
-      </w:pPr>
-      <w:proofErr w:type="spellStart"/>
-      <w:proofErr w:type="spellEnd"/>
-      <w:proofErr w:type="spellStart"/>
-      <w:proofErr w:type="spellEnd"/>
-      <w:proofErr w:type="spellStart"/>
-      <w:proofErr w:type="spellEnd"/>
-      <w:proofErr w:type="spellStart"/>
-      <w:proofErr w:type="spellEnd"/>
-      <w:proofErr w:type="spellStart"/>
-      <w:proofErr w:type="spellEnd"/>
-      <w:proofErr w:type="spellStart"/>
-      <w:proofErr w:type="spellEnd"/>
-      <w:proofErr w:type="spellStart"/>
-      <w:proofErr w:type="spellEnd"/>
-      <w:proofErr w:type="spellStart"/>
-      <w:proofErr w:type="spellEnd"/>
-      <w:proofErr w:type="spellStart"/>
-      <w:proofErr w:type="spellEnd"/>
-      <w:proofErr w:type="spellStart"/>
-      <w:proofErr w:type="spellEnd"/>
-      <w:proofErr w:type="spellStart"/>
-      <w:proofErr w:type="spellEnd"/>
-      <w:r>
-        <w:t xml:space="preserve">Burez, J., &amp; Van den Poel, D. (2009). Handling class imbalance in customer churn prediction. </w:t>
-      </w:r>
-      <w:r>
-        <w:rPr>
-          <w:i/>
-        </w:rPr>
-        <w:t>Expert Systems with Applications, 36</w:t>
-      </w:r>
-      <w:r>
-        <w:t>(3), 4626-4636. https://doi.org/10.1016/j.eswa.2008.05.027</w:t>
-      </w:r>
-    </w:p>
-    <w:p>
-      <w:pPr>
-        <w:spacing w:after="80" w:line="276" w:lineRule="auto"/>
-        <w:ind w:left="720" w:hanging="720"/>
-        <w:jc w:val="both"/>
-        <w:rPr>
-          <w:rFonts w:asciiTheme="minorHAnsi" w:hAnsiTheme="minorHAnsi" w:cstheme="minorHAnsi"/>
-        </w:rPr>
-      </w:pPr>
-      <w:proofErr w:type="spellStart"/>
-      <w:proofErr w:type="spellEnd"/>
-      <w:proofErr w:type="spellStart"/>
-      <w:proofErr w:type="spellEnd"/>
-      <w:proofErr w:type="spellStart"/>
-      <w:proofErr w:type="spellEnd"/>
-      <w:proofErr w:type="spellStart"/>
-      <w:proofErr w:type="spellEnd"/>
-      <w:proofErr w:type="spellStart"/>
-      <w:proofErr w:type="spellEnd"/>
-      <w:proofErr w:type="spellStart"/>
-      <w:proofErr w:type="spellEnd"/>
-      <w:proofErr w:type="spellStart"/>
-      <w:proofErr w:type="spellEnd"/>
-      <w:proofErr w:type="spellStart"/>
-      <w:proofErr w:type="spellEnd"/>
-      <w:proofErr w:type="spellStart"/>
-      <w:proofErr w:type="spellEnd"/>
-      <w:proofErr w:type="spellStart"/>
-      <w:proofErr w:type="spellEnd"/>
-      <w:proofErr w:type="spellStart"/>
-      <w:proofErr w:type="spellEnd"/>
-      <w:r>
-        <w:t xml:space="preserve">Chawla, N. V., Bowyer, K. W., Hall, L. O., &amp; Kegelmeyer, W. P. (2002). SMOTE: Synthetic minority over-sampling technique. </w:t>
-      </w:r>
-      <w:r>
-        <w:rPr>
-          <w:i/>
-        </w:rPr>
-        <w:t>Journal of Artificial Intelligence Research, 16</w:t>
-      </w:r>
-      <w:r>
-        <w:t>, 321-357. https://doi.org/10.1613/jair.953</w:t>
-      </w:r>
-    </w:p>
-    <w:p>
-      <w:pPr>
-        <w:spacing w:after="80" w:line="276" w:lineRule="auto"/>
-        <w:ind w:left="720" w:hanging="720"/>
-        <w:jc w:val="both"/>
-        <w:rPr>
-          <w:rFonts w:asciiTheme="minorHAnsi" w:hAnsiTheme="minorHAnsi" w:cstheme="minorHAnsi"/>
-        </w:rPr>
-      </w:pPr>
-      <w:proofErr w:type="spellStart"/>
-      <w:proofErr w:type="spellEnd"/>
-      <w:proofErr w:type="spellStart"/>
-      <w:proofErr w:type="spellEnd"/>
-      <w:proofErr w:type="spellStart"/>
-      <w:proofErr w:type="spellEnd"/>
-      <w:proofErr w:type="spellStart"/>
-      <w:proofErr w:type="spellEnd"/>
-      <w:proofErr w:type="spellStart"/>
-      <w:proofErr w:type="spellEnd"/>
-      <w:proofErr w:type="spellStart"/>
-      <w:proofErr w:type="spellEnd"/>
-      <w:proofErr w:type="spellStart"/>
-      <w:proofErr w:type="spellEnd"/>
-      <w:proofErr w:type="spellStart"/>
-      <w:proofErr w:type="spellEnd"/>
-      <w:proofErr w:type="spellStart"/>
-      <w:proofErr w:type="spellEnd"/>
-      <w:proofErr w:type="spellStart"/>
-      <w:proofErr w:type="spellEnd"/>
-      <w:proofErr w:type="spellStart"/>
-      <w:proofErr w:type="spellEnd"/>
-      <w:proofErr w:type="spellStart"/>
-      <w:proofErr w:type="spellEnd"/>
-      <w:proofErr w:type="spellStart"/>
-      <w:proofErr w:type="spellEnd"/>
-      <w:proofErr w:type="spellStart"/>
-      <w:proofErr w:type="spellEnd"/>
-      <w:proofErr w:type="spellStart"/>
-      <w:proofErr w:type="spellEnd"/>
-      <w:proofErr w:type="spellStart"/>
-      <w:proofErr w:type="spellEnd"/>
-      <w:r>
-        <w:t xml:space="preserve">Chen, T., &amp; Guestrin, C. (2016). XGBoost: A scalable tree boosting system. In </w:t>
-      </w:r>
-      <w:r>
-        <w:rPr>
-          <w:i/>
-        </w:rPr>
-        <w:t>Proceedings of the 22nd ACM SIGKDD International Conference on Knowledge Discovery and Data Mining</w:t>
-      </w:r>
-      <w:r>
-        <w:t xml:space="preserve"> (pp. 785-794). Association for Computing Machinery. https://doi.org/10.1145/2939672.2939785</w:t>
-      </w:r>
-    </w:p>
-    <w:p>
-      <w:pPr>
-        <w:spacing w:after="80" w:line="276" w:lineRule="auto"/>
-        <w:ind w:left="720" w:hanging="720"/>
-        <w:jc w:val="both"/>
-        <w:rPr>
-          <w:rFonts w:asciiTheme="minorHAnsi" w:hAnsiTheme="minorHAnsi" w:cstheme="minorHAnsi"/>
-        </w:rPr>
-      </w:pPr>
-      <w:proofErr w:type="spellStart"/>
-      <w:proofErr w:type="spellEnd"/>
-      <w:proofErr w:type="spellStart"/>
-      <w:proofErr w:type="spellEnd"/>
-      <w:proofErr w:type="spellStart"/>
-      <w:proofErr w:type="spellEnd"/>
-      <w:proofErr w:type="spellStart"/>
-      <w:proofErr w:type="spellEnd"/>
-      <w:proofErr w:type="spellStart"/>
-      <w:proofErr w:type="spellEnd"/>
-      <w:proofErr w:type="spellStart"/>
-      <w:proofErr w:type="spellEnd"/>
-      <w:proofErr w:type="spellStart"/>
-      <w:proofErr w:type="spellEnd"/>
-      <w:proofErr w:type="spellStart"/>
-      <w:proofErr w:type="spellEnd"/>
-      <w:proofErr w:type="spellStart"/>
-      <w:proofErr w:type="spellEnd"/>
-      <w:proofErr w:type="spellStart"/>
-      <w:proofErr w:type="spellEnd"/>
-      <w:proofErr w:type="spellStart"/>
-      <w:proofErr w:type="spellEnd"/>
-      <w:proofErr w:type="spellStart"/>
-      <w:proofErr w:type="spellEnd"/>
-      <w:r>
-        <w:t xml:space="preserve">Gorishniy, Y., Rubachev, I., Khrulkov, V., &amp; Babenko, A. (2021). Revisiting deep learning models for tabular data. </w:t>
-      </w:r>
-      <w:r>
-        <w:rPr>
-          <w:i/>
-        </w:rPr>
-        <w:t>Advances in Neural Information Processing Systems, 34</w:t>
-      </w:r>
-      <w:r>
-        <w:t>. https://proceedings.neurips.cc/paper/2021/hash/9d86d83f925f2149e9edb0ac3b49229c-Abstract.html</w:t>
-      </w:r>
-    </w:p>
-    <w:p>
-      <w:pPr>
-        <w:spacing w:after="80" w:line="276" w:lineRule="auto"/>
-        <w:ind w:left="720" w:hanging="720"/>
-        <w:jc w:val="both"/>
-        <w:rPr>
-          <w:rFonts w:asciiTheme="minorHAnsi" w:hAnsiTheme="minorHAnsi" w:cstheme="minorHAnsi"/>
-        </w:rPr>
-      </w:pPr>
-      <w:proofErr w:type="spellStart"/>
-      <w:proofErr w:type="spellEnd"/>
-      <w:proofErr w:type="spellStart"/>
-      <w:proofErr w:type="spellEnd"/>
-      <w:proofErr w:type="spellStart"/>
-      <w:proofErr w:type="spellEnd"/>
-      <w:proofErr w:type="spellStart"/>
-      <w:proofErr w:type="spellEnd"/>
-      <w:proofErr w:type="spellStart"/>
-      <w:proofErr w:type="spellEnd"/>
-      <w:proofErr w:type="spellStart"/>
-      <w:proofErr w:type="spellEnd"/>
-      <w:proofErr w:type="spellStart"/>
-      <w:proofErr w:type="spellEnd"/>
-      <w:proofErr w:type="spellStart"/>
-      <w:proofErr w:type="spellEnd"/>
-      <w:r>
-        <w:t xml:space="preserve">He, H., &amp; Garcia, E. A. (2009). Learning from imbalanced data. </w:t>
-      </w:r>
-      <w:r>
-        <w:rPr>
-          <w:i/>
-        </w:rPr>
-        <w:t>IEEE Transactions on Knowledge and Data Engineering, 21</w:t>
-      </w:r>
-      <w:r>
-        <w:t>(9), 1263-1284. https://doi.org/10.1109/TKDE.2008.239</w:t>
-      </w:r>
-    </w:p>
-    <w:p>
-      <w:pPr>
-        <w:spacing w:after="80" w:line="276" w:lineRule="auto"/>
-        <w:ind w:left="720" w:hanging="720"/>
-        <w:jc w:val="both"/>
-        <w:rPr>
-          <w:rFonts w:asciiTheme="minorHAnsi" w:hAnsiTheme="minorHAnsi" w:cstheme="minorHAnsi"/>
-        </w:rPr>
-      </w:pPr>
-      <w:proofErr w:type="spellStart"/>
-      <w:proofErr w:type="spellEnd"/>
-      <w:proofErr w:type="spellStart"/>
-      <w:proofErr w:type="spellEnd"/>
-      <w:proofErr w:type="spellStart"/>
-      <w:proofErr w:type="spellEnd"/>
-      <w:proofErr w:type="spellStart"/>
-      <w:proofErr w:type="spellEnd"/>
-      <w:proofErr w:type="spellStart"/>
-      <w:proofErr w:type="spellEnd"/>
-      <w:proofErr w:type="spellStart"/>
-      <w:proofErr w:type="spellEnd"/>
-      <w:proofErr w:type="spellStart"/>
-      <w:proofErr w:type="spellEnd"/>
-      <w:proofErr w:type="spellStart"/>
-      <w:proofErr w:type="spellEnd"/>
-      <w:proofErr w:type="spellStart"/>
-      <w:proofErr w:type="spellEnd"/>
-      <w:proofErr w:type="spellStart"/>
-      <w:proofErr w:type="spellEnd"/>
-      <w:proofErr w:type="spellStart"/>
-      <w:proofErr w:type="spellEnd"/>
-      <w:proofErr w:type="spellStart"/>
-      <w:proofErr w:type="spellEnd"/>
-      <w:proofErr w:type="spellStart"/>
-      <w:proofErr w:type="spellEnd"/>
-      <w:proofErr w:type="spellStart"/>
-      <w:proofErr w:type="spellEnd"/>
-      <w:proofErr w:type="spellStart"/>
-      <w:proofErr w:type="spellEnd"/>
-      <w:proofErr w:type="spellStart"/>
-      <w:proofErr w:type="spellEnd"/>
-      <w:r>
-        <w:t xml:space="preserve">Imani, M., Abdolrazzagh-Nezhad, M., &amp; Boushehri, A. (2025). Customer churn prediction: A systematic review of machine learning and deep learning approaches. </w:t>
-      </w:r>
-      <w:r>
-        <w:rPr>
-          <w:i/>
-        </w:rPr>
-        <w:t>Machine Learning and Knowledge Extraction, 7</w:t>
-      </w:r>
-      <w:r>
-        <w:t>(3), 105. https://doi.org/10.3390/make7030105</w:t>
-      </w:r>
-    </w:p>
-    <w:p>
-      <w:pPr>
-        <w:spacing w:after="80" w:line="276" w:lineRule="auto"/>
-        <w:ind w:left="720" w:hanging="720"/>
-        <w:jc w:val="both"/>
-        <w:rPr>
-          <w:rFonts w:asciiTheme="minorHAnsi" w:hAnsiTheme="minorHAnsi" w:cstheme="minorHAnsi"/>
-        </w:rPr>
-      </w:pPr>
-      <w:proofErr w:type="spellStart"/>
-      <w:r>
-        <w:rPr>
-          <w:rFonts w:asciiTheme="minorHAnsi" w:hAnsiTheme="minorHAnsi" w:cstheme="minorHAnsi"/>
-        </w:rPr>
-        <w:t>Maan</w:t>
-      </w:r>
-      <w:proofErr w:type="spellEnd"/>
-      <w:r>
-        <w:rPr>
-          <w:rFonts w:asciiTheme="minorHAnsi" w:hAnsiTheme="minorHAnsi" w:cstheme="minorHAnsi"/>
-        </w:rPr>
-        <w:t xml:space="preserve">, J., &amp; </w:t>
-      </w:r>
-      <w:proofErr w:type="spellStart"/>
-      <w:r>
-        <w:rPr>
-          <w:rFonts w:asciiTheme="minorHAnsi" w:hAnsiTheme="minorHAnsi" w:cstheme="minorHAnsi"/>
-        </w:rPr>
-        <w:t>Maan</w:t>
-      </w:r>
-      <w:proofErr w:type="spellEnd"/>
-      <w:r>
-        <w:rPr>
-          <w:rFonts w:asciiTheme="minorHAnsi" w:hAnsiTheme="minorHAnsi" w:cstheme="minorHAnsi"/>
-        </w:rPr>
-        <w:t xml:space="preserve">, H. (2023). </w:t>
-      </w:r>
-      <w:proofErr w:type="spellStart"/>
-      <w:r>
-        <w:rPr>
-          <w:rFonts w:asciiTheme="minorHAnsi" w:hAnsiTheme="minorHAnsi" w:cstheme="minorHAnsi"/>
-        </w:rPr>
-        <w:t>Customer</w:t>
-      </w:r>
-      <w:proofErr w:type="spellEnd"/>
-      <w:r>
-        <w:rPr>
-          <w:rFonts w:asciiTheme="minorHAnsi" w:hAnsiTheme="minorHAnsi" w:cstheme="minorHAnsi"/>
-        </w:rPr>
-        <w:t xml:space="preserve"> </w:t>
-      </w:r>
-      <w:proofErr w:type="spellStart"/>
-      <w:r>
-        <w:rPr>
-          <w:rFonts w:asciiTheme="minorHAnsi" w:hAnsiTheme="minorHAnsi" w:cstheme="minorHAnsi"/>
-        </w:rPr>
-        <w:t>churn</w:t>
-      </w:r>
-      <w:proofErr w:type="spellEnd"/>
-      <w:r>
-        <w:rPr>
-          <w:rFonts w:asciiTheme="minorHAnsi" w:hAnsiTheme="minorHAnsi" w:cstheme="minorHAnsi"/>
-        </w:rPr>
-        <w:t xml:space="preserve"> </w:t>
-      </w:r>
-      <w:proofErr w:type="spellStart"/>
-      <w:r>
-        <w:rPr>
-          <w:rFonts w:asciiTheme="minorHAnsi" w:hAnsiTheme="minorHAnsi" w:cstheme="minorHAnsi"/>
-        </w:rPr>
-        <w:t>prediction</w:t>
-      </w:r>
-      <w:proofErr w:type="spellEnd"/>
-      <w:r>
-        <w:rPr>
-          <w:rFonts w:asciiTheme="minorHAnsi" w:hAnsiTheme="minorHAnsi" w:cstheme="minorHAnsi"/>
-        </w:rPr>
-        <w:t xml:space="preserve"> </w:t>
-      </w:r>
-      <w:proofErr w:type="spellStart"/>
-      <w:r>
-        <w:rPr>
-          <w:rFonts w:asciiTheme="minorHAnsi" w:hAnsiTheme="minorHAnsi" w:cstheme="minorHAnsi"/>
-        </w:rPr>
-        <w:t>model</w:t>
-      </w:r>
-      <w:proofErr w:type="spellEnd"/>
-      <w:r>
-        <w:rPr>
-          <w:rFonts w:asciiTheme="minorHAnsi" w:hAnsiTheme="minorHAnsi" w:cstheme="minorHAnsi"/>
-        </w:rPr>
-        <w:t xml:space="preserve"> </w:t>
-      </w:r>
-      <w:proofErr w:type="spellStart"/>
-      <w:r>
-        <w:rPr>
-          <w:rFonts w:asciiTheme="minorHAnsi" w:hAnsiTheme="minorHAnsi" w:cstheme="minorHAnsi"/>
-        </w:rPr>
-        <w:t>using</w:t>
-      </w:r>
-      <w:proofErr w:type="spellEnd"/>
-      <w:r>
-        <w:rPr>
-          <w:rFonts w:asciiTheme="minorHAnsi" w:hAnsiTheme="minorHAnsi" w:cstheme="minorHAnsi"/>
-        </w:rPr>
-        <w:t xml:space="preserve"> </w:t>
-      </w:r>
-      <w:proofErr w:type="spellStart"/>
-      <w:r>
-        <w:rPr>
-          <w:rFonts w:asciiTheme="minorHAnsi" w:hAnsiTheme="minorHAnsi" w:cstheme="minorHAnsi"/>
-        </w:rPr>
-        <w:t>explainable</w:t>
-      </w:r>
-      <w:proofErr w:type="spellEnd"/>
-      <w:r>
-        <w:rPr>
-          <w:rFonts w:asciiTheme="minorHAnsi" w:hAnsiTheme="minorHAnsi" w:cstheme="minorHAnsi"/>
-        </w:rPr>
-        <w:t xml:space="preserve"> machine </w:t>
-      </w:r>
-      <w:proofErr w:type="spellStart"/>
-      <w:r>
-        <w:rPr>
-          <w:rFonts w:asciiTheme="minorHAnsi" w:hAnsiTheme="minorHAnsi" w:cstheme="minorHAnsi"/>
-        </w:rPr>
-        <w:t>learning</w:t>
-      </w:r>
-      <w:proofErr w:type="spellEnd"/>
-      <w:r>
-        <w:rPr>
-          <w:rFonts w:asciiTheme="minorHAnsi" w:hAnsiTheme="minorHAnsi" w:cstheme="minorHAnsi"/>
-        </w:rPr>
-        <w:t xml:space="preserve">. </w:t>
-      </w:r>
-      <w:proofErr w:type="spellStart"/>
-      <w:r>
-        <w:rPr>
-          <w:rFonts w:asciiTheme="minorHAnsi" w:hAnsiTheme="minorHAnsi" w:cstheme="minorHAnsi"/>
-        </w:rPr>
-        <w:t>arXiv</w:t>
-      </w:r>
-      <w:proofErr w:type="spellEnd"/>
-      <w:r>
-        <w:rPr>
-          <w:rFonts w:asciiTheme="minorHAnsi" w:hAnsiTheme="minorHAnsi" w:cstheme="minorHAnsi"/>
-        </w:rPr>
-        <w:t>. https://arxiv.org/abs/2303.00960</w:t>
-      </w:r>
-    </w:p>
-    <w:p>
-      <w:pPr>
-        <w:spacing w:after="80" w:line="276" w:lineRule="auto"/>
-        <w:ind w:left="720" w:hanging="720"/>
-        <w:jc w:val="both"/>
-        <w:rPr>
-          <w:rFonts w:asciiTheme="minorHAnsi" w:hAnsiTheme="minorHAnsi" w:cstheme="minorHAnsi"/>
-        </w:rPr>
-      </w:pPr>
-      <w:proofErr w:type="spellStart"/>
-      <w:r>
-        <w:rPr>
-          <w:rFonts w:asciiTheme="minorHAnsi" w:hAnsiTheme="minorHAnsi" w:cstheme="minorHAnsi"/>
-        </w:rPr>
-        <w:t>Miah</w:t>
-      </w:r>
-      <w:proofErr w:type="spellEnd"/>
-      <w:r>
-        <w:rPr>
-          <w:rFonts w:asciiTheme="minorHAnsi" w:hAnsiTheme="minorHAnsi" w:cstheme="minorHAnsi"/>
-        </w:rPr>
-        <w:t xml:space="preserve">, A. (2025). </w:t>
-      </w:r>
-      <w:proofErr w:type="spellStart"/>
-      <w:r>
-        <w:rPr>
-          <w:rFonts w:asciiTheme="minorHAnsi" w:hAnsiTheme="minorHAnsi" w:cstheme="minorHAnsi"/>
-        </w:rPr>
-        <w:t>Customer</w:t>
-      </w:r>
-      <w:proofErr w:type="spellEnd"/>
-      <w:r>
-        <w:rPr>
-          <w:rFonts w:asciiTheme="minorHAnsi" w:hAnsiTheme="minorHAnsi" w:cstheme="minorHAnsi"/>
-        </w:rPr>
-        <w:t xml:space="preserve"> </w:t>
-      </w:r>
-      <w:proofErr w:type="spellStart"/>
-      <w:r>
-        <w:rPr>
-          <w:rFonts w:asciiTheme="minorHAnsi" w:hAnsiTheme="minorHAnsi" w:cstheme="minorHAnsi"/>
-        </w:rPr>
-        <w:t>churn</w:t>
-      </w:r>
-      <w:proofErr w:type="spellEnd"/>
-      <w:r>
-        <w:rPr>
-          <w:rFonts w:asciiTheme="minorHAnsi" w:hAnsiTheme="minorHAnsi" w:cstheme="minorHAnsi"/>
-        </w:rPr>
-        <w:t xml:space="preserve"> </w:t>
-      </w:r>
-      <w:proofErr w:type="spellStart"/>
-      <w:r>
-        <w:rPr>
-          <w:rFonts w:asciiTheme="minorHAnsi" w:hAnsiTheme="minorHAnsi" w:cstheme="minorHAnsi"/>
-        </w:rPr>
-        <w:t>prediction</w:t>
-      </w:r>
-      <w:proofErr w:type="spellEnd"/>
-      <w:r>
-        <w:rPr>
-          <w:rFonts w:asciiTheme="minorHAnsi" w:hAnsiTheme="minorHAnsi" w:cstheme="minorHAnsi"/>
-        </w:rPr>
-        <w:t xml:space="preserve"> </w:t>
-      </w:r>
-      <w:proofErr w:type="spellStart"/>
-      <w:r>
-        <w:rPr>
-          <w:rFonts w:asciiTheme="minorHAnsi" w:hAnsiTheme="minorHAnsi" w:cstheme="minorHAnsi"/>
-        </w:rPr>
-        <w:t>business</w:t>
-      </w:r>
-      <w:proofErr w:type="spellEnd"/>
-      <w:r>
-        <w:rPr>
-          <w:rFonts w:asciiTheme="minorHAnsi" w:hAnsiTheme="minorHAnsi" w:cstheme="minorHAnsi"/>
-        </w:rPr>
-        <w:t xml:space="preserve"> </w:t>
-      </w:r>
-      <w:proofErr w:type="spellStart"/>
-      <w:r>
-        <w:rPr>
-          <w:rFonts w:asciiTheme="minorHAnsi" w:hAnsiTheme="minorHAnsi" w:cstheme="minorHAnsi"/>
-        </w:rPr>
-        <w:t>dataset</w:t>
-      </w:r>
-      <w:proofErr w:type="spellEnd"/>
-      <w:r>
-        <w:rPr>
-          <w:rFonts w:asciiTheme="minorHAnsi" w:hAnsiTheme="minorHAnsi" w:cstheme="minorHAnsi"/>
-        </w:rPr>
-        <w:t xml:space="preserve"> [Data set]. </w:t>
-      </w:r>
-      <w:proofErr w:type="spellStart"/>
-      <w:r>
-        <w:rPr>
-          <w:rFonts w:asciiTheme="minorHAnsi" w:hAnsiTheme="minorHAnsi" w:cstheme="minorHAnsi"/>
-        </w:rPr>
-        <w:t>Kaggle</w:t>
-      </w:r>
-      <w:proofErr w:type="spellEnd"/>
-      <w:r>
-        <w:rPr>
-          <w:rFonts w:asciiTheme="minorHAnsi" w:hAnsiTheme="minorHAnsi" w:cstheme="minorHAnsi"/>
-        </w:rPr>
-        <w:t>. https://www.kaggle.com/datasets/miadul/customer-churn-prediction-business-dataset</w:t>
-      </w:r>
-    </w:p>
-    <w:p>
-      <w:pPr>
-        <w:spacing w:after="80" w:line="276" w:lineRule="auto"/>
-        <w:ind w:left="720" w:hanging="720"/>
-        <w:jc w:val="both"/>
-        <w:rPr>
-          <w:rFonts w:asciiTheme="minorHAnsi" w:hAnsiTheme="minorHAnsi" w:cstheme="minorHAnsi"/>
-        </w:rPr>
-      </w:pPr>
-      <w:proofErr w:type="spellStart"/>
-      <w:r>
-        <w:rPr>
-          <w:rFonts w:asciiTheme="minorHAnsi" w:hAnsiTheme="minorHAnsi" w:cstheme="minorHAnsi"/>
-        </w:rPr>
-        <w:t>Nogare</w:t>
-      </w:r>
-      <w:proofErr w:type="spellEnd"/>
-      <w:r>
-        <w:rPr>
-          <w:rFonts w:asciiTheme="minorHAnsi" w:hAnsiTheme="minorHAnsi" w:cstheme="minorHAnsi"/>
-        </w:rPr>
-        <w:t xml:space="preserve">, D., &amp; Silveira, I. F. (2024). </w:t>
-      </w:r>
-      <w:proofErr w:type="spellStart"/>
-      <w:r>
-        <w:rPr>
-          <w:rFonts w:asciiTheme="minorHAnsi" w:hAnsiTheme="minorHAnsi" w:cstheme="minorHAnsi"/>
-        </w:rPr>
-        <w:t>Experimentation</w:t>
-      </w:r>
-      <w:proofErr w:type="spellEnd"/>
-      <w:r>
-        <w:rPr>
-          <w:rFonts w:asciiTheme="minorHAnsi" w:hAnsiTheme="minorHAnsi" w:cstheme="minorHAnsi"/>
-        </w:rPr>
-        <w:t xml:space="preserve">, </w:t>
-      </w:r>
-      <w:proofErr w:type="spellStart"/>
-      <w:r>
-        <w:rPr>
-          <w:rFonts w:asciiTheme="minorHAnsi" w:hAnsiTheme="minorHAnsi" w:cstheme="minorHAnsi"/>
-        </w:rPr>
-        <w:t>deployment</w:t>
-      </w:r>
-      <w:proofErr w:type="spellEnd"/>
-      <w:r>
-        <w:rPr>
-          <w:rFonts w:asciiTheme="minorHAnsi" w:hAnsiTheme="minorHAnsi" w:cstheme="minorHAnsi"/>
-        </w:rPr>
-        <w:t xml:space="preserve"> and </w:t>
-      </w:r>
-      <w:proofErr w:type="spellStart"/>
-      <w:r>
-        <w:rPr>
-          <w:rFonts w:asciiTheme="minorHAnsi" w:hAnsiTheme="minorHAnsi" w:cstheme="minorHAnsi"/>
-        </w:rPr>
-        <w:t>monitoring</w:t>
-      </w:r>
-      <w:proofErr w:type="spellEnd"/>
-      <w:r>
-        <w:rPr>
-          <w:rFonts w:asciiTheme="minorHAnsi" w:hAnsiTheme="minorHAnsi" w:cstheme="minorHAnsi"/>
-        </w:rPr>
-        <w:t xml:space="preserve"> machine </w:t>
-      </w:r>
-      <w:proofErr w:type="spellStart"/>
-      <w:r>
-        <w:rPr>
-          <w:rFonts w:asciiTheme="minorHAnsi" w:hAnsiTheme="minorHAnsi" w:cstheme="minorHAnsi"/>
-        </w:rPr>
-        <w:t>learning</w:t>
-      </w:r>
-      <w:proofErr w:type="spellEnd"/>
-      <w:r>
-        <w:rPr>
-          <w:rFonts w:asciiTheme="minorHAnsi" w:hAnsiTheme="minorHAnsi" w:cstheme="minorHAnsi"/>
-        </w:rPr>
-        <w:t xml:space="preserve"> </w:t>
-      </w:r>
-      <w:proofErr w:type="spellStart"/>
-      <w:r>
-        <w:rPr>
-          <w:rFonts w:asciiTheme="minorHAnsi" w:hAnsiTheme="minorHAnsi" w:cstheme="minorHAnsi"/>
-        </w:rPr>
-        <w:t>models</w:t>
-      </w:r>
-      <w:proofErr w:type="spellEnd"/>
-      <w:r>
-        <w:rPr>
-          <w:rFonts w:asciiTheme="minorHAnsi" w:hAnsiTheme="minorHAnsi" w:cstheme="minorHAnsi"/>
-        </w:rPr>
-        <w:t xml:space="preserve">: </w:t>
-      </w:r>
-      <w:proofErr w:type="spellStart"/>
-      <w:r>
-        <w:rPr>
-          <w:rFonts w:asciiTheme="minorHAnsi" w:hAnsiTheme="minorHAnsi" w:cstheme="minorHAnsi"/>
-        </w:rPr>
-        <w:t>Approaches</w:t>
-      </w:r>
-      <w:proofErr w:type="spellEnd"/>
-      <w:r>
-        <w:rPr>
-          <w:rFonts w:asciiTheme="minorHAnsi" w:hAnsiTheme="minorHAnsi" w:cstheme="minorHAnsi"/>
-        </w:rPr>
-        <w:t xml:space="preserve"> </w:t>
-      </w:r>
-      <w:proofErr w:type="spellStart"/>
-      <w:r>
-        <w:rPr>
-          <w:rFonts w:asciiTheme="minorHAnsi" w:hAnsiTheme="minorHAnsi" w:cstheme="minorHAnsi"/>
-        </w:rPr>
-        <w:t>for</w:t>
-      </w:r>
-      <w:proofErr w:type="spellEnd"/>
-      <w:r>
-        <w:rPr>
-          <w:rFonts w:asciiTheme="minorHAnsi" w:hAnsiTheme="minorHAnsi" w:cstheme="minorHAnsi"/>
-        </w:rPr>
-        <w:t xml:space="preserve"> </w:t>
-      </w:r>
-      <w:proofErr w:type="spellStart"/>
-      <w:r>
-        <w:rPr>
-          <w:rFonts w:asciiTheme="minorHAnsi" w:hAnsiTheme="minorHAnsi" w:cstheme="minorHAnsi"/>
-        </w:rPr>
-        <w:t>applying</w:t>
-      </w:r>
-      <w:proofErr w:type="spellEnd"/>
-      <w:r>
-        <w:rPr>
-          <w:rFonts w:asciiTheme="minorHAnsi" w:hAnsiTheme="minorHAnsi" w:cstheme="minorHAnsi"/>
-        </w:rPr>
-        <w:t xml:space="preserve"> </w:t>
-      </w:r>
-      <w:proofErr w:type="spellStart"/>
-      <w:r>
-        <w:rPr>
-          <w:rFonts w:asciiTheme="minorHAnsi" w:hAnsiTheme="minorHAnsi" w:cstheme="minorHAnsi"/>
-        </w:rPr>
-        <w:t>MLOps</w:t>
-      </w:r>
-      <w:proofErr w:type="spellEnd"/>
-      <w:r>
-        <w:rPr>
-          <w:rFonts w:asciiTheme="minorHAnsi" w:hAnsiTheme="minorHAnsi" w:cstheme="minorHAnsi"/>
-        </w:rPr>
-        <w:t xml:space="preserve">. </w:t>
-      </w:r>
-      <w:proofErr w:type="spellStart"/>
-      <w:r>
-        <w:rPr>
-          <w:rFonts w:asciiTheme="minorHAnsi" w:hAnsiTheme="minorHAnsi" w:cstheme="minorHAnsi"/>
-        </w:rPr>
-        <w:t>arXiv</w:t>
-      </w:r>
-      <w:proofErr w:type="spellEnd"/>
-      <w:r>
-        <w:rPr>
-          <w:rFonts w:asciiTheme="minorHAnsi" w:hAnsiTheme="minorHAnsi" w:cstheme="minorHAnsi"/>
-        </w:rPr>
-        <w:t>. https://arxiv.org/abs/2408.11112</w:t>
-      </w:r>
-    </w:p>
-    <w:p>
-      <w:pPr>
-        <w:spacing w:after="80" w:line="276" w:lineRule="auto"/>
-        <w:ind w:left="720" w:hanging="720"/>
-        <w:jc w:val="both"/>
-        <w:rPr>
-          <w:rFonts w:asciiTheme="minorHAnsi" w:hAnsiTheme="minorHAnsi" w:cstheme="minorHAnsi"/>
-        </w:rPr>
-      </w:pPr>
-      <w:proofErr w:type="spellStart"/>
-      <w:proofErr w:type="spellEnd"/>
-      <w:proofErr w:type="spellStart"/>
-      <w:proofErr w:type="spellEnd"/>
-      <w:proofErr w:type="spellStart"/>
-      <w:proofErr w:type="spellEnd"/>
-      <w:proofErr w:type="spellStart"/>
-      <w:proofErr w:type="spellEnd"/>
-      <w:proofErr w:type="spellStart"/>
-      <w:proofErr w:type="spellEnd"/>
-      <w:proofErr w:type="spellStart"/>
-      <w:proofErr w:type="spellEnd"/>
-      <w:proofErr w:type="spellStart"/>
-      <w:proofErr w:type="spellEnd"/>
-      <w:r>
-        <w:t xml:space="preserve">Rumelhart, D. E., Hinton, G. E., &amp; Williams, R. J. (1986). Learning representations by back-propagating errors. </w:t>
-      </w:r>
-      <w:r>
-        <w:rPr>
-          <w:i/>
-        </w:rPr>
-        <w:t>Nature, 323</w:t>
-      </w:r>
-      <w:r>
-        <w:t>(6088), 533-536. https://doi.org/10.1038/323533a0</w:t>
-      </w:r>
-    </w:p>
-    <w:p>
-      <w:pPr>
-        <w:spacing w:after="80" w:line="276" w:lineRule="auto"/>
-        <w:ind w:left="720" w:hanging="720"/>
-        <w:jc w:val="both"/>
-        <w:rPr>
-          <w:rFonts w:asciiTheme="minorHAnsi" w:hAnsiTheme="minorHAnsi" w:cstheme="minorHAnsi"/>
-        </w:rPr>
-      </w:pPr>
-      <w:proofErr w:type="spellStart"/>
-      <w:r>
-        <w:rPr>
-          <w:rFonts w:asciiTheme="minorHAnsi" w:hAnsiTheme="minorHAnsi" w:cstheme="minorHAnsi"/>
-        </w:rPr>
-        <w:t>Shaikhsurab</w:t>
-      </w:r>
-      <w:proofErr w:type="spellEnd"/>
-      <w:r>
-        <w:rPr>
-          <w:rFonts w:asciiTheme="minorHAnsi" w:hAnsiTheme="minorHAnsi" w:cstheme="minorHAnsi"/>
-        </w:rPr>
-        <w:t xml:space="preserve">, M. A., &amp; </w:t>
-      </w:r>
-      <w:proofErr w:type="spellStart"/>
-      <w:r>
-        <w:rPr>
-          <w:rFonts w:asciiTheme="minorHAnsi" w:hAnsiTheme="minorHAnsi" w:cstheme="minorHAnsi"/>
-        </w:rPr>
-        <w:t>Magadum</w:t>
-      </w:r>
-      <w:proofErr w:type="spellEnd"/>
-      <w:r>
-        <w:rPr>
-          <w:rFonts w:asciiTheme="minorHAnsi" w:hAnsiTheme="minorHAnsi" w:cstheme="minorHAnsi"/>
-        </w:rPr>
-        <w:t xml:space="preserve">, P. (2024). </w:t>
-      </w:r>
-      <w:proofErr w:type="spellStart"/>
-      <w:r>
-        <w:rPr>
-          <w:rFonts w:asciiTheme="minorHAnsi" w:hAnsiTheme="minorHAnsi" w:cstheme="minorHAnsi"/>
-        </w:rPr>
-        <w:t>Enhancing</w:t>
-      </w:r>
-      <w:proofErr w:type="spellEnd"/>
-      <w:r>
-        <w:rPr>
-          <w:rFonts w:asciiTheme="minorHAnsi" w:hAnsiTheme="minorHAnsi" w:cstheme="minorHAnsi"/>
-        </w:rPr>
-        <w:t xml:space="preserve"> </w:t>
-      </w:r>
-      <w:proofErr w:type="spellStart"/>
-      <w:r>
-        <w:rPr>
-          <w:rFonts w:asciiTheme="minorHAnsi" w:hAnsiTheme="minorHAnsi" w:cstheme="minorHAnsi"/>
-        </w:rPr>
-        <w:t>customer</w:t>
-      </w:r>
-      <w:proofErr w:type="spellEnd"/>
-      <w:r>
-        <w:rPr>
-          <w:rFonts w:asciiTheme="minorHAnsi" w:hAnsiTheme="minorHAnsi" w:cstheme="minorHAnsi"/>
-        </w:rPr>
-        <w:t xml:space="preserve"> </w:t>
-      </w:r>
-      <w:proofErr w:type="spellStart"/>
-      <w:r>
-        <w:rPr>
-          <w:rFonts w:asciiTheme="minorHAnsi" w:hAnsiTheme="minorHAnsi" w:cstheme="minorHAnsi"/>
-        </w:rPr>
-        <w:t>churn</w:t>
-      </w:r>
-      <w:proofErr w:type="spellEnd"/>
-      <w:r>
-        <w:rPr>
-          <w:rFonts w:asciiTheme="minorHAnsi" w:hAnsiTheme="minorHAnsi" w:cstheme="minorHAnsi"/>
-        </w:rPr>
-        <w:t xml:space="preserve"> </w:t>
-      </w:r>
-      <w:proofErr w:type="spellStart"/>
-      <w:r>
-        <w:rPr>
-          <w:rFonts w:asciiTheme="minorHAnsi" w:hAnsiTheme="minorHAnsi" w:cstheme="minorHAnsi"/>
-        </w:rPr>
-        <w:t>prediction</w:t>
-      </w:r>
-      <w:proofErr w:type="spellEnd"/>
-      <w:r>
-        <w:rPr>
-          <w:rFonts w:asciiTheme="minorHAnsi" w:hAnsiTheme="minorHAnsi" w:cstheme="minorHAnsi"/>
-        </w:rPr>
-        <w:t xml:space="preserve"> in </w:t>
-      </w:r>
-      <w:proofErr w:type="spellStart"/>
-      <w:r>
-        <w:rPr>
-          <w:rFonts w:asciiTheme="minorHAnsi" w:hAnsiTheme="minorHAnsi" w:cstheme="minorHAnsi"/>
-        </w:rPr>
-        <w:t>telecommunications</w:t>
-      </w:r>
-      <w:proofErr w:type="spellEnd"/>
-      <w:r>
-        <w:rPr>
-          <w:rFonts w:asciiTheme="minorHAnsi" w:hAnsiTheme="minorHAnsi" w:cstheme="minorHAnsi"/>
-        </w:rPr>
-        <w:t xml:space="preserve">: </w:t>
-      </w:r>
-      <w:proofErr w:type="spellStart"/>
-      <w:r>
-        <w:rPr>
-          <w:rFonts w:asciiTheme="minorHAnsi" w:hAnsiTheme="minorHAnsi" w:cstheme="minorHAnsi"/>
-        </w:rPr>
-        <w:t>An</w:t>
-      </w:r>
-      <w:proofErr w:type="spellEnd"/>
-      <w:r>
-        <w:rPr>
-          <w:rFonts w:asciiTheme="minorHAnsi" w:hAnsiTheme="minorHAnsi" w:cstheme="minorHAnsi"/>
-        </w:rPr>
-        <w:t xml:space="preserve"> adaptive ensemble </w:t>
-      </w:r>
-      <w:proofErr w:type="spellStart"/>
-      <w:r>
-        <w:rPr>
-          <w:rFonts w:asciiTheme="minorHAnsi" w:hAnsiTheme="minorHAnsi" w:cstheme="minorHAnsi"/>
-        </w:rPr>
-        <w:t>learning</w:t>
-      </w:r>
-      <w:proofErr w:type="spellEnd"/>
-      <w:r>
-        <w:rPr>
-          <w:rFonts w:asciiTheme="minorHAnsi" w:hAnsiTheme="minorHAnsi" w:cstheme="minorHAnsi"/>
-        </w:rPr>
-        <w:t xml:space="preserve"> </w:t>
-      </w:r>
-      <w:proofErr w:type="spellStart"/>
-      <w:r>
-        <w:rPr>
-          <w:rFonts w:asciiTheme="minorHAnsi" w:hAnsiTheme="minorHAnsi" w:cstheme="minorHAnsi"/>
-        </w:rPr>
-        <w:t>approach</w:t>
-      </w:r>
-      <w:proofErr w:type="spellEnd"/>
-      <w:r>
-        <w:rPr>
-          <w:rFonts w:asciiTheme="minorHAnsi" w:hAnsiTheme="minorHAnsi" w:cstheme="minorHAnsi"/>
-        </w:rPr>
-        <w:t xml:space="preserve">. </w:t>
-      </w:r>
-      <w:proofErr w:type="spellStart"/>
-      <w:r>
-        <w:rPr>
-          <w:rFonts w:asciiTheme="minorHAnsi" w:hAnsiTheme="minorHAnsi" w:cstheme="minorHAnsi"/>
-        </w:rPr>
-        <w:t>arXiv</w:t>
-      </w:r>
-      <w:proofErr w:type="spellEnd"/>
-      <w:r>
-        <w:rPr>
-          <w:rFonts w:asciiTheme="minorHAnsi" w:hAnsiTheme="minorHAnsi" w:cstheme="minorHAnsi"/>
-        </w:rPr>
-        <w:t>. https://arxiv.org/abs/2408.16284</w:t>
-      </w:r>
-    </w:p>
-    <w:p>
-      <w:pPr>
-        <w:spacing w:after="80" w:line="276" w:lineRule="auto"/>
-        <w:ind w:left="720" w:hanging="720"/>
-        <w:jc w:val="both"/>
-        <w:rPr>
-          <w:rFonts w:asciiTheme="minorHAnsi" w:hAnsiTheme="minorHAnsi" w:cstheme="minorHAnsi"/>
-        </w:rPr>
-      </w:pPr>
-      <w:r>
-        <w:rPr>
-          <w:rFonts w:asciiTheme="minorHAnsi" w:hAnsiTheme="minorHAnsi" w:cstheme="minorHAnsi"/>
-        </w:rPr>
-        <w:t>SHAP. (</w:t>
-      </w:r>
-      <w:proofErr w:type="spellStart"/>
-      <w:r>
-        <w:rPr>
-          <w:rFonts w:asciiTheme="minorHAnsi" w:hAnsiTheme="minorHAnsi" w:cstheme="minorHAnsi"/>
-        </w:rPr>
-        <w:t>n.d</w:t>
-      </w:r>
-      <w:proofErr w:type="spellEnd"/>
-      <w:r>
-        <w:rPr>
-          <w:rFonts w:asciiTheme="minorHAnsi" w:hAnsiTheme="minorHAnsi" w:cstheme="minorHAnsi"/>
-        </w:rPr>
-        <w:t xml:space="preserve">.). </w:t>
-      </w:r>
-      <w:proofErr w:type="spellStart"/>
-      <w:r>
-        <w:rPr>
-          <w:rFonts w:asciiTheme="minorHAnsi" w:hAnsiTheme="minorHAnsi" w:cstheme="minorHAnsi"/>
-        </w:rPr>
-        <w:t>Welcome</w:t>
-      </w:r>
-      <w:proofErr w:type="spellEnd"/>
-      <w:r>
-        <w:rPr>
-          <w:rFonts w:asciiTheme="minorHAnsi" w:hAnsiTheme="minorHAnsi" w:cstheme="minorHAnsi"/>
-        </w:rPr>
-        <w:t xml:space="preserve"> </w:t>
-      </w:r>
-      <w:proofErr w:type="spellStart"/>
-      <w:r>
-        <w:rPr>
-          <w:rFonts w:asciiTheme="minorHAnsi" w:hAnsiTheme="minorHAnsi" w:cstheme="minorHAnsi"/>
-        </w:rPr>
-        <w:t>to</w:t>
-      </w:r>
-      <w:proofErr w:type="spellEnd"/>
-      <w:r>
-        <w:rPr>
-          <w:rFonts w:asciiTheme="minorHAnsi" w:hAnsiTheme="minorHAnsi" w:cstheme="minorHAnsi"/>
-        </w:rPr>
-        <w:t xml:space="preserve"> </w:t>
-      </w:r>
-      <w:proofErr w:type="spellStart"/>
-      <w:r>
-        <w:rPr>
-          <w:rFonts w:asciiTheme="minorHAnsi" w:hAnsiTheme="minorHAnsi" w:cstheme="minorHAnsi"/>
-        </w:rPr>
-        <w:t>the</w:t>
-      </w:r>
-      <w:proofErr w:type="spellEnd"/>
-      <w:r>
-        <w:rPr>
-          <w:rFonts w:asciiTheme="minorHAnsi" w:hAnsiTheme="minorHAnsi" w:cstheme="minorHAnsi"/>
-        </w:rPr>
-        <w:t xml:space="preserve"> SHAP </w:t>
-      </w:r>
-      <w:proofErr w:type="spellStart"/>
-      <w:r>
-        <w:rPr>
-          <w:rFonts w:asciiTheme="minorHAnsi" w:hAnsiTheme="minorHAnsi" w:cstheme="minorHAnsi"/>
-        </w:rPr>
-        <w:t>documentation</w:t>
-      </w:r>
-      <w:proofErr w:type="spellEnd"/>
-      <w:r>
-        <w:rPr>
-          <w:rFonts w:asciiTheme="minorHAnsi" w:hAnsiTheme="minorHAnsi" w:cstheme="minorHAnsi"/>
-        </w:rPr>
-        <w:t>. https://shap.readthedocs.io/en/latest/</w:t>
-      </w:r>
-    </w:p>
-    <w:p>
-      <w:pPr>
-        <w:spacing w:after="80" w:line="276" w:lineRule="auto"/>
-        <w:ind w:left="720" w:hanging="720"/>
-        <w:jc w:val="both"/>
-        <w:rPr>
-          <w:rFonts w:asciiTheme="minorHAnsi" w:hAnsiTheme="minorHAnsi" w:cstheme="minorHAnsi"/>
-        </w:rPr>
-      </w:pPr>
-      <w:proofErr w:type="spellStart"/>
-      <w:proofErr w:type="spellEnd"/>
-      <w:proofErr w:type="spellStart"/>
-      <w:proofErr w:type="spellEnd"/>
-      <w:proofErr w:type="spellStart"/>
-      <w:proofErr w:type="spellEnd"/>
-      <w:proofErr w:type="spellStart"/>
-      <w:proofErr w:type="spellEnd"/>
-      <w:proofErr w:type="spellStart"/>
-      <w:proofErr w:type="spellEnd"/>
-      <w:proofErr w:type="spellStart"/>
-      <w:proofErr w:type="spellEnd"/>
-      <w:proofErr w:type="spellStart"/>
-      <w:proofErr w:type="spellEnd"/>
-      <w:proofErr w:type="spellStart"/>
-      <w:proofErr w:type="spellEnd"/>
-      <w:proofErr w:type="spellStart"/>
-      <w:proofErr w:type="spellEnd"/>
-      <w:proofErr w:type="spellStart"/>
-      <w:proofErr w:type="spellEnd"/>
-      <w:proofErr w:type="spellStart"/>
-      <w:proofErr w:type="spellEnd"/>
-      <w:proofErr w:type="spellStart"/>
-      <w:proofErr w:type="spellEnd"/>
-      <w:proofErr w:type="spellStart"/>
-      <w:proofErr w:type="spellEnd"/>
-      <w:proofErr w:type="spellStart"/>
-      <w:proofErr w:type="spellEnd"/>
-      <w:proofErr w:type="spellStart"/>
-      <w:proofErr w:type="spellEnd"/>
-      <w:r>
-        <w:t xml:space="preserve">Vafeiadis, T., Diamantaras, K. I., Sarigiannidis, G., &amp; Chatzisavvas, K. C. (2015). A comparison of machine learning techniques for customer churn prediction. </w:t>
-      </w:r>
-      <w:r>
-        <w:rPr>
-          <w:i/>
-        </w:rPr>
-        <w:t>Simulation Modelling Practice and Theory, 55</w:t>
-      </w:r>
-      <w:r>
-        <w:t>, 1-9. https://doi.org/10.1016/j.simpat.2015.03.003</w:t>
-      </w:r>
-    </w:p>
     <w:sectPr>
-      <w:headerReference w:type="default" r:id="rId53"/>
-      <w:footerReference w:type="default" r:id="rId54"/>
+      <w:headerReference w:type="default" r:id="rId56"/>
+      <w:footerReference w:type="default" r:id="rId57"/>
       <w:pgSz w:w="12240" w:h="15840"/>
       <w:pgMar w:top="1100" w:right="840" w:bottom="1340" w:left="1020" w:header="493" w:footer="1149" w:gutter="0"/>
       <w:cols w:space="720"/>
@@ -35831,6 +35601,18 @@
       <w:szCs w:val="18"/>
     </w:rPr>
   </w:style>
+  <w:style w:type="character" w:styleId="Mencinsinresolver">
+    <w:name w:val="Unresolved Mention"/>
+    <w:basedOn w:val="Fuentedeprrafopredeter"/>
+    <w:uiPriority w:val="99"/>
+    <w:semiHidden/>
+    <w:unhideWhenUsed/>
+    <w:rsid w:val="00DB7667"/>
+    <w:rPr>
+      <w:color w:val="605E5C"/>
+      <w:shd w:val="clear" w:color="auto" w:fill="E1DFDD"/>
+    </w:rPr>
+  </w:style>
 </w:styles>
 </file>
 
@@ -36118,19 +35900,6 @@
 </file>
 
 <file path=customXml/item1.xml><?xml version="1.0" encoding="utf-8"?>
-<?mso-contentType ?>
-<FormTemplates xmlns="http://schemas.microsoft.com/sharepoint/v3/contenttype/forms">
-  <Display>DocumentLibraryForm</Display>
-  <Edit>DocumentLibraryForm</Edit>
-  <New>DocumentLibraryForm</New>
-</FormTemplates>
-</file>
-
-<file path=customXml/item2.xml><?xml version="1.0" encoding="utf-8"?>
-<b:Sources xmlns:b="http://schemas.openxmlformats.org/officeDocument/2006/bibliography" xmlns="http://schemas.openxmlformats.org/officeDocument/2006/bibliography" SelectedStyle="\APASixthEditionOfficeOnline.xsl" StyleName="APA" Version="6"/>
-</file>
-
-<file path=customXml/item3.xml><?xml version="1.0" encoding="utf-8"?>
 <ct:contentTypeSchema xmlns:ct="http://schemas.microsoft.com/office/2006/metadata/contentType" xmlns:ma="http://schemas.microsoft.com/office/2006/metadata/properties/metaAttributes" ct:_="" ma:_="" ma:contentTypeName="Documento" ma:contentTypeID="0x010100FDC725C2DD014A49B6A1BC5C38E9DEF8" ma:contentTypeVersion="11" ma:contentTypeDescription="Crear nuevo documento." ma:contentTypeScope="" ma:versionID="540f54ba834775d8c32a0fe586c0d5fa">
   <xsd:schema xmlns:xsd="http://www.w3.org/2001/XMLSchema" xmlns:xs="http://www.w3.org/2001/XMLSchema" xmlns:p="http://schemas.microsoft.com/office/2006/metadata/properties" xmlns:ns2="4653439a-09b5-4ebc-9f65-223c4545ca76" xmlns:ns3="34e9bb24-f277-4b2e-b702-727ad1819a53" targetNamespace="http://schemas.microsoft.com/office/2006/metadata/properties" ma:root="true" ma:fieldsID="f640ef9c4f255f623d39da676dfb3fd0" ns2:_="" ns3:_="">
     <xsd:import namespace="4653439a-09b5-4ebc-9f65-223c4545ca76"/>
@@ -36325,6 +36094,19 @@
 </ct:contentTypeSchema>
 </file>
 
+<file path=customXml/item2.xml><?xml version="1.0" encoding="utf-8"?>
+<b:Sources xmlns:b="http://schemas.openxmlformats.org/officeDocument/2006/bibliography" xmlns="http://schemas.openxmlformats.org/officeDocument/2006/bibliography" SelectedStyle="\APASixthEditionOfficeOnline.xsl" StyleName="APA" Version="6"/>
+</file>
+
+<file path=customXml/item3.xml><?xml version="1.0" encoding="utf-8"?>
+<?mso-contentType ?>
+<FormTemplates xmlns="http://schemas.microsoft.com/sharepoint/v3/contenttype/forms">
+  <Display>DocumentLibraryForm</Display>
+  <Edit>DocumentLibraryForm</Edit>
+  <New>DocumentLibraryForm</New>
+</FormTemplates>
+</file>
+
 <file path=customXml/item4.xml><?xml version="1.0" encoding="utf-8"?>
 <p:properties xmlns:p="http://schemas.microsoft.com/office/2006/metadata/properties" xmlns:xsi="http://www.w3.org/2001/XMLSchema-instance" xmlns:pc="http://schemas.microsoft.com/office/infopath/2007/PartnerControls">
   <documentManagement>
@@ -36337,22 +36119,6 @@
 </file>
 
 <file path=customXml/itemProps1.xml><?xml version="1.0" encoding="utf-8"?>
-<ds:datastoreItem xmlns:ds="http://schemas.openxmlformats.org/officeDocument/2006/customXml" ds:itemID="{084C26D9-49C9-4ADB-A387-DA6079798921}">
-  <ds:schemaRefs>
-    <ds:schemaRef ds:uri="http://schemas.microsoft.com/sharepoint/v3/contenttype/forms"/>
-  </ds:schemaRefs>
-</ds:datastoreItem>
-</file>
-
-<file path=customXml/itemProps2.xml><?xml version="1.0" encoding="utf-8"?>
-<ds:datastoreItem xmlns:ds="http://schemas.openxmlformats.org/officeDocument/2006/customXml" ds:itemID="{FACB83BB-458E-4CCB-91D7-35CFBA93934D}">
-  <ds:schemaRefs>
-    <ds:schemaRef ds:uri="http://schemas.openxmlformats.org/officeDocument/2006/bibliography"/>
-  </ds:schemaRefs>
-</ds:datastoreItem>
-</file>
-
-<file path=customXml/itemProps3.xml><?xml version="1.0" encoding="utf-8"?>
 <ds:datastoreItem xmlns:ds="http://schemas.openxmlformats.org/officeDocument/2006/customXml" ds:itemID="{76C6DFDF-540E-4966-923B-D1DB2EE7B5D2}">
   <ds:schemaRefs>
     <ds:schemaRef ds:uri="http://schemas.microsoft.com/office/2006/metadata/contentType"/>
@@ -36371,6 +36137,22 @@
 </ds:datastoreItem>
 </file>
 
+<file path=customXml/itemProps2.xml><?xml version="1.0" encoding="utf-8"?>
+<ds:datastoreItem xmlns:ds="http://schemas.openxmlformats.org/officeDocument/2006/customXml" ds:itemID="{FACB83BB-458E-4CCB-91D7-35CFBA93934D}">
+  <ds:schemaRefs>
+    <ds:schemaRef ds:uri="http://schemas.openxmlformats.org/officeDocument/2006/bibliography"/>
+  </ds:schemaRefs>
+</ds:datastoreItem>
+</file>
+
+<file path=customXml/itemProps3.xml><?xml version="1.0" encoding="utf-8"?>
+<ds:datastoreItem xmlns:ds="http://schemas.openxmlformats.org/officeDocument/2006/customXml" ds:itemID="{084C26D9-49C9-4ADB-A387-DA6079798921}">
+  <ds:schemaRefs>
+    <ds:schemaRef ds:uri="http://schemas.microsoft.com/sharepoint/v3/contenttype/forms"/>
+  </ds:schemaRefs>
+</ds:datastoreItem>
+</file>
+
 <file path=customXml/itemProps4.xml><?xml version="1.0" encoding="utf-8"?>
 <ds:datastoreItem xmlns:ds="http://schemas.openxmlformats.org/officeDocument/2006/customXml" ds:itemID="{662F60C8-4BC5-4139-BE63-6954D22D77BD}">
   <ds:schemaRefs>

</xml_diff>